<commit_message>
Refactor page handling by introducing PageRequest DTO, updating PageService and PageController, and enhancing Page entity with createdDate. Enable JPA auditing in application.
</commit_message>
<xml_diff>
--- a/Rapor.docx
+++ b/Rapor.docx
@@ -22,52 +22,12 @@
           <w:b/>
           <w:bCs/>
         </w:rPr>
-        <w:t xml:space="preserve"> </w:t>
-      </w:r>
-      <w:proofErr w:type="spellStart"/>
-      <w:r>
-        <w:rPr>
-          <w:b/>
-          <w:bCs/>
-        </w:rPr>
-        <w:t>NoteP</w:t>
-      </w:r>
-      <w:proofErr w:type="spellEnd"/>
-      <w:r>
-        <w:rPr>
-          <w:b/>
-          <w:bCs/>
-        </w:rPr>
-        <w:t xml:space="preserve">: </w:t>
-      </w:r>
-      <w:proofErr w:type="spellStart"/>
-      <w:r>
-        <w:rPr>
-          <w:b/>
-          <w:bCs/>
-        </w:rPr>
-        <w:t>Backend</w:t>
-      </w:r>
-      <w:proofErr w:type="spellEnd"/>
-      <w:r>
-        <w:rPr>
-          <w:b/>
-          <w:bCs/>
-        </w:rPr>
-        <w:t xml:space="preserve"> Proje Mimari Raporu</w:t>
-      </w:r>
-    </w:p>
-    <w:p>
-      <w:r>
-        <w:t xml:space="preserve">Bu proje; Java 21 ve Spring </w:t>
-      </w:r>
-      <w:proofErr w:type="spellStart"/>
-      <w:r>
-        <w:t>Boot</w:t>
-      </w:r>
-      <w:proofErr w:type="spellEnd"/>
-      <w:r>
-        <w:t xml:space="preserve"> 4 kullanılarak geliştirilen, mobil uygulama odaklı, </w:t>
+        <w:t xml:space="preserve"> NoteP: Backend Proje Mimari Raporu</w:t>
+      </w:r>
+    </w:p>
+    <w:p>
+      <w:r>
+        <w:t xml:space="preserve">Bu proje; Java 21 ve Spring Boot 4 kullanılarak geliştirilen, mobil uygulama odaklı, </w:t>
       </w:r>
       <w:r>
         <w:rPr>
@@ -128,15 +88,7 @@
         <w:t>Framework:</w:t>
       </w:r>
       <w:r>
-        <w:t xml:space="preserve"> Spring </w:t>
-      </w:r>
-      <w:proofErr w:type="spellStart"/>
-      <w:r>
-        <w:t>Boot</w:t>
-      </w:r>
-      <w:proofErr w:type="spellEnd"/>
-      <w:r>
-        <w:t xml:space="preserve"> 4 (Security, Data JPA, Web)</w:t>
+        <w:t xml:space="preserve"> Spring Boot 4 (Security, Data JPA, Web)</w:t>
       </w:r>
     </w:p>
     <w:p>
@@ -146,21 +98,12 @@
           <w:numId w:val="1"/>
         </w:numPr>
       </w:pPr>
-      <w:proofErr w:type="spellStart"/>
-      <w:r>
-        <w:rPr>
-          <w:b/>
-          <w:bCs/>
-        </w:rPr>
-        <w:t>Veritabanı</w:t>
-      </w:r>
-      <w:proofErr w:type="spellEnd"/>
-      <w:r>
-        <w:rPr>
-          <w:b/>
-          <w:bCs/>
-        </w:rPr>
-        <w:t>:</w:t>
+      <w:r>
+        <w:rPr>
+          <w:b/>
+          <w:bCs/>
+        </w:rPr>
+        <w:t>Veritabanı:</w:t>
       </w:r>
       <w:r>
         <w:t xml:space="preserve"> MySQL (İlişkisel veri saklama)</w:t>
@@ -181,15 +124,7 @@
         <w:t>Güvenlik:</w:t>
       </w:r>
       <w:r>
-        <w:t xml:space="preserve"> Spring Security + JJWT 0.12.5 (</w:t>
-      </w:r>
-      <w:proofErr w:type="spellStart"/>
-      <w:r>
-        <w:t>Token</w:t>
-      </w:r>
-      <w:proofErr w:type="spellEnd"/>
-      <w:r>
-        <w:t xml:space="preserve"> tabanlı doğrulama)</w:t>
+        <w:t xml:space="preserve"> Spring Security + JJWT 0.12.5 (Token tabanlı doğrulama)</w:t>
       </w:r>
     </w:p>
     <w:p>
@@ -207,23 +142,7 @@
         <w:t>Araçlar:</w:t>
       </w:r>
       <w:r>
-        <w:t xml:space="preserve"> </w:t>
-      </w:r>
-      <w:proofErr w:type="spellStart"/>
-      <w:r>
-        <w:t>Lombok</w:t>
-      </w:r>
-      <w:proofErr w:type="spellEnd"/>
-      <w:r>
-        <w:t xml:space="preserve"> (Sade kod), </w:t>
-      </w:r>
-      <w:proofErr w:type="spellStart"/>
-      <w:r>
-        <w:t>MapStruct</w:t>
-      </w:r>
-      <w:proofErr w:type="spellEnd"/>
-      <w:r>
-        <w:t xml:space="preserve"> (DTO dönüşümü)</w:t>
+        <w:t xml:space="preserve"> Lombok (Sade kod), MapStruct (DTO dönüşümü)</w:t>
       </w:r>
     </w:p>
     <w:p>
@@ -245,23 +164,7 @@
           <w:b/>
           <w:bCs/>
         </w:rPr>
-        <w:t>2. Proje Akış Şeması (</w:t>
-      </w:r>
-      <w:proofErr w:type="spellStart"/>
-      <w:r>
-        <w:rPr>
-          <w:b/>
-          <w:bCs/>
-        </w:rPr>
-        <w:t>Diagram</w:t>
-      </w:r>
-      <w:proofErr w:type="spellEnd"/>
-      <w:r>
-        <w:rPr>
-          <w:b/>
-          <w:bCs/>
-        </w:rPr>
-        <w:t>)</w:t>
+        <w:t>2. Proje Akış Şeması (Diagram)</w:t>
       </w:r>
     </w:p>
     <w:p>
@@ -379,31 +282,13 @@
             <w:hideMark/>
           </w:tcPr>
           <w:p>
-            <w:proofErr w:type="spellStart"/>
             <w:r>
               <w:rPr>
                 <w:b/>
                 <w:bCs/>
               </w:rPr>
-              <w:t>Config</w:t>
+              <w:t>Config/SecurityConfig</w:t>
             </w:r>
-            <w:proofErr w:type="spellEnd"/>
-            <w:r>
-              <w:rPr>
-                <w:b/>
-                <w:bCs/>
-              </w:rPr>
-              <w:t>/</w:t>
-            </w:r>
-            <w:proofErr w:type="spellStart"/>
-            <w:r>
-              <w:rPr>
-                <w:b/>
-                <w:bCs/>
-              </w:rPr>
-              <w:t>SecurityConfig</w:t>
-            </w:r>
-            <w:proofErr w:type="spellEnd"/>
           </w:p>
         </w:tc>
         <w:tc>
@@ -442,31 +327,13 @@
             <w:hideMark/>
           </w:tcPr>
           <w:p>
-            <w:proofErr w:type="spellStart"/>
             <w:r>
               <w:rPr>
                 <w:b/>
                 <w:bCs/>
               </w:rPr>
-              <w:t>Config</w:t>
+              <w:t>Config/JwtUtil</w:t>
             </w:r>
-            <w:proofErr w:type="spellEnd"/>
-            <w:r>
-              <w:rPr>
-                <w:b/>
-                <w:bCs/>
-              </w:rPr>
-              <w:t>/</w:t>
-            </w:r>
-            <w:proofErr w:type="spellStart"/>
-            <w:r>
-              <w:rPr>
-                <w:b/>
-                <w:bCs/>
-              </w:rPr>
-              <w:t>JwtUtil</w:t>
-            </w:r>
-            <w:proofErr w:type="spellEnd"/>
           </w:p>
         </w:tc>
         <w:tc>
@@ -483,15 +350,7 @@
           </w:tcPr>
           <w:p>
             <w:r>
-              <w:t>Dijital anahtarı (</w:t>
-            </w:r>
-            <w:proofErr w:type="spellStart"/>
-            <w:r>
-              <w:t>Token</w:t>
-            </w:r>
-            <w:proofErr w:type="spellEnd"/>
-            <w:r>
-              <w:t>) basan, okuyan ve geçerliliğini kontrol eden makine.</w:t>
+              <w:t>Dijital anahtarı (Token) basan, okuyan ve geçerliliğini kontrol eden makine.</w:t>
             </w:r>
           </w:p>
         </w:tc>
@@ -513,31 +372,13 @@
             <w:hideMark/>
           </w:tcPr>
           <w:p>
-            <w:proofErr w:type="spellStart"/>
             <w:r>
               <w:rPr>
                 <w:b/>
                 <w:bCs/>
               </w:rPr>
-              <w:t>Config</w:t>
+              <w:t>Config/JwtFilter</w:t>
             </w:r>
-            <w:proofErr w:type="spellEnd"/>
-            <w:r>
-              <w:rPr>
-                <w:b/>
-                <w:bCs/>
-              </w:rPr>
-              <w:t>/</w:t>
-            </w:r>
-            <w:proofErr w:type="spellStart"/>
-            <w:r>
-              <w:rPr>
-                <w:b/>
-                <w:bCs/>
-              </w:rPr>
-              <w:t>JwtFilter</w:t>
-            </w:r>
-            <w:proofErr w:type="spellEnd"/>
           </w:p>
         </w:tc>
         <w:tc>
@@ -554,15 +395,7 @@
           </w:tcPr>
           <w:p>
             <w:r>
-              <w:t xml:space="preserve">Kapıdaki bekçi. Gelen her isteği durdurur, içindeki </w:t>
-            </w:r>
-            <w:proofErr w:type="spellStart"/>
-            <w:r>
-              <w:t>token'ı</w:t>
-            </w:r>
-            <w:proofErr w:type="spellEnd"/>
-            <w:r>
-              <w:t xml:space="preserve"> kontrol eder.</w:t>
+              <w:t>Kapıdaki bekçi. Gelen her isteği durdurur, içindeki token'ı kontrol eder.</w:t>
             </w:r>
           </w:p>
         </w:tc>
@@ -584,31 +417,13 @@
             <w:hideMark/>
           </w:tcPr>
           <w:p>
-            <w:proofErr w:type="spellStart"/>
             <w:r>
               <w:rPr>
                 <w:b/>
                 <w:bCs/>
               </w:rPr>
-              <w:t>Entities</w:t>
+              <w:t>Entities/User &amp; Page</w:t>
             </w:r>
-            <w:proofErr w:type="spellEnd"/>
-            <w:r>
-              <w:rPr>
-                <w:b/>
-                <w:bCs/>
-              </w:rPr>
-              <w:t xml:space="preserve">/User &amp; </w:t>
-            </w:r>
-            <w:proofErr w:type="spellStart"/>
-            <w:r>
-              <w:rPr>
-                <w:b/>
-                <w:bCs/>
-              </w:rPr>
-              <w:t>Page</w:t>
-            </w:r>
-            <w:proofErr w:type="spellEnd"/>
           </w:p>
         </w:tc>
         <w:tc>
@@ -624,21 +439,8 @@
             <w:hideMark/>
           </w:tcPr>
           <w:p>
-            <w:proofErr w:type="spellStart"/>
             <w:r>
-              <w:t>Veritabanı</w:t>
-            </w:r>
-            <w:proofErr w:type="spellEnd"/>
-            <w:r>
-              <w:t xml:space="preserve"> tablolarımız. User (Kullanıcı) ve </w:t>
-            </w:r>
-            <w:proofErr w:type="spellStart"/>
-            <w:r>
-              <w:t>Page</w:t>
-            </w:r>
-            <w:proofErr w:type="spellEnd"/>
-            <w:r>
-              <w:t xml:space="preserve"> (Notlar) arasında </w:t>
+              <w:t xml:space="preserve">Veritabanı tablolarımız. User (Kullanıcı) ve Page (Notlar) arasında </w:t>
             </w:r>
             <w:r>
               <w:rPr>
@@ -670,21 +472,12 @@
             <w:hideMark/>
           </w:tcPr>
           <w:p>
-            <w:proofErr w:type="spellStart"/>
             <w:r>
               <w:rPr>
                 <w:b/>
                 <w:bCs/>
               </w:rPr>
-              <w:t>DTOs</w:t>
-            </w:r>
-            <w:proofErr w:type="spellEnd"/>
-            <w:r>
-              <w:rPr>
-                <w:b/>
-                <w:bCs/>
-              </w:rPr>
-              <w:t>/</w:t>
+              <w:t>DTOs/</w:t>
             </w:r>
           </w:p>
         </w:tc>
@@ -702,31 +495,7 @@
           </w:tcPr>
           <w:p>
             <w:r>
-              <w:t xml:space="preserve">Mobil uygulama ile </w:t>
-            </w:r>
-            <w:proofErr w:type="spellStart"/>
-            <w:r>
-              <w:t>backend</w:t>
-            </w:r>
-            <w:proofErr w:type="spellEnd"/>
-            <w:r>
-              <w:t xml:space="preserve"> arasında taşınan "veri paketleri" (</w:t>
-            </w:r>
-            <w:proofErr w:type="spellStart"/>
-            <w:r>
-              <w:t>LoginRequest</w:t>
-            </w:r>
-            <w:proofErr w:type="spellEnd"/>
-            <w:r>
-              <w:t xml:space="preserve">, </w:t>
-            </w:r>
-            <w:proofErr w:type="spellStart"/>
-            <w:r>
-              <w:t>UserResponse</w:t>
-            </w:r>
-            <w:proofErr w:type="spellEnd"/>
-            <w:r>
-              <w:t xml:space="preserve"> vb.).</w:t>
+              <w:t>Mobil uygulama ile backend arasında taşınan "veri paketleri" (LoginRequest, UserResponse vb.).</w:t>
             </w:r>
           </w:p>
         </w:tc>
@@ -771,23 +540,7 @@
           </w:tcPr>
           <w:p>
             <w:r>
-              <w:t xml:space="preserve">İşin "mutfağı". Şifre kontrolü, </w:t>
-            </w:r>
-            <w:proofErr w:type="spellStart"/>
-            <w:r>
-              <w:t>token</w:t>
-            </w:r>
-            <w:proofErr w:type="spellEnd"/>
-            <w:r>
-              <w:t xml:space="preserve"> üretimi ve </w:t>
-            </w:r>
-            <w:proofErr w:type="spellStart"/>
-            <w:r>
-              <w:t>veritabanı</w:t>
-            </w:r>
-            <w:proofErr w:type="spellEnd"/>
-            <w:r>
-              <w:t xml:space="preserve"> kayıt mantığı burada.</w:t>
+              <w:t>İşin "mutfağı". Şifre kontrolü, token üretimi ve veritabanı kayıt mantığı burada.</w:t>
             </w:r>
           </w:p>
         </w:tc>
@@ -833,7 +586,6 @@
       <w:r>
         <w:t xml:space="preserve"> Kullanıcı şifresi </w:t>
       </w:r>
-      <w:proofErr w:type="spellStart"/>
       <w:r>
         <w:rPr>
           <w:b/>
@@ -841,17 +593,8 @@
         </w:rPr>
         <w:t>BCrypt</w:t>
       </w:r>
-      <w:proofErr w:type="spellEnd"/>
-      <w:r>
-        <w:t xml:space="preserve"> ile karartılarak kaydedilir (</w:t>
-      </w:r>
-      <w:proofErr w:type="spellStart"/>
-      <w:r>
-        <w:t>Veritabanında</w:t>
-      </w:r>
-      <w:proofErr w:type="spellEnd"/>
-      <w:r>
-        <w:t xml:space="preserve"> bile okunamaz).</w:t>
+      <w:r>
+        <w:t xml:space="preserve"> ile karartılarak kaydedilir (Veritabanında bile okunamaz).</w:t>
       </w:r>
     </w:p>
     <w:p>
@@ -869,32 +612,15 @@
         <w:t>Giriş:</w:t>
       </w:r>
       <w:r>
-        <w:t xml:space="preserve"> Kullanıcı </w:t>
-      </w:r>
-      <w:proofErr w:type="spellStart"/>
-      <w:r>
-        <w:t>email</w:t>
-      </w:r>
-      <w:proofErr w:type="spellEnd"/>
-      <w:r>
-        <w:t xml:space="preserve">/şifre gönderir. Bilgiler doğruysa ona 10 saat geçerli bir </w:t>
-      </w:r>
-      <w:r>
-        <w:rPr>
-          <w:b/>
-          <w:bCs/>
-        </w:rPr>
-        <w:t xml:space="preserve">JWT </w:t>
-      </w:r>
-      <w:proofErr w:type="spellStart"/>
-      <w:r>
-        <w:rPr>
-          <w:b/>
-          <w:bCs/>
-        </w:rPr>
-        <w:t>Token</w:t>
-      </w:r>
-      <w:proofErr w:type="spellEnd"/>
+        <w:t xml:space="preserve"> Kullanıcı email/şifre gönderir. Bilgiler doğruysa ona 10 saat geçerli bir </w:t>
+      </w:r>
+      <w:r>
+        <w:rPr>
+          <w:b/>
+          <w:bCs/>
+        </w:rPr>
+        <w:t>JWT Token</w:t>
+      </w:r>
       <w:r>
         <w:t xml:space="preserve"> verilir.</w:t>
       </w:r>
@@ -914,15 +640,7 @@
         <w:t>İstek:</w:t>
       </w:r>
       <w:r>
-        <w:t xml:space="preserve"> Kullanıcı "Notlarımı getir" dediğinde, bu </w:t>
-      </w:r>
-      <w:proofErr w:type="spellStart"/>
-      <w:r>
-        <w:t>token'ı</w:t>
-      </w:r>
-      <w:proofErr w:type="spellEnd"/>
-      <w:r>
-        <w:t xml:space="preserve"> isteğin başına ekler.</w:t>
+        <w:t xml:space="preserve"> Kullanıcı "Notlarımı getir" dediğinde, bu token'ı isteğin başına ekler.</w:t>
       </w:r>
     </w:p>
     <w:p>
@@ -940,39 +658,7 @@
         <w:t>Doğrulama:</w:t>
       </w:r>
       <w:r>
-        <w:t xml:space="preserve"> </w:t>
-      </w:r>
-      <w:proofErr w:type="spellStart"/>
-      <w:r>
-        <w:t>JwtFilter</w:t>
-      </w:r>
-      <w:proofErr w:type="spellEnd"/>
-      <w:r>
-        <w:t xml:space="preserve"> araya girer, </w:t>
-      </w:r>
-      <w:proofErr w:type="spellStart"/>
-      <w:r>
-        <w:t>token'ı</w:t>
-      </w:r>
-      <w:proofErr w:type="spellEnd"/>
-      <w:r>
-        <w:t xml:space="preserve"> </w:t>
-      </w:r>
-      <w:proofErr w:type="spellStart"/>
-      <w:r>
-        <w:t>JwtUtil</w:t>
-      </w:r>
-      <w:proofErr w:type="spellEnd"/>
-      <w:r>
-        <w:t xml:space="preserve"> ile doğrular ve Spring </w:t>
-      </w:r>
-      <w:proofErr w:type="spellStart"/>
-      <w:r>
-        <w:t>Security'ye</w:t>
-      </w:r>
-      <w:proofErr w:type="spellEnd"/>
-      <w:r>
-        <w:t xml:space="preserve"> "Bu kişi güvenli" der.</w:t>
+        <w:t xml:space="preserve"> JwtFilter araya girer, token'ı JwtUtil ile doğrular ve Spring Security'ye "Bu kişi güvenli" der.</w:t>
       </w:r>
     </w:p>
     <w:p>
@@ -999,15 +685,7 @@
     </w:p>
     <w:p>
       <w:r>
-        <w:t xml:space="preserve">Şu an altyapı bitti, artık iş mantığına (Business </w:t>
-      </w:r>
-      <w:proofErr w:type="spellStart"/>
-      <w:r>
-        <w:t>Logic</w:t>
-      </w:r>
-      <w:proofErr w:type="spellEnd"/>
-      <w:r>
-        <w:t>) geçmeye hazırız:</w:t>
+        <w:t>Şu an altyapı bitti, artık iş mantığına (Business Logic) geçmeye hazırız:</w:t>
       </w:r>
     </w:p>
     <w:p>
@@ -1017,21 +695,12 @@
           <w:numId w:val="3"/>
         </w:numPr>
       </w:pPr>
-      <w:proofErr w:type="spellStart"/>
-      <w:r>
-        <w:rPr>
-          <w:b/>
-          <w:bCs/>
-        </w:rPr>
-        <w:t>Page</w:t>
-      </w:r>
-      <w:proofErr w:type="spellEnd"/>
-      <w:r>
-        <w:rPr>
-          <w:b/>
-          <w:bCs/>
-        </w:rPr>
-        <w:t xml:space="preserve"> (Not) CRUD:</w:t>
+      <w:r>
+        <w:rPr>
+          <w:b/>
+          <w:bCs/>
+        </w:rPr>
+        <w:t>Page (Not) CRUD:</w:t>
       </w:r>
       <w:r>
         <w:t xml:space="preserve"> Kullanıcının sadece kendi notlarını ekleyip görebileceği servisleri yazacağız.</w:t>
@@ -1044,32 +713,15 @@
           <w:numId w:val="3"/>
         </w:numPr>
       </w:pPr>
-      <w:proofErr w:type="spellStart"/>
-      <w:r>
-        <w:rPr>
-          <w:b/>
-          <w:bCs/>
-        </w:rPr>
-        <w:t>Pagination</w:t>
-      </w:r>
-      <w:proofErr w:type="spellEnd"/>
-      <w:r>
-        <w:rPr>
-          <w:b/>
-          <w:bCs/>
-        </w:rPr>
-        <w:t>:</w:t>
-      </w:r>
-      <w:r>
-        <w:t xml:space="preserve"> Çok fazla not olduğunda bunları 10'arlı </w:t>
-      </w:r>
-      <w:proofErr w:type="spellStart"/>
-      <w:r>
-        <w:t>10'arlı</w:t>
-      </w:r>
-      <w:proofErr w:type="spellEnd"/>
-      <w:r>
-        <w:t xml:space="preserve"> sayfalara böleceğiz.</w:t>
+      <w:r>
+        <w:rPr>
+          <w:b/>
+          <w:bCs/>
+        </w:rPr>
+        <w:t>Pagination:</w:t>
+      </w:r>
+      <w:r>
+        <w:t xml:space="preserve"> Çok fazla not olduğunda bunları 10'arlı 10'arlı sayfalara böleceğiz.</w:t>
       </w:r>
     </w:p>
     <w:p>
@@ -1079,48 +731,15 @@
           <w:numId w:val="3"/>
         </w:numPr>
       </w:pPr>
-      <w:proofErr w:type="spellStart"/>
-      <w:r>
-        <w:rPr>
-          <w:b/>
-          <w:bCs/>
-        </w:rPr>
-        <w:t>Group</w:t>
-      </w:r>
-      <w:proofErr w:type="spellEnd"/>
-      <w:r>
-        <w:rPr>
-          <w:b/>
-          <w:bCs/>
-        </w:rPr>
-        <w:t>/</w:t>
-      </w:r>
-      <w:proofErr w:type="spellStart"/>
-      <w:r>
-        <w:rPr>
-          <w:b/>
-          <w:bCs/>
-        </w:rPr>
-        <w:t>Category</w:t>
-      </w:r>
-      <w:proofErr w:type="spellEnd"/>
-      <w:r>
-        <w:rPr>
-          <w:b/>
-          <w:bCs/>
-        </w:rPr>
-        <w:t>:</w:t>
-      </w:r>
-      <w:r>
-        <w:t xml:space="preserve"> Notları </w:t>
-      </w:r>
-      <w:proofErr w:type="spellStart"/>
-      <w:r>
-        <w:t>klasörlemek</w:t>
-      </w:r>
-      <w:proofErr w:type="spellEnd"/>
-      <w:r>
-        <w:t xml:space="preserve"> için yeni bir tablo ve ilişki kuracağız.</w:t>
+      <w:r>
+        <w:rPr>
+          <w:b/>
+          <w:bCs/>
+        </w:rPr>
+        <w:t>Group/Category:</w:t>
+      </w:r>
+      <w:r>
+        <w:t xml:space="preserve"> Notları klasörlemek için yeni bir tablo ve ilişki kuracağız.</w:t>
       </w:r>
     </w:p>
     <w:p>
@@ -1145,23 +764,7 @@
           <w:i/>
           <w:iCs/>
         </w:rPr>
-        <w:t xml:space="preserve">"Kaldığımız yerden devam edelim, </w:t>
-      </w:r>
-      <w:proofErr w:type="spellStart"/>
-      <w:r>
-        <w:rPr>
-          <w:i/>
-          <w:iCs/>
-        </w:rPr>
-        <w:t>PageController</w:t>
-      </w:r>
-      <w:proofErr w:type="spellEnd"/>
-      <w:r>
-        <w:rPr>
-          <w:i/>
-          <w:iCs/>
-        </w:rPr>
-        <w:t xml:space="preserve"> ve Service katmanını yazalım"</w:t>
+        <w:t>"Kaldığımız yerden devam edelim, PageController ve Service katmanını yazalım"</w:t>
       </w:r>
       <w:r>
         <w:t xml:space="preserve"> demen yeterli olacaktır. Kodların ve mimarin şu an tertemiz bir şekilde seni bekliyor!</w:t>
@@ -1208,39 +811,7 @@
           <w:b/>
           <w:bCs/>
         </w:rPr>
-        <w:t xml:space="preserve"> </w:t>
-      </w:r>
-      <w:proofErr w:type="spellStart"/>
-      <w:r>
-        <w:rPr>
-          <w:b/>
-          <w:bCs/>
-        </w:rPr>
-        <w:t>NoteP</w:t>
-      </w:r>
-      <w:proofErr w:type="spellEnd"/>
-      <w:r>
-        <w:rPr>
-          <w:b/>
-          <w:bCs/>
-        </w:rPr>
-        <w:t xml:space="preserve"> </w:t>
-      </w:r>
-      <w:proofErr w:type="spellStart"/>
-      <w:r>
-        <w:rPr>
-          <w:b/>
-          <w:bCs/>
-        </w:rPr>
-        <w:t>Backend</w:t>
-      </w:r>
-      <w:proofErr w:type="spellEnd"/>
-      <w:r>
-        <w:rPr>
-          <w:b/>
-          <w:bCs/>
-        </w:rPr>
-        <w:t xml:space="preserve"> Proje El Kitabı</w:t>
+        <w:t xml:space="preserve"> NoteP Backend Proje El Kitabı</w:t>
       </w:r>
     </w:p>
     <w:p>
@@ -1260,15 +831,7 @@
     </w:p>
     <w:p>
       <w:r>
-        <w:t>Mobil uygulama üzerinden kullanıcıların kayıt olabildiği, giriş yapabildiği ve kendilerine özel notlarını (</w:t>
-      </w:r>
-      <w:proofErr w:type="spellStart"/>
-      <w:r>
-        <w:t>Page</w:t>
-      </w:r>
-      <w:proofErr w:type="spellEnd"/>
-      <w:r>
-        <w:t>) güvenli bir şekilde saklayabildiği bir REST API altyapısıdır.</w:t>
+        <w:t>Mobil uygulama üzerinden kullanıcıların kayıt olabildiği, giriş yapabildiği ve kendilerine özel notlarını (Page) güvenli bir şekilde saklayabildiği bir REST API altyapısıdır.</w:t>
       </w:r>
     </w:p>
     <w:p>
@@ -1302,23 +865,7 @@
           <w:b/>
           <w:bCs/>
         </w:rPr>
-        <w:t>N-</w:t>
-      </w:r>
-      <w:proofErr w:type="spellStart"/>
-      <w:r>
-        <w:rPr>
-          <w:b/>
-          <w:bCs/>
-        </w:rPr>
-        <w:t>Tier</w:t>
-      </w:r>
-      <w:proofErr w:type="spellEnd"/>
-      <w:r>
-        <w:rPr>
-          <w:b/>
-          <w:bCs/>
-        </w:rPr>
-        <w:t xml:space="preserve"> (Çok Katmanlı)</w:t>
+        <w:t>N-Tier (Çok Katmanlı)</w:t>
       </w:r>
       <w:r>
         <w:t xml:space="preserve"> mimari üzerine kuruludur:</w:t>
@@ -1339,15 +886,7 @@
         <w:t>Controller:</w:t>
       </w:r>
       <w:r>
-        <w:t xml:space="preserve"> Dış dünyaya açılan kapı (</w:t>
-      </w:r>
-      <w:proofErr w:type="spellStart"/>
-      <w:r>
-        <w:t>Endpoint'ler</w:t>
-      </w:r>
-      <w:proofErr w:type="spellEnd"/>
-      <w:r>
-        <w:t>).</w:t>
+        <w:t xml:space="preserve"> Dış dünyaya açılan kapı (Endpoint'ler).</w:t>
       </w:r>
     </w:p>
     <w:p>
@@ -1375,32 +914,15 @@
           <w:numId w:val="4"/>
         </w:numPr>
       </w:pPr>
-      <w:proofErr w:type="spellStart"/>
-      <w:r>
-        <w:rPr>
-          <w:b/>
-          <w:bCs/>
-        </w:rPr>
-        <w:t>Repository</w:t>
-      </w:r>
-      <w:proofErr w:type="spellEnd"/>
-      <w:r>
-        <w:rPr>
-          <w:b/>
-          <w:bCs/>
-        </w:rPr>
-        <w:t>:</w:t>
-      </w:r>
-      <w:r>
-        <w:t xml:space="preserve"> </w:t>
-      </w:r>
-      <w:proofErr w:type="spellStart"/>
-      <w:r>
-        <w:t>Veritabanı</w:t>
-      </w:r>
-      <w:proofErr w:type="spellEnd"/>
-      <w:r>
-        <w:t xml:space="preserve"> ile konuşan katman.</w:t>
+      <w:r>
+        <w:rPr>
+          <w:b/>
+          <w:bCs/>
+        </w:rPr>
+        <w:t>Repository:</w:t>
+      </w:r>
+      <w:r>
+        <w:t xml:space="preserve"> Veritabanı ile konuşan katman.</w:t>
       </w:r>
     </w:p>
     <w:p>
@@ -1410,32 +932,15 @@
           <w:numId w:val="4"/>
         </w:numPr>
       </w:pPr>
-      <w:proofErr w:type="spellStart"/>
-      <w:r>
-        <w:rPr>
-          <w:b/>
-          <w:bCs/>
-        </w:rPr>
-        <w:t>Entity</w:t>
-      </w:r>
-      <w:proofErr w:type="spellEnd"/>
-      <w:r>
-        <w:rPr>
-          <w:b/>
-          <w:bCs/>
-        </w:rPr>
-        <w:t>:</w:t>
-      </w:r>
-      <w:r>
-        <w:t xml:space="preserve"> </w:t>
-      </w:r>
-      <w:proofErr w:type="spellStart"/>
-      <w:r>
-        <w:t>Veritabanındaki</w:t>
-      </w:r>
-      <w:proofErr w:type="spellEnd"/>
-      <w:r>
-        <w:t xml:space="preserve"> tabloların Java'daki karşılığı.</w:t>
+      <w:r>
+        <w:rPr>
+          <w:b/>
+          <w:bCs/>
+        </w:rPr>
+        <w:t>Entity:</w:t>
+      </w:r>
+      <w:r>
+        <w:t xml:space="preserve"> Veritabanındaki tabloların Java'daki karşılığı.</w:t>
       </w:r>
     </w:p>
     <w:p>
@@ -1453,15 +958,7 @@
         <w:t>DTO:</w:t>
       </w:r>
       <w:r>
-        <w:t xml:space="preserve"> Veri transfer paketleri (Güvenlik için </w:t>
-      </w:r>
-      <w:proofErr w:type="spellStart"/>
-      <w:r>
-        <w:t>Entity'leri</w:t>
-      </w:r>
-      <w:proofErr w:type="spellEnd"/>
-      <w:r>
-        <w:t xml:space="preserve"> doğrudan dışarı açmıyoruz).</w:t>
+        <w:t xml:space="preserve"> Veri transfer paketleri (Güvenlik için Entity'leri doğrudan dışarı açmıyoruz).</w:t>
       </w:r>
     </w:p>
     <w:p>
@@ -1483,23 +980,7 @@
           <w:b/>
           <w:bCs/>
         </w:rPr>
-        <w:t xml:space="preserve">3. </w:t>
-      </w:r>
-      <w:proofErr w:type="spellStart"/>
-      <w:r>
-        <w:rPr>
-          <w:b/>
-          <w:bCs/>
-        </w:rPr>
-        <w:t>Veritabanı</w:t>
-      </w:r>
-      <w:proofErr w:type="spellEnd"/>
-      <w:r>
-        <w:rPr>
-          <w:b/>
-          <w:bCs/>
-        </w:rPr>
-        <w:t xml:space="preserve"> İlişki Şeması</w:t>
+        <w:t>3. Veritabanı İlişki Şeması</w:t>
       </w:r>
     </w:p>
     <w:p>
@@ -1522,23 +1003,7 @@
         <w:t>User:</w:t>
       </w:r>
       <w:r>
-        <w:t xml:space="preserve"> id, name, </w:t>
-      </w:r>
-      <w:proofErr w:type="spellStart"/>
-      <w:r>
-        <w:t>email</w:t>
-      </w:r>
-      <w:proofErr w:type="spellEnd"/>
-      <w:r>
-        <w:t xml:space="preserve">, </w:t>
-      </w:r>
-      <w:proofErr w:type="spellStart"/>
-      <w:r>
-        <w:t>password</w:t>
-      </w:r>
-      <w:proofErr w:type="spellEnd"/>
-      <w:r>
-        <w:t>.</w:t>
+        <w:t xml:space="preserve"> id, name, email, password.</w:t>
       </w:r>
     </w:p>
     <w:p>
@@ -1548,72 +1013,15 @@
           <w:numId w:val="5"/>
         </w:numPr>
       </w:pPr>
-      <w:proofErr w:type="spellStart"/>
-      <w:r>
-        <w:rPr>
-          <w:b/>
-          <w:bCs/>
-        </w:rPr>
-        <w:t>Page</w:t>
-      </w:r>
-      <w:proofErr w:type="spellEnd"/>
-      <w:r>
-        <w:rPr>
-          <w:b/>
-          <w:bCs/>
-        </w:rPr>
-        <w:t>:</w:t>
-      </w:r>
-      <w:r>
-        <w:t xml:space="preserve"> id, </w:t>
-      </w:r>
-      <w:proofErr w:type="spellStart"/>
-      <w:r>
-        <w:t>title</w:t>
-      </w:r>
-      <w:proofErr w:type="spellEnd"/>
-      <w:r>
-        <w:t xml:space="preserve">, </w:t>
-      </w:r>
-      <w:proofErr w:type="spellStart"/>
-      <w:r>
-        <w:t>content</w:t>
-      </w:r>
-      <w:proofErr w:type="spellEnd"/>
-      <w:r>
-        <w:t xml:space="preserve">, </w:t>
-      </w:r>
-      <w:proofErr w:type="spellStart"/>
-      <w:r>
-        <w:t>created_date</w:t>
-      </w:r>
-      <w:proofErr w:type="spellEnd"/>
-      <w:r>
-        <w:t xml:space="preserve">, </w:t>
-      </w:r>
-      <w:proofErr w:type="spellStart"/>
-      <w:r>
-        <w:t>user_id</w:t>
-      </w:r>
-      <w:proofErr w:type="spellEnd"/>
-      <w:r>
-        <w:t xml:space="preserve"> (</w:t>
-      </w:r>
-      <w:proofErr w:type="spellStart"/>
-      <w:r>
-        <w:t>Foreign</w:t>
-      </w:r>
-      <w:proofErr w:type="spellEnd"/>
-      <w:r>
-        <w:t xml:space="preserve"> </w:t>
-      </w:r>
-      <w:proofErr w:type="spellStart"/>
-      <w:r>
-        <w:t>Key</w:t>
-      </w:r>
-      <w:proofErr w:type="spellEnd"/>
-      <w:r>
-        <w:t>).</w:t>
+      <w:r>
+        <w:rPr>
+          <w:b/>
+          <w:bCs/>
+        </w:rPr>
+        <w:t>Page:</w:t>
+      </w:r>
+      <w:r>
+        <w:t xml:space="preserve"> id, title, content, created_date, user_id (Foreign Key).</w:t>
       </w:r>
     </w:p>
     <w:p>
@@ -1631,15 +1039,7 @@
         <w:t>İlişki:</w:t>
       </w:r>
       <w:r>
-        <w:t xml:space="preserve"> </w:t>
-      </w:r>
-      <w:proofErr w:type="spellStart"/>
-      <w:r>
-        <w:t>One-To-Many</w:t>
-      </w:r>
-      <w:proofErr w:type="spellEnd"/>
-      <w:r>
-        <w:t xml:space="preserve"> (Bir kullanıcının çok sayıda notu olabilir).</w:t>
+        <w:t xml:space="preserve"> One-To-Many (Bir kullanıcının çok sayıda notu olabilir).</w:t>
       </w:r>
     </w:p>
     <w:p>
@@ -1666,15 +1066,7 @@
     </w:p>
     <w:p>
       <w:r>
-        <w:t xml:space="preserve">Geri geldiğinde "Bu </w:t>
-      </w:r>
-      <w:proofErr w:type="spellStart"/>
-      <w:r>
-        <w:t>token</w:t>
-      </w:r>
-      <w:proofErr w:type="spellEnd"/>
-      <w:r>
-        <w:t xml:space="preserve"> işi nasıl oluyordu?" dersen, işte bu akış sana yardımcı olacak:</w:t>
+        <w:t>Geri geldiğinde "Bu token işi nasıl oluyordu?" dersen, işte bu akış sana yardımcı olacak:</w:t>
       </w:r>
     </w:p>
     <w:p>
@@ -1710,23 +1102,7 @@
         <w:t>Mühürleme:</w:t>
       </w:r>
       <w:r>
-        <w:t xml:space="preserve"> </w:t>
-      </w:r>
-      <w:proofErr w:type="spellStart"/>
-      <w:r>
-        <w:t>UserService</w:t>
-      </w:r>
-      <w:proofErr w:type="spellEnd"/>
-      <w:r>
-        <w:t xml:space="preserve"> şifreyi kontrol eder, doğruysa </w:t>
-      </w:r>
-      <w:proofErr w:type="spellStart"/>
-      <w:r>
-        <w:t>JwtUtil</w:t>
-      </w:r>
-      <w:proofErr w:type="spellEnd"/>
-      <w:r>
-        <w:t xml:space="preserve"> ile bir "Dijital Anahtar" (JWT) üretir ve kullanıcıya verir.</w:t>
+        <w:t xml:space="preserve"> UserService şifreyi kontrol eder, doğruysa JwtUtil ile bir "Dijital Anahtar" (JWT) üretir ve kullanıcıya verir.</w:t>
       </w:r>
     </w:p>
     <w:p>
@@ -1741,34 +1117,10 @@
           <w:b/>
           <w:bCs/>
         </w:rPr>
-        <w:t>Bekçi (</w:t>
-      </w:r>
-      <w:proofErr w:type="spellStart"/>
-      <w:r>
-        <w:rPr>
-          <w:b/>
-          <w:bCs/>
-        </w:rPr>
-        <w:t>Filter</w:t>
-      </w:r>
-      <w:proofErr w:type="spellEnd"/>
-      <w:r>
-        <w:rPr>
-          <w:b/>
-          <w:bCs/>
-        </w:rPr>
-        <w:t>):</w:t>
-      </w:r>
-      <w:r>
-        <w:t xml:space="preserve"> Kullanıcı sonraki her isteğinde bu anahtarı yanında getirir. </w:t>
-      </w:r>
-      <w:proofErr w:type="spellStart"/>
-      <w:r>
-        <w:t>JwtFilter</w:t>
-      </w:r>
-      <w:proofErr w:type="spellEnd"/>
-      <w:r>
-        <w:t xml:space="preserve"> kapıda anahtarı kontrol eder.</w:t>
+        <w:t>Bekçi (Filter):</w:t>
+      </w:r>
+      <w:r>
+        <w:t xml:space="preserve"> Kullanıcı sonraki her isteğinde bu anahtarı yanında getirir. JwtFilter kapıda anahtarı kontrol eder.</w:t>
       </w:r>
     </w:p>
     <w:p>
@@ -1786,15 +1138,7 @@
         <w:t>Yetki:</w:t>
       </w:r>
       <w:r>
-        <w:t xml:space="preserve"> Eğer anahtar gerçekse, </w:t>
-      </w:r>
-      <w:proofErr w:type="spellStart"/>
-      <w:r>
-        <w:t>SecurityContext</w:t>
-      </w:r>
-      <w:proofErr w:type="spellEnd"/>
-      <w:r>
-        <w:t xml:space="preserve"> üzerinden kapı açılır ve kullanıcı içeri alınır.</w:t>
+        <w:t xml:space="preserve"> Eğer anahtar gerçekse, SecurityContext üzerinden kapı açılır ve kullanıcı içeri alınır.</w:t>
       </w:r>
     </w:p>
     <w:p>
@@ -1926,7 +1270,6 @@
             <w:hideMark/>
           </w:tcPr>
           <w:p>
-            <w:proofErr w:type="spellStart"/>
             <w:r>
               <w:rPr>
                 <w:b/>
@@ -1934,7 +1277,6 @@
               </w:rPr>
               <w:t>JwtUtil</w:t>
             </w:r>
-            <w:proofErr w:type="spellEnd"/>
           </w:p>
         </w:tc>
         <w:tc>
@@ -1968,13 +1310,8 @@
             <w:hideMark/>
           </w:tcPr>
           <w:p>
-            <w:proofErr w:type="spellStart"/>
             <w:r>
-              <w:t>secretKey</w:t>
-            </w:r>
-            <w:proofErr w:type="spellEnd"/>
-            <w:r>
-              <w:t xml:space="preserve"> gizli kalmalı!</w:t>
+              <w:t>secretKey gizli kalmalı!</w:t>
             </w:r>
           </w:p>
         </w:tc>
@@ -1996,7 +1333,6 @@
             <w:hideMark/>
           </w:tcPr>
           <w:p>
-            <w:proofErr w:type="spellStart"/>
             <w:r>
               <w:rPr>
                 <w:b/>
@@ -2004,7 +1340,6 @@
               </w:rPr>
               <w:t>JwtFilter</w:t>
             </w:r>
-            <w:proofErr w:type="spellEnd"/>
           </w:p>
         </w:tc>
         <w:tc>
@@ -2061,7 +1396,6 @@
             <w:hideMark/>
           </w:tcPr>
           <w:p>
-            <w:proofErr w:type="spellStart"/>
             <w:r>
               <w:rPr>
                 <w:b/>
@@ -2069,7 +1403,6 @@
               </w:rPr>
               <w:t>SecurityConfig</w:t>
             </w:r>
-            <w:proofErr w:type="spellEnd"/>
           </w:p>
         </w:tc>
         <w:tc>
@@ -2126,7 +1459,6 @@
             <w:hideMark/>
           </w:tcPr>
           <w:p>
-            <w:proofErr w:type="spellStart"/>
             <w:r>
               <w:rPr>
                 <w:b/>
@@ -2134,7 +1466,6 @@
               </w:rPr>
               <w:t>BCrypt</w:t>
             </w:r>
-            <w:proofErr w:type="spellEnd"/>
           </w:p>
         </w:tc>
         <w:tc>
@@ -2240,21 +1571,12 @@
       <w:r>
         <w:t xml:space="preserve">[ ] </w:t>
       </w:r>
-      <w:proofErr w:type="spellStart"/>
-      <w:r>
-        <w:rPr>
-          <w:b/>
-          <w:bCs/>
-        </w:rPr>
-        <w:t>Page</w:t>
-      </w:r>
-      <w:proofErr w:type="spellEnd"/>
-      <w:r>
-        <w:rPr>
-          <w:b/>
-          <w:bCs/>
-        </w:rPr>
-        <w:t xml:space="preserve"> CRUD (Sıradaki Adım):</w:t>
+      <w:r>
+        <w:rPr>
+          <w:b/>
+          <w:bCs/>
+        </w:rPr>
+        <w:t>Page CRUD (Sıradaki Adım):</w:t>
       </w:r>
       <w:r>
         <w:t xml:space="preserve"> Not ekleme, silme ve düzenleme.</w:t>
@@ -2270,21 +1592,12 @@
       <w:r>
         <w:t xml:space="preserve">[ ] </w:t>
       </w:r>
-      <w:proofErr w:type="spellStart"/>
-      <w:r>
-        <w:rPr>
-          <w:b/>
-          <w:bCs/>
-        </w:rPr>
-        <w:t>Pagination</w:t>
-      </w:r>
-      <w:proofErr w:type="spellEnd"/>
-      <w:r>
-        <w:rPr>
-          <w:b/>
-          <w:bCs/>
-        </w:rPr>
-        <w:t>:</w:t>
+      <w:r>
+        <w:rPr>
+          <w:b/>
+          <w:bCs/>
+        </w:rPr>
+        <w:t>Pagination:</w:t>
       </w:r>
       <w:r>
         <w:t xml:space="preserve"> Notları sayfalara bölerek getirme.</w:t>
@@ -2305,23 +1618,7 @@
           <w:b/>
           <w:bCs/>
         </w:rPr>
-        <w:t xml:space="preserve">Global </w:t>
-      </w:r>
-      <w:proofErr w:type="spellStart"/>
-      <w:r>
-        <w:rPr>
-          <w:b/>
-          <w:bCs/>
-        </w:rPr>
-        <w:t>Error</w:t>
-      </w:r>
-      <w:proofErr w:type="spellEnd"/>
-      <w:r>
-        <w:rPr>
-          <w:b/>
-          <w:bCs/>
-        </w:rPr>
-        <w:t xml:space="preserve"> Handling:</w:t>
+        <w:t>Global Error Handling:</w:t>
       </w:r>
       <w:r>
         <w:t xml:space="preserve"> Hataları tek bir merkezden yönetme.</w:t>
@@ -2359,39 +1656,7 @@
     </w:p>
     <w:p>
       <w:r>
-        <w:t xml:space="preserve">Bilgisayarını açıp projeyi yüklediğinde, </w:t>
-      </w:r>
-      <w:proofErr w:type="spellStart"/>
-      <w:r>
-        <w:t>JwtUtil</w:t>
-      </w:r>
-      <w:proofErr w:type="spellEnd"/>
-      <w:r>
-        <w:t xml:space="preserve"> içindeki </w:t>
-      </w:r>
-      <w:proofErr w:type="spellStart"/>
-      <w:r>
-        <w:t>secretKey'in</w:t>
-      </w:r>
-      <w:proofErr w:type="spellEnd"/>
-      <w:r>
-        <w:t xml:space="preserve"> </w:t>
-      </w:r>
-      <w:proofErr w:type="spellStart"/>
-      <w:r>
-        <w:t>application.properties</w:t>
-      </w:r>
-      <w:proofErr w:type="spellEnd"/>
-      <w:r>
-        <w:t xml:space="preserve"> dosyasında tanımlı olduğundan emin ol. Ardından </w:t>
-      </w:r>
-      <w:proofErr w:type="spellStart"/>
-      <w:r>
-        <w:t>PageController</w:t>
-      </w:r>
-      <w:proofErr w:type="spellEnd"/>
-      <w:r>
-        <w:t xml:space="preserve"> yazarak not ekleme işlemlerine başlayabiliriz.</w:t>
+        <w:t>Bilgisayarını açıp projeyi yüklediğinde, JwtUtil içindeki secretKey'in application.properties dosyasında tanımlı olduğundan emin ol. Ardından PageController yazarak not ekleme işlemlerine başlayabiliriz.</w:t>
       </w:r>
     </w:p>
     <w:p>
@@ -2423,36 +1688,12 @@
           <w:bCs/>
         </w:rPr>
         <w:lastRenderedPageBreak/>
-        <w:t>1. HAFTA: Temeller ve Güvenlik (</w:t>
-      </w:r>
-      <w:proofErr w:type="spellStart"/>
-      <w:r>
-        <w:rPr>
-          <w:b/>
-          <w:bCs/>
-        </w:rPr>
-        <w:t>Backend</w:t>
-      </w:r>
-      <w:proofErr w:type="spellEnd"/>
-      <w:r>
-        <w:rPr>
-          <w:b/>
-          <w:bCs/>
-        </w:rPr>
-        <w:t xml:space="preserve"> Odaklı)</w:t>
-      </w:r>
-    </w:p>
-    <w:p>
-      <w:r>
-        <w:t xml:space="preserve">Bu hafta sistemin "kapılarını" ve </w:t>
-      </w:r>
-      <w:proofErr w:type="spellStart"/>
-      <w:r>
-        <w:t>veritabanı</w:t>
-      </w:r>
-      <w:proofErr w:type="spellEnd"/>
-      <w:r>
-        <w:t xml:space="preserve"> akışını tamamen bitiriyoruz.</w:t>
+        <w:t>1. HAFTA: Temeller ve Güvenlik (Backend Odaklı)</w:t>
+      </w:r>
+    </w:p>
+    <w:p>
+      <w:r>
+        <w:t>Bu hafta sistemin "kapılarını" ve veritabanı akışını tamamen bitiriyoruz.</w:t>
       </w:r>
     </w:p>
     <w:p>
@@ -2470,39 +1711,71 @@
         <w:t>1-2. Gün:</w:t>
       </w:r>
       <w:r>
+        <w:t xml:space="preserve"> UserService içindeki Login/Register süreçlerini test et. Postman kullanarak kayıt ol ve Token alabildiğini doğrula.</w:t>
+      </w:r>
+    </w:p>
+    <w:p>
+      <w:pPr>
+        <w:numPr>
+          <w:ilvl w:val="0"/>
+          <w:numId w:val="8"/>
+        </w:numPr>
+      </w:pPr>
+      <w:r>
+        <w:rPr>
+          <w:b/>
+          <w:bCs/>
+        </w:rPr>
+        <w:t>3. Gün:</w:t>
+      </w:r>
+      <w:r>
+        <w:t xml:space="preserve"> PageRepository ve PageService oluşturma. Temel "Not Ekleme" ve "Listeleme" metotlarını yaz.</w:t>
+      </w:r>
+    </w:p>
+    <w:p>
+      <w:pPr>
+        <w:numPr>
+          <w:ilvl w:val="0"/>
+          <w:numId w:val="8"/>
+        </w:numPr>
+      </w:pPr>
+      <w:r>
+        <w:rPr>
+          <w:b/>
+          <w:bCs/>
+        </w:rPr>
+        <w:t>4. Gün:</w:t>
+      </w:r>
+      <w:r>
+        <w:t xml:space="preserve"> SecurityContextHolder kullanarak, Token ile gelen isteğin hangi kullanıcıya ait olduğunu bulan yardımcı metodu yaz.</w:t>
+      </w:r>
+    </w:p>
+    <w:p>
+      <w:pPr>
+        <w:numPr>
+          <w:ilvl w:val="0"/>
+          <w:numId w:val="8"/>
+        </w:numPr>
+      </w:pPr>
+      <w:r>
+        <w:rPr>
+          <w:b/>
+          <w:bCs/>
+        </w:rPr>
+        <w:t>5. Gün:</w:t>
+      </w:r>
+      <w:r>
         <w:t xml:space="preserve"> </w:t>
       </w:r>
-      <w:proofErr w:type="spellStart"/>
-      <w:r>
-        <w:t>UserService</w:t>
-      </w:r>
-      <w:proofErr w:type="spellEnd"/>
-      <w:r>
-        <w:t xml:space="preserve"> içindeki Login/</w:t>
-      </w:r>
-      <w:proofErr w:type="spellStart"/>
-      <w:r>
-        <w:t>Register</w:t>
-      </w:r>
-      <w:proofErr w:type="spellEnd"/>
-      <w:r>
-        <w:t xml:space="preserve"> süreçlerini test et. </w:t>
-      </w:r>
-      <w:proofErr w:type="spellStart"/>
-      <w:r>
-        <w:t>Postman</w:t>
-      </w:r>
-      <w:proofErr w:type="spellEnd"/>
-      <w:r>
-        <w:t xml:space="preserve"> kullanarak kayıt ol ve </w:t>
-      </w:r>
-      <w:proofErr w:type="spellStart"/>
-      <w:r>
-        <w:t>Token</w:t>
-      </w:r>
-      <w:proofErr w:type="spellEnd"/>
-      <w:r>
-        <w:t xml:space="preserve"> alabildiğini doğrula.</w:t>
+      <w:r>
+        <w:rPr>
+          <w:b/>
+          <w:bCs/>
+        </w:rPr>
+        <w:t>Flutter Kurulumu:</w:t>
+      </w:r>
+      <w:r>
+        <w:t xml:space="preserve"> Flutter SDK ve Android Studio ayarlarını yap. İlk "Hello World" projesini Xiaomi telefonunda çalıştır.</w:t>
       </w:r>
     </w:p>
     <w:p>
@@ -2517,224 +1790,213 @@
           <w:b/>
           <w:bCs/>
         </w:rPr>
-        <w:t>3. Gün:</w:t>
+        <w:t>6. Gün:</w:t>
+      </w:r>
+      <w:r>
+        <w:t xml:space="preserve"> Flutter UI: Login ve Register ekranlarının tasarımını yap (Sadece görsel, kodlama haftaya).</w:t>
+      </w:r>
+    </w:p>
+    <w:p>
+      <w:pPr>
+        <w:numPr>
+          <w:ilvl w:val="0"/>
+          <w:numId w:val="8"/>
+        </w:numPr>
+      </w:pPr>
+      <w:r>
+        <w:rPr>
+          <w:b/>
+          <w:bCs/>
+        </w:rPr>
+        <w:t>7. Gün:</w:t>
+      </w:r>
+      <w:r>
+        <w:t xml:space="preserve"> Haftalık Değerlendirme: Backend'deki tüm CRUD (Ekle/Sil/Güncelle) işlemlerinin Postman'de çalıştığından emin ol.</w:t>
+      </w:r>
+    </w:p>
+    <w:p>
+      <w:r>
+        <w:pict w14:anchorId="6307D69A">
+          <v:rect id="_x0000_i1036" style="width:0;height:1.5pt" o:hralign="center" o:hrstd="t" o:hr="t" fillcolor="#a0a0a0" stroked="f"/>
+        </w:pict>
+      </w:r>
+    </w:p>
+    <w:p>
+      <w:pPr>
+        <w:rPr>
+          <w:b/>
+          <w:bCs/>
+        </w:rPr>
+      </w:pPr>
+      <w:r>
+        <w:rPr>
+          <w:b/>
+          <w:bCs/>
+        </w:rPr>
+        <w:t>2. HAFTA: Mobil Uygulama ve API Bağlantısı</w:t>
+      </w:r>
+    </w:p>
+    <w:p>
+      <w:r>
+        <w:t>Bu hafta "kodun" "ekranla" buluştuğu hafta.</w:t>
+      </w:r>
+    </w:p>
+    <w:p>
+      <w:pPr>
+        <w:numPr>
+          <w:ilvl w:val="0"/>
+          <w:numId w:val="9"/>
+        </w:numPr>
+      </w:pPr>
+      <w:r>
+        <w:rPr>
+          <w:b/>
+          <w:bCs/>
+        </w:rPr>
+        <w:t>8. Gün:</w:t>
+      </w:r>
+      <w:r>
+        <w:t xml:space="preserve"> Flutter'da http paketini kur. Login ekranından Spring Boot'a istek at ve dönen Token'ı ekranda gör.</w:t>
+      </w:r>
+    </w:p>
+    <w:p>
+      <w:pPr>
+        <w:numPr>
+          <w:ilvl w:val="0"/>
+          <w:numId w:val="9"/>
+        </w:numPr>
+      </w:pPr>
+      <w:r>
+        <w:rPr>
+          <w:b/>
+          <w:bCs/>
+        </w:rPr>
+        <w:t>9. Gün:</w:t>
       </w:r>
       <w:r>
         <w:t xml:space="preserve"> </w:t>
       </w:r>
-      <w:proofErr w:type="spellStart"/>
-      <w:r>
-        <w:t>PageRepository</w:t>
-      </w:r>
-      <w:proofErr w:type="spellEnd"/>
-      <w:r>
-        <w:t xml:space="preserve"> ve </w:t>
-      </w:r>
-      <w:proofErr w:type="spellStart"/>
-      <w:r>
-        <w:t>PageService</w:t>
-      </w:r>
-      <w:proofErr w:type="spellEnd"/>
-      <w:r>
-        <w:t xml:space="preserve"> oluşturma. Temel "Not Ekleme" ve "Listeleme" metotlarını yaz.</w:t>
-      </w:r>
-    </w:p>
-    <w:p>
-      <w:pPr>
-        <w:numPr>
-          <w:ilvl w:val="0"/>
-          <w:numId w:val="8"/>
-        </w:numPr>
-      </w:pPr>
-      <w:r>
-        <w:rPr>
-          <w:b/>
-          <w:bCs/>
-        </w:rPr>
-        <w:t>4. Gün:</w:t>
+      <w:r>
+        <w:rPr>
+          <w:b/>
+          <w:bCs/>
+        </w:rPr>
+        <w:t>Token Saklama:</w:t>
+      </w:r>
+      <w:r>
+        <w:t xml:space="preserve"> shared_preferences kullanarak Token'ı telefon hafızasına kaydet. Uygulama açıldığında Token varsa direkt ana sayfaya yönlendir.</w:t>
+      </w:r>
+    </w:p>
+    <w:p>
+      <w:pPr>
+        <w:numPr>
+          <w:ilvl w:val="0"/>
+          <w:numId w:val="9"/>
+        </w:numPr>
+      </w:pPr>
+      <w:r>
+        <w:rPr>
+          <w:b/>
+          <w:bCs/>
+        </w:rPr>
+        <w:t>10. Gün:</w:t>
       </w:r>
       <w:r>
         <w:t xml:space="preserve"> </w:t>
       </w:r>
-      <w:proofErr w:type="spellStart"/>
-      <w:r>
-        <w:t>SecurityContextHolder</w:t>
-      </w:r>
-      <w:proofErr w:type="spellEnd"/>
-      <w:r>
-        <w:t xml:space="preserve"> kullanarak, </w:t>
-      </w:r>
-      <w:proofErr w:type="spellStart"/>
-      <w:r>
-        <w:t>Token</w:t>
-      </w:r>
-      <w:proofErr w:type="spellEnd"/>
-      <w:r>
-        <w:t xml:space="preserve"> ile gelen isteğin hangi kullanıcıya ait olduğunu bulan yardımcı metodu yaz.</w:t>
-      </w:r>
-    </w:p>
-    <w:p>
-      <w:pPr>
-        <w:numPr>
-          <w:ilvl w:val="0"/>
-          <w:numId w:val="8"/>
-        </w:numPr>
-      </w:pPr>
-      <w:r>
-        <w:rPr>
-          <w:b/>
-          <w:bCs/>
-        </w:rPr>
-        <w:t>5. Gün:</w:t>
+      <w:r>
+        <w:rPr>
+          <w:b/>
+          <w:bCs/>
+        </w:rPr>
+        <w:t>Ana Sayfa (Listeleme):</w:t>
+      </w:r>
+      <w:r>
+        <w:t xml:space="preserve"> Backend'den gelen notları ListView içinde listele. Şık bir kart (Card) tasarımı yap.</w:t>
+      </w:r>
+    </w:p>
+    <w:p>
+      <w:pPr>
+        <w:numPr>
+          <w:ilvl w:val="0"/>
+          <w:numId w:val="9"/>
+        </w:numPr>
+      </w:pPr>
+      <w:r>
+        <w:rPr>
+          <w:b/>
+          <w:bCs/>
+        </w:rPr>
+        <w:t>11. Gün:</w:t>
       </w:r>
       <w:r>
         <w:t xml:space="preserve"> </w:t>
       </w:r>
-      <w:proofErr w:type="spellStart"/>
-      <w:r>
-        <w:rPr>
-          <w:b/>
-          <w:bCs/>
-        </w:rPr>
-        <w:t>Flutter</w:t>
-      </w:r>
-      <w:proofErr w:type="spellEnd"/>
-      <w:r>
-        <w:rPr>
-          <w:b/>
-          <w:bCs/>
-        </w:rPr>
-        <w:t xml:space="preserve"> Kurulumu:</w:t>
+      <w:r>
+        <w:rPr>
+          <w:b/>
+          <w:bCs/>
+        </w:rPr>
+        <w:t>Not Ekleme:</w:t>
+      </w:r>
+      <w:r>
+        <w:t xml:space="preserve"> Flutter'da bir "Yeni Not" sayfası yap. Başlık ve içeriği Spring Boot'a gönder.</w:t>
+      </w:r>
+    </w:p>
+    <w:p>
+      <w:pPr>
+        <w:numPr>
+          <w:ilvl w:val="0"/>
+          <w:numId w:val="9"/>
+        </w:numPr>
+      </w:pPr>
+      <w:r>
+        <w:rPr>
+          <w:b/>
+          <w:bCs/>
+        </w:rPr>
+        <w:t>12. Gün:</w:t>
       </w:r>
       <w:r>
         <w:t xml:space="preserve"> </w:t>
       </w:r>
-      <w:proofErr w:type="spellStart"/>
-      <w:r>
-        <w:t>Flutter</w:t>
-      </w:r>
-      <w:proofErr w:type="spellEnd"/>
-      <w:r>
-        <w:t xml:space="preserve"> SDK ve Android </w:t>
-      </w:r>
-      <w:proofErr w:type="spellStart"/>
-      <w:r>
-        <w:t>Studio</w:t>
-      </w:r>
-      <w:proofErr w:type="spellEnd"/>
-      <w:r>
-        <w:t xml:space="preserve"> ayarlarını yap. İlk "</w:t>
-      </w:r>
-      <w:proofErr w:type="spellStart"/>
-      <w:r>
-        <w:t>Hello</w:t>
-      </w:r>
-      <w:proofErr w:type="spellEnd"/>
-      <w:r>
-        <w:t xml:space="preserve"> World" projesini </w:t>
-      </w:r>
-      <w:proofErr w:type="spellStart"/>
-      <w:r>
-        <w:t>Xiaomi</w:t>
-      </w:r>
-      <w:proofErr w:type="spellEnd"/>
-      <w:r>
-        <w:t xml:space="preserve"> telefonunda çalıştır.</w:t>
-      </w:r>
-    </w:p>
-    <w:p>
-      <w:pPr>
-        <w:numPr>
-          <w:ilvl w:val="0"/>
-          <w:numId w:val="8"/>
-        </w:numPr>
-      </w:pPr>
-      <w:r>
-        <w:rPr>
-          <w:b/>
-          <w:bCs/>
-        </w:rPr>
-        <w:t>6. Gün:</w:t>
+      <w:r>
+        <w:rPr>
+          <w:b/>
+          <w:bCs/>
+        </w:rPr>
+        <w:t>Not Detay ve Silme:</w:t>
+      </w:r>
+      <w:r>
+        <w:t xml:space="preserve"> Listeden bir nota tıklandığında detayını göster ve bir "Çöp Kutusu" butonuyla silme işlemini yap.</w:t>
+      </w:r>
+    </w:p>
+    <w:p>
+      <w:pPr>
+        <w:numPr>
+          <w:ilvl w:val="0"/>
+          <w:numId w:val="9"/>
+        </w:numPr>
+      </w:pPr>
+      <w:r>
+        <w:rPr>
+          <w:b/>
+          <w:bCs/>
+        </w:rPr>
+        <w:t>13. Gün:</w:t>
       </w:r>
       <w:r>
         <w:t xml:space="preserve"> </w:t>
       </w:r>
-      <w:proofErr w:type="spellStart"/>
-      <w:r>
-        <w:t>Flutter</w:t>
-      </w:r>
-      <w:proofErr w:type="spellEnd"/>
-      <w:r>
-        <w:t xml:space="preserve"> UI: Login ve </w:t>
-      </w:r>
-      <w:proofErr w:type="spellStart"/>
-      <w:r>
-        <w:t>Register</w:t>
-      </w:r>
-      <w:proofErr w:type="spellEnd"/>
-      <w:r>
-        <w:t xml:space="preserve"> ekranlarının tasarımını yap (Sadece görsel, kodlama haftaya).</w:t>
-      </w:r>
-    </w:p>
-    <w:p>
-      <w:pPr>
-        <w:numPr>
-          <w:ilvl w:val="0"/>
-          <w:numId w:val="8"/>
-        </w:numPr>
-      </w:pPr>
-      <w:r>
-        <w:rPr>
-          <w:b/>
-          <w:bCs/>
-        </w:rPr>
-        <w:t>7. Gün:</w:t>
-      </w:r>
-      <w:r>
-        <w:t xml:space="preserve"> Haftalık Değerlendirme: </w:t>
-      </w:r>
-      <w:proofErr w:type="spellStart"/>
-      <w:r>
-        <w:t>Backend'deki</w:t>
-      </w:r>
-      <w:proofErr w:type="spellEnd"/>
-      <w:r>
-        <w:t xml:space="preserve"> tüm CRUD (Ekle/Sil/Güncelle) işlemlerinin </w:t>
-      </w:r>
-      <w:proofErr w:type="spellStart"/>
-      <w:r>
-        <w:t>Postman'de</w:t>
-      </w:r>
-      <w:proofErr w:type="spellEnd"/>
-      <w:r>
-        <w:t xml:space="preserve"> çalıştığından emin ol.</w:t>
-      </w:r>
-    </w:p>
-    <w:p>
-      <w:r>
-        <w:pict w14:anchorId="6307D69A">
-          <v:rect id="_x0000_i1054" style="width:0;height:1.5pt" o:hralign="center" o:hrstd="t" o:hr="t" fillcolor="#a0a0a0" stroked="f"/>
-        </w:pict>
-      </w:r>
-    </w:p>
-    <w:p>
-      <w:pPr>
-        <w:rPr>
-          <w:b/>
-          <w:bCs/>
-        </w:rPr>
-      </w:pPr>
-      <w:r>
-        <w:rPr>
-          <w:b/>
-          <w:bCs/>
-        </w:rPr>
-        <w:t>2. HAFTA: Mobil Uygulama ve API Bağlantısı</w:t>
-      </w:r>
-    </w:p>
-    <w:p>
-      <w:r>
-        <w:t>Bu hafta "kodun" "ekranla" buluştuğu hafta.</w:t>
+      <w:r>
+        <w:rPr>
+          <w:b/>
+          <w:bCs/>
+        </w:rPr>
+        <w:t>Hata Yönetimi:</w:t>
+      </w:r>
+      <w:r>
+        <w:t xml:space="preserve"> Yanlış şifre girildiğinde veya internet olmadığında kullanıcıya "SnackBar" ile uyarı göster.</w:t>
       </w:r>
     </w:p>
     <w:p>
@@ -2749,330 +2011,26 @@
           <w:b/>
           <w:bCs/>
         </w:rPr>
-        <w:t>8. Gün:</w:t>
+        <w:t>14. Gün:</w:t>
       </w:r>
       <w:r>
         <w:t xml:space="preserve"> </w:t>
       </w:r>
-      <w:proofErr w:type="spellStart"/>
-      <w:r>
-        <w:t>Flutter'da</w:t>
-      </w:r>
-      <w:proofErr w:type="spellEnd"/>
-      <w:r>
-        <w:t xml:space="preserve"> http paketini kur. Login ekranından Spring </w:t>
-      </w:r>
-      <w:proofErr w:type="spellStart"/>
-      <w:r>
-        <w:t>Boot'a</w:t>
-      </w:r>
-      <w:proofErr w:type="spellEnd"/>
-      <w:r>
-        <w:t xml:space="preserve"> istek at ve dönen </w:t>
-      </w:r>
-      <w:proofErr w:type="spellStart"/>
-      <w:r>
-        <w:t>Token'ı</w:t>
-      </w:r>
-      <w:proofErr w:type="spellEnd"/>
-      <w:r>
-        <w:t xml:space="preserve"> ekranda gör.</w:t>
-      </w:r>
-    </w:p>
-    <w:p>
-      <w:pPr>
-        <w:numPr>
-          <w:ilvl w:val="0"/>
-          <w:numId w:val="9"/>
-        </w:numPr>
-      </w:pPr>
-      <w:r>
-        <w:rPr>
-          <w:b/>
-          <w:bCs/>
-        </w:rPr>
-        <w:t>9. Gün:</w:t>
-      </w:r>
-      <w:r>
-        <w:t xml:space="preserve"> </w:t>
-      </w:r>
-      <w:proofErr w:type="spellStart"/>
-      <w:r>
-        <w:rPr>
-          <w:b/>
-          <w:bCs/>
-        </w:rPr>
-        <w:t>Token</w:t>
-      </w:r>
-      <w:proofErr w:type="spellEnd"/>
-      <w:r>
-        <w:rPr>
-          <w:b/>
-          <w:bCs/>
-        </w:rPr>
-        <w:t xml:space="preserve"> Saklama:</w:t>
-      </w:r>
-      <w:r>
-        <w:t xml:space="preserve"> </w:t>
-      </w:r>
-      <w:proofErr w:type="spellStart"/>
-      <w:r>
-        <w:t>shared_preferences</w:t>
-      </w:r>
-      <w:proofErr w:type="spellEnd"/>
-      <w:r>
-        <w:t xml:space="preserve"> kullanarak </w:t>
-      </w:r>
-      <w:proofErr w:type="spellStart"/>
-      <w:r>
-        <w:t>Token'ı</w:t>
-      </w:r>
-      <w:proofErr w:type="spellEnd"/>
-      <w:r>
-        <w:t xml:space="preserve"> telefon hafızasına kaydet. Uygulama açıldığında </w:t>
-      </w:r>
-      <w:proofErr w:type="spellStart"/>
-      <w:r>
-        <w:t>Token</w:t>
-      </w:r>
-      <w:proofErr w:type="spellEnd"/>
-      <w:r>
-        <w:t xml:space="preserve"> varsa direkt ana sayfaya yönlendir.</w:t>
-      </w:r>
-    </w:p>
-    <w:p>
-      <w:pPr>
-        <w:numPr>
-          <w:ilvl w:val="0"/>
-          <w:numId w:val="9"/>
-        </w:numPr>
-      </w:pPr>
-      <w:r>
-        <w:rPr>
-          <w:b/>
-          <w:bCs/>
-        </w:rPr>
-        <w:t>10. Gün:</w:t>
-      </w:r>
-      <w:r>
-        <w:t xml:space="preserve"> </w:t>
-      </w:r>
-      <w:r>
-        <w:rPr>
-          <w:b/>
-          <w:bCs/>
-        </w:rPr>
-        <w:t>Ana Sayfa (Listeleme):</w:t>
-      </w:r>
-      <w:r>
-        <w:t xml:space="preserve"> </w:t>
-      </w:r>
-      <w:proofErr w:type="spellStart"/>
-      <w:r>
-        <w:t>Backend'den</w:t>
-      </w:r>
-      <w:proofErr w:type="spellEnd"/>
-      <w:r>
-        <w:t xml:space="preserve"> gelen notları </w:t>
-      </w:r>
-      <w:proofErr w:type="spellStart"/>
-      <w:r>
-        <w:t>ListView</w:t>
-      </w:r>
-      <w:proofErr w:type="spellEnd"/>
-      <w:r>
-        <w:t xml:space="preserve"> içinde listele. Şık bir kart (</w:t>
-      </w:r>
-      <w:proofErr w:type="spellStart"/>
-      <w:r>
-        <w:t>Card</w:t>
-      </w:r>
-      <w:proofErr w:type="spellEnd"/>
-      <w:r>
-        <w:t>) tasarımı yap.</w:t>
-      </w:r>
-    </w:p>
-    <w:p>
-      <w:pPr>
-        <w:numPr>
-          <w:ilvl w:val="0"/>
-          <w:numId w:val="9"/>
-        </w:numPr>
-      </w:pPr>
-      <w:r>
-        <w:rPr>
-          <w:b/>
-          <w:bCs/>
-        </w:rPr>
-        <w:t>11. Gün:</w:t>
-      </w:r>
-      <w:r>
-        <w:t xml:space="preserve"> </w:t>
-      </w:r>
-      <w:r>
-        <w:rPr>
-          <w:b/>
-          <w:bCs/>
-        </w:rPr>
-        <w:t>Not Ekleme:</w:t>
-      </w:r>
-      <w:r>
-        <w:t xml:space="preserve"> </w:t>
-      </w:r>
-      <w:proofErr w:type="spellStart"/>
-      <w:r>
-        <w:t>Flutter'da</w:t>
-      </w:r>
-      <w:proofErr w:type="spellEnd"/>
-      <w:r>
-        <w:t xml:space="preserve"> bir "Yeni Not" sayfası yap. Başlık ve içeriği Spring </w:t>
-      </w:r>
-      <w:proofErr w:type="spellStart"/>
-      <w:r>
-        <w:t>Boot'a</w:t>
-      </w:r>
-      <w:proofErr w:type="spellEnd"/>
-      <w:r>
-        <w:t xml:space="preserve"> gönder.</w:t>
-      </w:r>
-    </w:p>
-    <w:p>
-      <w:pPr>
-        <w:numPr>
-          <w:ilvl w:val="0"/>
-          <w:numId w:val="9"/>
-        </w:numPr>
-      </w:pPr>
-      <w:r>
-        <w:rPr>
-          <w:b/>
-          <w:bCs/>
-        </w:rPr>
-        <w:t>12. Gün:</w:t>
-      </w:r>
-      <w:r>
-        <w:t xml:space="preserve"> </w:t>
-      </w:r>
-      <w:r>
-        <w:rPr>
-          <w:b/>
-          <w:bCs/>
-        </w:rPr>
-        <w:t>Not Detay ve Silme:</w:t>
-      </w:r>
-      <w:r>
-        <w:t xml:space="preserve"> Listeden bir nota tıklandığında detayını göster ve bir "Çöp Kutusu" butonuyla silme işlemini yap.</w:t>
-      </w:r>
-    </w:p>
-    <w:p>
-      <w:pPr>
-        <w:numPr>
-          <w:ilvl w:val="0"/>
-          <w:numId w:val="9"/>
-        </w:numPr>
-      </w:pPr>
-      <w:r>
-        <w:rPr>
-          <w:b/>
-          <w:bCs/>
-        </w:rPr>
-        <w:t>13. Gün:</w:t>
-      </w:r>
-      <w:r>
-        <w:t xml:space="preserve"> </w:t>
-      </w:r>
-      <w:r>
-        <w:rPr>
-          <w:b/>
-          <w:bCs/>
-        </w:rPr>
-        <w:t>Hata Yönetimi:</w:t>
-      </w:r>
-      <w:r>
-        <w:t xml:space="preserve"> Yanlış şifre girildiğinde veya internet olmadığında kullanıcıya "</w:t>
-      </w:r>
-      <w:proofErr w:type="spellStart"/>
-      <w:r>
-        <w:t>SnackBar</w:t>
-      </w:r>
-      <w:proofErr w:type="spellEnd"/>
-      <w:r>
-        <w:t>" ile uyarı göster.</w:t>
-      </w:r>
-    </w:p>
-    <w:p>
-      <w:pPr>
-        <w:numPr>
-          <w:ilvl w:val="0"/>
-          <w:numId w:val="9"/>
-        </w:numPr>
-      </w:pPr>
-      <w:r>
-        <w:rPr>
-          <w:b/>
-          <w:bCs/>
-        </w:rPr>
-        <w:t>14. Gün:</w:t>
-      </w:r>
-      <w:r>
-        <w:t xml:space="preserve"> </w:t>
-      </w:r>
-      <w:proofErr w:type="spellStart"/>
-      <w:r>
-        <w:rPr>
-          <w:b/>
-          <w:bCs/>
-        </w:rPr>
-        <w:t>Refactoring</w:t>
-      </w:r>
-      <w:proofErr w:type="spellEnd"/>
-      <w:r>
-        <w:rPr>
-          <w:b/>
-          <w:bCs/>
-        </w:rPr>
-        <w:t>:</w:t>
-      </w:r>
-      <w:r>
-        <w:t xml:space="preserve"> Kodları temizle. </w:t>
-      </w:r>
-      <w:proofErr w:type="spellStart"/>
-      <w:r>
-        <w:t>Backend</w:t>
-      </w:r>
-      <w:proofErr w:type="spellEnd"/>
-      <w:r>
-        <w:t xml:space="preserve"> ve </w:t>
-      </w:r>
-      <w:proofErr w:type="spellStart"/>
-      <w:r>
-        <w:t>Frontend</w:t>
-      </w:r>
-      <w:proofErr w:type="spellEnd"/>
-      <w:r>
-        <w:t xml:space="preserve"> arasındaki değişken isimlerinin (</w:t>
-      </w:r>
-      <w:proofErr w:type="spellStart"/>
-      <w:r>
-        <w:t>eMail</w:t>
-      </w:r>
-      <w:proofErr w:type="spellEnd"/>
-      <w:r>
-        <w:t xml:space="preserve">, </w:t>
-      </w:r>
-      <w:proofErr w:type="spellStart"/>
-      <w:r>
-        <w:t>title</w:t>
-      </w:r>
-      <w:proofErr w:type="spellEnd"/>
-      <w:r>
-        <w:t xml:space="preserve"> vb.) tam uyumlu olduğunu kontrol et.</w:t>
+      <w:r>
+        <w:rPr>
+          <w:b/>
+          <w:bCs/>
+        </w:rPr>
+        <w:t>Refactoring:</w:t>
+      </w:r>
+      <w:r>
+        <w:t xml:space="preserve"> Kodları temizle. Backend ve Frontend arasındaki değişken isimlerinin (eMail, title vb.) tam uyumlu olduğunu kontrol et.</w:t>
       </w:r>
     </w:p>
     <w:p>
       <w:r>
         <w:pict w14:anchorId="3EC0AAE3">
-          <v:rect id="_x0000_i1055" style="width:0;height:1.5pt" o:hralign="center" o:hrstd="t" o:hr="t" fillcolor="#a0a0a0" stroked="f"/>
+          <v:rect id="_x0000_i1037" style="width:0;height:1.5pt" o:hralign="center" o:hrstd="t" o:hr="t" fillcolor="#a0a0a0" stroked="f"/>
         </w:pict>
       </w:r>
     </w:p>
@@ -3114,37 +2072,12 @@
       <w:r>
         <w:t xml:space="preserve"> </w:t>
       </w:r>
-      <w:proofErr w:type="spellStart"/>
-      <w:r>
-        <w:rPr>
-          <w:b/>
-          <w:bCs/>
-        </w:rPr>
-        <w:t>Backend</w:t>
-      </w:r>
-      <w:proofErr w:type="spellEnd"/>
-      <w:r>
-        <w:rPr>
-          <w:b/>
-          <w:bCs/>
-        </w:rPr>
-        <w:t xml:space="preserve"> - </w:t>
-      </w:r>
-      <w:proofErr w:type="spellStart"/>
-      <w:r>
-        <w:rPr>
-          <w:b/>
-          <w:bCs/>
-        </w:rPr>
-        <w:t>GroupService</w:t>
-      </w:r>
-      <w:proofErr w:type="spellEnd"/>
-      <w:r>
-        <w:rPr>
-          <w:b/>
-          <w:bCs/>
-        </w:rPr>
-        <w:t>:</w:t>
+      <w:r>
+        <w:rPr>
+          <w:b/>
+          <w:bCs/>
+        </w:rPr>
+        <w:t>Backend - GroupService:</w:t>
       </w:r>
       <w:r>
         <w:t xml:space="preserve"> Kullanıcıların grup kurmasını sağlayacak metotları yaz.</w:t>
@@ -3167,72 +2100,43 @@
       <w:r>
         <w:t xml:space="preserve"> </w:t>
       </w:r>
-      <w:proofErr w:type="spellStart"/>
-      <w:r>
-        <w:rPr>
-          <w:b/>
-          <w:bCs/>
-        </w:rPr>
-        <w:t>Backend</w:t>
-      </w:r>
-      <w:proofErr w:type="spellEnd"/>
-      <w:r>
-        <w:rPr>
-          <w:b/>
-          <w:bCs/>
-        </w:rPr>
-        <w:t xml:space="preserve"> - </w:t>
-      </w:r>
-      <w:proofErr w:type="spellStart"/>
-      <w:r>
-        <w:rPr>
-          <w:b/>
-          <w:bCs/>
-        </w:rPr>
-        <w:t>Group</w:t>
-      </w:r>
-      <w:proofErr w:type="spellEnd"/>
-      <w:r>
-        <w:rPr>
-          <w:b/>
-          <w:bCs/>
-        </w:rPr>
+      <w:r>
+        <w:rPr>
+          <w:b/>
+          <w:bCs/>
+        </w:rPr>
+        <w:t>Backend - Group Assignment:</w:t>
+      </w:r>
+      <w:r>
+        <w:t xml:space="preserve"> Bir notun bir gruba nasıl atanacağını (page.setGroup(group)) kodla.</w:t>
+      </w:r>
+    </w:p>
+    <w:p>
+      <w:pPr>
+        <w:numPr>
+          <w:ilvl w:val="0"/>
+          <w:numId w:val="10"/>
+        </w:numPr>
+      </w:pPr>
+      <w:r>
+        <w:rPr>
+          <w:b/>
+          <w:bCs/>
+        </w:rPr>
+        <w:t>17. Gün:</w:t>
+      </w:r>
+      <w:r>
         <w:t xml:space="preserve"> </w:t>
       </w:r>
-      <w:proofErr w:type="spellStart"/>
-      <w:r>
-        <w:rPr>
-          <w:b/>
-          <w:bCs/>
-        </w:rPr>
-        <w:t>Assignment</w:t>
-      </w:r>
-      <w:proofErr w:type="spellEnd"/>
-      <w:r>
-        <w:rPr>
-          <w:b/>
-          <w:bCs/>
-        </w:rPr>
-        <w:t>:</w:t>
-      </w:r>
-      <w:r>
-        <w:t xml:space="preserve"> Bir notun bir gruba nasıl atanacağını (</w:t>
-      </w:r>
-      <w:proofErr w:type="spellStart"/>
-      <w:r>
-        <w:t>page.setGroup</w:t>
-      </w:r>
-      <w:proofErr w:type="spellEnd"/>
-      <w:r>
-        <w:t>(</w:t>
-      </w:r>
-      <w:proofErr w:type="spellStart"/>
-      <w:r>
-        <w:t>group</w:t>
-      </w:r>
-      <w:proofErr w:type="spellEnd"/>
-      <w:r>
-        <w:t>)) kodla.</w:t>
+      <w:r>
+        <w:rPr>
+          <w:b/>
+          <w:bCs/>
+        </w:rPr>
+        <w:t>Flutter - Grup Ekranı:</w:t>
+      </w:r>
+      <w:r>
+        <w:t xml:space="preserve"> Kullanıcının dahil olduğu grupları listele.</w:t>
       </w:r>
     </w:p>
     <w:p>
@@ -3247,29 +2151,20 @@
           <w:b/>
           <w:bCs/>
         </w:rPr>
-        <w:t>17. Gün:</w:t>
+        <w:t>18. Gün:</w:t>
       </w:r>
       <w:r>
         <w:t xml:space="preserve"> </w:t>
       </w:r>
-      <w:proofErr w:type="spellStart"/>
-      <w:r>
-        <w:rPr>
-          <w:b/>
-          <w:bCs/>
-        </w:rPr>
-        <w:t>Flutter</w:t>
-      </w:r>
-      <w:proofErr w:type="spellEnd"/>
-      <w:r>
-        <w:rPr>
-          <w:b/>
-          <w:bCs/>
-        </w:rPr>
-        <w:t xml:space="preserve"> - Grup Ekranı:</w:t>
-      </w:r>
-      <w:r>
-        <w:t xml:space="preserve"> Kullanıcının dahil olduğu grupları listele.</w:t>
+      <w:r>
+        <w:rPr>
+          <w:b/>
+          <w:bCs/>
+        </w:rPr>
+        <w:t>Grup Notları:</w:t>
+      </w:r>
+      <w:r>
+        <w:t xml:space="preserve"> Bir gruba tıklandığında o gruba ait ortak notları getiren ekranı yap.</w:t>
       </w:r>
     </w:p>
     <w:p>
@@ -3284,7 +2179,7 @@
           <w:b/>
           <w:bCs/>
         </w:rPr>
-        <w:t>18. Gün:</w:t>
+        <w:t>19. Gün:</w:t>
       </w:r>
       <w:r>
         <w:t xml:space="preserve"> </w:t>
@@ -3294,10 +2189,10 @@
           <w:b/>
           <w:bCs/>
         </w:rPr>
-        <w:t>Grup Notları:</w:t>
-      </w:r>
-      <w:r>
-        <w:t xml:space="preserve"> Bir gruba tıklandığında o gruba ait ortak notları getiren ekranı yap.</w:t>
+        <w:t>UI/UX İyileştirme:</w:t>
+      </w:r>
+      <w:r>
+        <w:t xml:space="preserve"> Uygulamanın renklerini düzenle, bir logo ekle ve açılış ekranı (Splash Screen) yap.</w:t>
       </w:r>
     </w:p>
     <w:p>
@@ -3312,7 +2207,7 @@
           <w:b/>
           <w:bCs/>
         </w:rPr>
-        <w:t>19. Gün:</w:t>
+        <w:t>20. Gün:</w:t>
       </w:r>
       <w:r>
         <w:t xml:space="preserve"> </w:t>
@@ -3322,105 +2217,44 @@
           <w:b/>
           <w:bCs/>
         </w:rPr>
-        <w:t>UI/UX İyileştirme:</w:t>
-      </w:r>
-      <w:r>
-        <w:t xml:space="preserve"> Uygulamanın renklerini düzenle, bir logo ekle ve açılış ekranı (</w:t>
-      </w:r>
-      <w:proofErr w:type="spellStart"/>
-      <w:r>
-        <w:t>Splash</w:t>
-      </w:r>
-      <w:proofErr w:type="spellEnd"/>
+        <w:t>Full Test:</w:t>
+      </w:r>
+      <w:r>
+        <w:t xml:space="preserve"> Kayıt ol -&gt; Giriş yap -&gt; Not ekle -&gt; Grup kur -&gt; Ortak not paylaş. Tüm akışı telefonda test et.</w:t>
+      </w:r>
+    </w:p>
+    <w:p>
+      <w:pPr>
+        <w:numPr>
+          <w:ilvl w:val="0"/>
+          <w:numId w:val="10"/>
+        </w:numPr>
+      </w:pPr>
+      <w:r>
+        <w:rPr>
+          <w:b/>
+          <w:bCs/>
+        </w:rPr>
+        <w:t>21. Gün:</w:t>
+      </w:r>
       <w:r>
         <w:t xml:space="preserve"> </w:t>
       </w:r>
-      <w:proofErr w:type="spellStart"/>
-      <w:r>
-        <w:t>Screen</w:t>
-      </w:r>
-      <w:proofErr w:type="spellEnd"/>
-      <w:r>
-        <w:t>) yap.</w:t>
-      </w:r>
-    </w:p>
-    <w:p>
-      <w:pPr>
-        <w:numPr>
-          <w:ilvl w:val="0"/>
-          <w:numId w:val="10"/>
-        </w:numPr>
-      </w:pPr>
-      <w:r>
-        <w:rPr>
-          <w:b/>
-          <w:bCs/>
-        </w:rPr>
-        <w:t>20. Gün:</w:t>
-      </w:r>
-      <w:r>
-        <w:t xml:space="preserve"> </w:t>
-      </w:r>
-      <w:r>
-        <w:rPr>
-          <w:b/>
-          <w:bCs/>
-        </w:rPr>
-        <w:t>Full Test:</w:t>
-      </w:r>
-      <w:r>
-        <w:t xml:space="preserve"> Kayıt ol -&gt; Giriş yap -&gt; Not ekle -&gt; Grup kur -&gt; Ortak not paylaş. Tüm akışı telefonda test et.</w:t>
-      </w:r>
-    </w:p>
-    <w:p>
-      <w:pPr>
-        <w:numPr>
-          <w:ilvl w:val="0"/>
-          <w:numId w:val="10"/>
-        </w:numPr>
-      </w:pPr>
-      <w:r>
-        <w:rPr>
-          <w:b/>
-          <w:bCs/>
-        </w:rPr>
-        <w:t>21. Gün:</w:t>
-      </w:r>
-      <w:r>
-        <w:t xml:space="preserve"> </w:t>
-      </w:r>
-      <w:proofErr w:type="spellStart"/>
-      <w:r>
-        <w:rPr>
-          <w:b/>
-          <w:bCs/>
-        </w:rPr>
-        <w:t>Release</w:t>
-      </w:r>
-      <w:proofErr w:type="spellEnd"/>
-      <w:r>
-        <w:rPr>
-          <w:b/>
-          <w:bCs/>
-        </w:rPr>
-        <w:t>:</w:t>
-      </w:r>
-      <w:r>
-        <w:t xml:space="preserve"> Uygulamanın </w:t>
-      </w:r>
-      <w:proofErr w:type="spellStart"/>
-      <w:r>
-        <w:t>APK'sını</w:t>
-      </w:r>
-      <w:proofErr w:type="spellEnd"/>
-      <w:r>
-        <w:t xml:space="preserve"> al ve bir arkadaşının telefonuna kurup dene!</w:t>
+      <w:r>
+        <w:rPr>
+          <w:b/>
+          <w:bCs/>
+        </w:rPr>
+        <w:t>Release:</w:t>
+      </w:r>
+      <w:r>
+        <w:t xml:space="preserve"> Uygulamanın APK'sını al ve bir arkadaşının telefonuna kurup dene!</w:t>
       </w:r>
     </w:p>
     <w:p>
       <w:r>
         <w:pict w14:anchorId="0068913F">
-          <v:rect id="_x0000_i1056" style="width:0;height:1.5pt" o:hralign="center" o:hrstd="t" o:hr="t" fillcolor="#a0a0a0" stroked="f"/>
+          <v:rect id="_x0000_i1038" style="width:0;height:1.5pt" o:hralign="center" o:hrstd="t" o:hr="t" fillcolor="#a0a0a0" stroked="f"/>
         </w:pict>
       </w:r>
     </w:p>
@@ -3446,56 +2280,15 @@
           <w:numId w:val="11"/>
         </w:numPr>
       </w:pPr>
-      <w:proofErr w:type="spellStart"/>
-      <w:r>
-        <w:rPr>
-          <w:b/>
-          <w:bCs/>
-        </w:rPr>
-        <w:t>Backend</w:t>
-      </w:r>
-      <w:proofErr w:type="spellEnd"/>
-      <w:r>
-        <w:rPr>
-          <w:b/>
-          <w:bCs/>
-        </w:rPr>
-        <w:t xml:space="preserve"> Önce Gelir:</w:t>
-      </w:r>
-      <w:r>
-        <w:t xml:space="preserve"> </w:t>
-      </w:r>
-      <w:proofErr w:type="spellStart"/>
-      <w:r>
-        <w:t>Backend'de</w:t>
-      </w:r>
-      <w:proofErr w:type="spellEnd"/>
-      <w:r>
-        <w:t xml:space="preserve"> bir özellik (</w:t>
-      </w:r>
-      <w:proofErr w:type="spellStart"/>
-      <w:r>
-        <w:t>örn</w:t>
-      </w:r>
-      <w:proofErr w:type="spellEnd"/>
-      <w:r>
-        <w:t xml:space="preserve">: silme) çalışmıyorsa </w:t>
-      </w:r>
-      <w:proofErr w:type="spellStart"/>
-      <w:r>
-        <w:t>Flutter'da</w:t>
-      </w:r>
-      <w:proofErr w:type="spellEnd"/>
-      <w:r>
-        <w:t xml:space="preserve"> onu kodlamaya çalışma. Önce </w:t>
-      </w:r>
-      <w:proofErr w:type="spellStart"/>
-      <w:r>
-        <w:t>Postman'de</w:t>
-      </w:r>
-      <w:proofErr w:type="spellEnd"/>
-      <w:r>
-        <w:t xml:space="preserve"> gör.</w:t>
+      <w:r>
+        <w:rPr>
+          <w:b/>
+          <w:bCs/>
+        </w:rPr>
+        <w:t>Backend Önce Gelir:</w:t>
+      </w:r>
+      <w:r>
+        <w:t xml:space="preserve"> Backend'de bir özellik (örn: silme) çalışmıyorsa Flutter'da onu kodlamaya çalışma. Önce Postman'de gör.</w:t>
       </w:r>
     </w:p>
     <w:p>
@@ -3531,51 +2324,26 @@
         <w:t>Hata Almaktan Korkma:</w:t>
       </w:r>
       <w:r>
-        <w:t xml:space="preserve"> </w:t>
-      </w:r>
-      <w:proofErr w:type="spellStart"/>
-      <w:r>
-        <w:t>Xiaomi</w:t>
-      </w:r>
-      <w:proofErr w:type="spellEnd"/>
-      <w:r>
-        <w:t xml:space="preserve"> telefonunda "</w:t>
-      </w:r>
-      <w:proofErr w:type="spellStart"/>
-      <w:r>
-        <w:t>Install</w:t>
-      </w:r>
-      <w:proofErr w:type="spellEnd"/>
-      <w:r>
-        <w:t xml:space="preserve"> </w:t>
-      </w:r>
-      <w:proofErr w:type="spellStart"/>
-      <w:r>
-        <w:t>via</w:t>
-      </w:r>
-      <w:proofErr w:type="spellEnd"/>
-      <w:r>
-        <w:t xml:space="preserve"> USB" hatası alırsan veya </w:t>
-      </w:r>
-      <w:proofErr w:type="spellStart"/>
-      <w:r>
-        <w:t>Spring'de</w:t>
-      </w:r>
-      <w:proofErr w:type="spellEnd"/>
-      <w:r>
-        <w:t xml:space="preserve"> "403 </w:t>
-      </w:r>
-      <w:proofErr w:type="spellStart"/>
-      <w:r>
-        <w:t>Forbidden</w:t>
-      </w:r>
-      <w:proofErr w:type="spellEnd"/>
-      <w:r>
-        <w:t>" görürsen durma, o hatayı çözmek sana en büyük tecrübeyi katacak.</w:t>
+        <w:t xml:space="preserve"> Xiaomi telefonunda "Install via USB" hatası alırsan veya Spring'de "403 Forbidden" görürsen durma, o hatayı çözmek sana en büyük tecrübeyi katacak.</w:t>
       </w:r>
     </w:p>
     <w:p/>
-    <w:p/>
+    <w:p>
+      <w:r>
+        <w:br w:type="page"/>
+      </w:r>
+    </w:p>
+    <w:p>
+      <w:r>
+        <w:lastRenderedPageBreak/>
+        <w:t>19.04.2026 – group service/controller yapısı kurulduktan sonra page işlemlerini düzenle/göz at(request response yapısı),bir notun gruplu veya grupsuz olacağı durumlarında ayrı fonksiyonmu kullanılacak karar ver.</w:t>
+      </w:r>
+    </w:p>
+    <w:p>
+      <w:r>
+        <w:t>Mevcut controllerlar çalışıyor.</w:t>
+      </w:r>
+    </w:p>
     <w:sectPr>
       <w:pgSz w:w="11906" w:h="16838"/>
       <w:pgMar w:top="1417" w:right="1417" w:bottom="1417" w:left="1417" w:header="708" w:footer="708" w:gutter="0"/>
@@ -5758,6 +4526,7 @@
   <w:style w:type="character" w:default="1" w:styleId="VarsaylanParagrafYazTipi">
     <w:name w:val="Default Paragraph Font"/>
     <w:uiPriority w:val="1"/>
+    <w:semiHidden/>
     <w:unhideWhenUsed/>
   </w:style>
   <w:style w:type="table" w:default="1" w:styleId="NormalTablo">

</xml_diff>

<commit_message>
Add WebSecurityCustomizer bean to configure ignored request matchers
</commit_message>
<xml_diff>
--- a/Rapor.docx
+++ b/Rapor.docx
@@ -2342,6 +2342,13 @@
     <w:p>
       <w:r>
         <w:t>Mevcut controllerlar çalışıyor.</w:t>
+      </w:r>
+    </w:p>
+    <w:p/>
+    <w:p/>
+    <w:p>
+      <w:r>
+        <w:t>GlobalexceptionHandler a genel ayar çek,</w:t>
       </w:r>
     </w:p>
     <w:sectPr>

</xml_diff>

<commit_message>
Refactor Page update methods to use PageRequest DTO instead of PageResponse
</commit_message>
<xml_diff>
--- a/Rapor.docx
+++ b/Rapor.docx
@@ -22,12 +22,52 @@
           <w:b/>
           <w:bCs/>
         </w:rPr>
-        <w:t xml:space="preserve"> NoteP: Backend Proje Mimari Raporu</w:t>
-      </w:r>
-    </w:p>
-    <w:p>
-      <w:r>
-        <w:t xml:space="preserve">Bu proje; Java 21 ve Spring Boot 4 kullanılarak geliştirilen, mobil uygulama odaklı, </w:t>
+        <w:t xml:space="preserve"> </w:t>
+      </w:r>
+      <w:proofErr w:type="spellStart"/>
+      <w:r>
+        <w:rPr>
+          <w:b/>
+          <w:bCs/>
+        </w:rPr>
+        <w:t>NoteP</w:t>
+      </w:r>
+      <w:proofErr w:type="spellEnd"/>
+      <w:r>
+        <w:rPr>
+          <w:b/>
+          <w:bCs/>
+        </w:rPr>
+        <w:t xml:space="preserve">: </w:t>
+      </w:r>
+      <w:proofErr w:type="spellStart"/>
+      <w:r>
+        <w:rPr>
+          <w:b/>
+          <w:bCs/>
+        </w:rPr>
+        <w:t>Backend</w:t>
+      </w:r>
+      <w:proofErr w:type="spellEnd"/>
+      <w:r>
+        <w:rPr>
+          <w:b/>
+          <w:bCs/>
+        </w:rPr>
+        <w:t xml:space="preserve"> Proje Mimari Raporu</w:t>
+      </w:r>
+    </w:p>
+    <w:p>
+      <w:r>
+        <w:t xml:space="preserve">Bu proje; Java 21 ve Spring </w:t>
+      </w:r>
+      <w:proofErr w:type="spellStart"/>
+      <w:r>
+        <w:t>Boot</w:t>
+      </w:r>
+      <w:proofErr w:type="spellEnd"/>
+      <w:r>
+        <w:t xml:space="preserve"> 4 kullanılarak geliştirilen, mobil uygulama odaklı, </w:t>
       </w:r>
       <w:r>
         <w:rPr>
@@ -88,7 +128,15 @@
         <w:t>Framework:</w:t>
       </w:r>
       <w:r>
-        <w:t xml:space="preserve"> Spring Boot 4 (Security, Data JPA, Web)</w:t>
+        <w:t xml:space="preserve"> Spring </w:t>
+      </w:r>
+      <w:proofErr w:type="spellStart"/>
+      <w:r>
+        <w:t>Boot</w:t>
+      </w:r>
+      <w:proofErr w:type="spellEnd"/>
+      <w:r>
+        <w:t xml:space="preserve"> 4 (Security, Data JPA, Web)</w:t>
       </w:r>
     </w:p>
     <w:p>
@@ -98,12 +146,21 @@
           <w:numId w:val="1"/>
         </w:numPr>
       </w:pPr>
-      <w:r>
-        <w:rPr>
-          <w:b/>
-          <w:bCs/>
-        </w:rPr>
-        <w:t>Veritabanı:</w:t>
+      <w:proofErr w:type="spellStart"/>
+      <w:r>
+        <w:rPr>
+          <w:b/>
+          <w:bCs/>
+        </w:rPr>
+        <w:t>Veritabanı</w:t>
+      </w:r>
+      <w:proofErr w:type="spellEnd"/>
+      <w:r>
+        <w:rPr>
+          <w:b/>
+          <w:bCs/>
+        </w:rPr>
+        <w:t>:</w:t>
       </w:r>
       <w:r>
         <w:t xml:space="preserve"> MySQL (İlişkisel veri saklama)</w:t>
@@ -124,7 +181,15 @@
         <w:t>Güvenlik:</w:t>
       </w:r>
       <w:r>
-        <w:t xml:space="preserve"> Spring Security + JJWT 0.12.5 (Token tabanlı doğrulama)</w:t>
+        <w:t xml:space="preserve"> Spring Security + JJWT 0.12.5 (</w:t>
+      </w:r>
+      <w:proofErr w:type="spellStart"/>
+      <w:r>
+        <w:t>Token</w:t>
+      </w:r>
+      <w:proofErr w:type="spellEnd"/>
+      <w:r>
+        <w:t xml:space="preserve"> tabanlı doğrulama)</w:t>
       </w:r>
     </w:p>
     <w:p>
@@ -142,7 +207,23 @@
         <w:t>Araçlar:</w:t>
       </w:r>
       <w:r>
-        <w:t xml:space="preserve"> Lombok (Sade kod), MapStruct (DTO dönüşümü)</w:t>
+        <w:t xml:space="preserve"> </w:t>
+      </w:r>
+      <w:proofErr w:type="spellStart"/>
+      <w:r>
+        <w:t>Lombok</w:t>
+      </w:r>
+      <w:proofErr w:type="spellEnd"/>
+      <w:r>
+        <w:t xml:space="preserve"> (Sade kod), </w:t>
+      </w:r>
+      <w:proofErr w:type="spellStart"/>
+      <w:r>
+        <w:t>MapStruct</w:t>
+      </w:r>
+      <w:proofErr w:type="spellEnd"/>
+      <w:r>
+        <w:t xml:space="preserve"> (DTO dönüşümü)</w:t>
       </w:r>
     </w:p>
     <w:p>
@@ -164,7 +245,23 @@
           <w:b/>
           <w:bCs/>
         </w:rPr>
-        <w:t>2. Proje Akış Şeması (Diagram)</w:t>
+        <w:t>2. Proje Akış Şeması (</w:t>
+      </w:r>
+      <w:proofErr w:type="spellStart"/>
+      <w:r>
+        <w:rPr>
+          <w:b/>
+          <w:bCs/>
+        </w:rPr>
+        <w:t>Diagram</w:t>
+      </w:r>
+      <w:proofErr w:type="spellEnd"/>
+      <w:r>
+        <w:rPr>
+          <w:b/>
+          <w:bCs/>
+        </w:rPr>
+        <w:t>)</w:t>
       </w:r>
     </w:p>
     <w:p>
@@ -282,13 +379,31 @@
             <w:hideMark/>
           </w:tcPr>
           <w:p>
+            <w:proofErr w:type="spellStart"/>
             <w:r>
               <w:rPr>
                 <w:b/>
                 <w:bCs/>
               </w:rPr>
-              <w:t>Config/SecurityConfig</w:t>
+              <w:t>Config</w:t>
             </w:r>
+            <w:proofErr w:type="spellEnd"/>
+            <w:r>
+              <w:rPr>
+                <w:b/>
+                <w:bCs/>
+              </w:rPr>
+              <w:t>/</w:t>
+            </w:r>
+            <w:proofErr w:type="spellStart"/>
+            <w:r>
+              <w:rPr>
+                <w:b/>
+                <w:bCs/>
+              </w:rPr>
+              <w:t>SecurityConfig</w:t>
+            </w:r>
+            <w:proofErr w:type="spellEnd"/>
           </w:p>
         </w:tc>
         <w:tc>
@@ -327,13 +442,31 @@
             <w:hideMark/>
           </w:tcPr>
           <w:p>
+            <w:proofErr w:type="spellStart"/>
             <w:r>
               <w:rPr>
                 <w:b/>
                 <w:bCs/>
               </w:rPr>
-              <w:t>Config/JwtUtil</w:t>
+              <w:t>Config</w:t>
             </w:r>
+            <w:proofErr w:type="spellEnd"/>
+            <w:r>
+              <w:rPr>
+                <w:b/>
+                <w:bCs/>
+              </w:rPr>
+              <w:t>/</w:t>
+            </w:r>
+            <w:proofErr w:type="spellStart"/>
+            <w:r>
+              <w:rPr>
+                <w:b/>
+                <w:bCs/>
+              </w:rPr>
+              <w:t>JwtUtil</w:t>
+            </w:r>
+            <w:proofErr w:type="spellEnd"/>
           </w:p>
         </w:tc>
         <w:tc>
@@ -350,7 +483,15 @@
           </w:tcPr>
           <w:p>
             <w:r>
-              <w:t>Dijital anahtarı (Token) basan, okuyan ve geçerliliğini kontrol eden makine.</w:t>
+              <w:t>Dijital anahtarı (</w:t>
+            </w:r>
+            <w:proofErr w:type="spellStart"/>
+            <w:r>
+              <w:t>Token</w:t>
+            </w:r>
+            <w:proofErr w:type="spellEnd"/>
+            <w:r>
+              <w:t>) basan, okuyan ve geçerliliğini kontrol eden makine.</w:t>
             </w:r>
           </w:p>
         </w:tc>
@@ -372,13 +513,31 @@
             <w:hideMark/>
           </w:tcPr>
           <w:p>
+            <w:proofErr w:type="spellStart"/>
             <w:r>
               <w:rPr>
                 <w:b/>
                 <w:bCs/>
               </w:rPr>
-              <w:t>Config/JwtFilter</w:t>
+              <w:t>Config</w:t>
             </w:r>
+            <w:proofErr w:type="spellEnd"/>
+            <w:r>
+              <w:rPr>
+                <w:b/>
+                <w:bCs/>
+              </w:rPr>
+              <w:t>/</w:t>
+            </w:r>
+            <w:proofErr w:type="spellStart"/>
+            <w:r>
+              <w:rPr>
+                <w:b/>
+                <w:bCs/>
+              </w:rPr>
+              <w:t>JwtFilter</w:t>
+            </w:r>
+            <w:proofErr w:type="spellEnd"/>
           </w:p>
         </w:tc>
         <w:tc>
@@ -395,7 +554,15 @@
           </w:tcPr>
           <w:p>
             <w:r>
-              <w:t>Kapıdaki bekçi. Gelen her isteği durdurur, içindeki token'ı kontrol eder.</w:t>
+              <w:t xml:space="preserve">Kapıdaki bekçi. Gelen her isteği durdurur, içindeki </w:t>
+            </w:r>
+            <w:proofErr w:type="spellStart"/>
+            <w:r>
+              <w:t>token'ı</w:t>
+            </w:r>
+            <w:proofErr w:type="spellEnd"/>
+            <w:r>
+              <w:t xml:space="preserve"> kontrol eder.</w:t>
             </w:r>
           </w:p>
         </w:tc>
@@ -417,13 +584,31 @@
             <w:hideMark/>
           </w:tcPr>
           <w:p>
+            <w:proofErr w:type="spellStart"/>
             <w:r>
               <w:rPr>
                 <w:b/>
                 <w:bCs/>
               </w:rPr>
-              <w:t>Entities/User &amp; Page</w:t>
+              <w:t>Entities</w:t>
             </w:r>
+            <w:proofErr w:type="spellEnd"/>
+            <w:r>
+              <w:rPr>
+                <w:b/>
+                <w:bCs/>
+              </w:rPr>
+              <w:t xml:space="preserve">/User &amp; </w:t>
+            </w:r>
+            <w:proofErr w:type="spellStart"/>
+            <w:r>
+              <w:rPr>
+                <w:b/>
+                <w:bCs/>
+              </w:rPr>
+              <w:t>Page</w:t>
+            </w:r>
+            <w:proofErr w:type="spellEnd"/>
           </w:p>
         </w:tc>
         <w:tc>
@@ -439,8 +624,21 @@
             <w:hideMark/>
           </w:tcPr>
           <w:p>
+            <w:proofErr w:type="spellStart"/>
             <w:r>
-              <w:t xml:space="preserve">Veritabanı tablolarımız. User (Kullanıcı) ve Page (Notlar) arasında </w:t>
+              <w:t>Veritabanı</w:t>
+            </w:r>
+            <w:proofErr w:type="spellEnd"/>
+            <w:r>
+              <w:t xml:space="preserve"> tablolarımız. User (Kullanıcı) ve </w:t>
+            </w:r>
+            <w:proofErr w:type="spellStart"/>
+            <w:r>
+              <w:t>Page</w:t>
+            </w:r>
+            <w:proofErr w:type="spellEnd"/>
+            <w:r>
+              <w:t xml:space="preserve"> (Notlar) arasında </w:t>
             </w:r>
             <w:r>
               <w:rPr>
@@ -472,12 +670,21 @@
             <w:hideMark/>
           </w:tcPr>
           <w:p>
+            <w:proofErr w:type="spellStart"/>
             <w:r>
               <w:rPr>
                 <w:b/>
                 <w:bCs/>
               </w:rPr>
-              <w:t>DTOs/</w:t>
+              <w:t>DTOs</w:t>
+            </w:r>
+            <w:proofErr w:type="spellEnd"/>
+            <w:r>
+              <w:rPr>
+                <w:b/>
+                <w:bCs/>
+              </w:rPr>
+              <w:t>/</w:t>
             </w:r>
           </w:p>
         </w:tc>
@@ -495,7 +702,31 @@
           </w:tcPr>
           <w:p>
             <w:r>
-              <w:t>Mobil uygulama ile backend arasında taşınan "veri paketleri" (LoginRequest, UserResponse vb.).</w:t>
+              <w:t xml:space="preserve">Mobil uygulama ile </w:t>
+            </w:r>
+            <w:proofErr w:type="spellStart"/>
+            <w:r>
+              <w:t>backend</w:t>
+            </w:r>
+            <w:proofErr w:type="spellEnd"/>
+            <w:r>
+              <w:t xml:space="preserve"> arasında taşınan "veri paketleri" (</w:t>
+            </w:r>
+            <w:proofErr w:type="spellStart"/>
+            <w:r>
+              <w:t>LoginRequest</w:t>
+            </w:r>
+            <w:proofErr w:type="spellEnd"/>
+            <w:r>
+              <w:t xml:space="preserve">, </w:t>
+            </w:r>
+            <w:proofErr w:type="spellStart"/>
+            <w:r>
+              <w:t>UserResponse</w:t>
+            </w:r>
+            <w:proofErr w:type="spellEnd"/>
+            <w:r>
+              <w:t xml:space="preserve"> vb.).</w:t>
             </w:r>
           </w:p>
         </w:tc>
@@ -540,7 +771,23 @@
           </w:tcPr>
           <w:p>
             <w:r>
-              <w:t>İşin "mutfağı". Şifre kontrolü, token üretimi ve veritabanı kayıt mantığı burada.</w:t>
+              <w:t xml:space="preserve">İşin "mutfağı". Şifre kontrolü, </w:t>
+            </w:r>
+            <w:proofErr w:type="spellStart"/>
+            <w:r>
+              <w:t>token</w:t>
+            </w:r>
+            <w:proofErr w:type="spellEnd"/>
+            <w:r>
+              <w:t xml:space="preserve"> üretimi ve </w:t>
+            </w:r>
+            <w:proofErr w:type="spellStart"/>
+            <w:r>
+              <w:t>veritabanı</w:t>
+            </w:r>
+            <w:proofErr w:type="spellEnd"/>
+            <w:r>
+              <w:t xml:space="preserve"> kayıt mantığı burada.</w:t>
             </w:r>
           </w:p>
         </w:tc>
@@ -586,6 +833,7 @@
       <w:r>
         <w:t xml:space="preserve"> Kullanıcı şifresi </w:t>
       </w:r>
+      <w:proofErr w:type="spellStart"/>
       <w:r>
         <w:rPr>
           <w:b/>
@@ -593,8 +841,17 @@
         </w:rPr>
         <w:t>BCrypt</w:t>
       </w:r>
-      <w:r>
-        <w:t xml:space="preserve"> ile karartılarak kaydedilir (Veritabanında bile okunamaz).</w:t>
+      <w:proofErr w:type="spellEnd"/>
+      <w:r>
+        <w:t xml:space="preserve"> ile karartılarak kaydedilir (</w:t>
+      </w:r>
+      <w:proofErr w:type="spellStart"/>
+      <w:r>
+        <w:t>Veritabanında</w:t>
+      </w:r>
+      <w:proofErr w:type="spellEnd"/>
+      <w:r>
+        <w:t xml:space="preserve"> bile okunamaz).</w:t>
       </w:r>
     </w:p>
     <w:p>
@@ -612,15 +869,32 @@
         <w:t>Giriş:</w:t>
       </w:r>
       <w:r>
-        <w:t xml:space="preserve"> Kullanıcı email/şifre gönderir. Bilgiler doğruysa ona 10 saat geçerli bir </w:t>
-      </w:r>
-      <w:r>
-        <w:rPr>
-          <w:b/>
-          <w:bCs/>
-        </w:rPr>
-        <w:t>JWT Token</w:t>
-      </w:r>
+        <w:t xml:space="preserve"> Kullanıcı </w:t>
+      </w:r>
+      <w:proofErr w:type="spellStart"/>
+      <w:r>
+        <w:t>email</w:t>
+      </w:r>
+      <w:proofErr w:type="spellEnd"/>
+      <w:r>
+        <w:t xml:space="preserve">/şifre gönderir. Bilgiler doğruysa ona 10 saat geçerli bir </w:t>
+      </w:r>
+      <w:r>
+        <w:rPr>
+          <w:b/>
+          <w:bCs/>
+        </w:rPr>
+        <w:t xml:space="preserve">JWT </w:t>
+      </w:r>
+      <w:proofErr w:type="spellStart"/>
+      <w:r>
+        <w:rPr>
+          <w:b/>
+          <w:bCs/>
+        </w:rPr>
+        <w:t>Token</w:t>
+      </w:r>
+      <w:proofErr w:type="spellEnd"/>
       <w:r>
         <w:t xml:space="preserve"> verilir.</w:t>
       </w:r>
@@ -640,7 +914,15 @@
         <w:t>İstek:</w:t>
       </w:r>
       <w:r>
-        <w:t xml:space="preserve"> Kullanıcı "Notlarımı getir" dediğinde, bu token'ı isteğin başına ekler.</w:t>
+        <w:t xml:space="preserve"> Kullanıcı "Notlarımı getir" dediğinde, bu </w:t>
+      </w:r>
+      <w:proofErr w:type="spellStart"/>
+      <w:r>
+        <w:t>token'ı</w:t>
+      </w:r>
+      <w:proofErr w:type="spellEnd"/>
+      <w:r>
+        <w:t xml:space="preserve"> isteğin başına ekler.</w:t>
       </w:r>
     </w:p>
     <w:p>
@@ -658,7 +940,39 @@
         <w:t>Doğrulama:</w:t>
       </w:r>
       <w:r>
-        <w:t xml:space="preserve"> JwtFilter araya girer, token'ı JwtUtil ile doğrular ve Spring Security'ye "Bu kişi güvenli" der.</w:t>
+        <w:t xml:space="preserve"> </w:t>
+      </w:r>
+      <w:proofErr w:type="spellStart"/>
+      <w:r>
+        <w:t>JwtFilter</w:t>
+      </w:r>
+      <w:proofErr w:type="spellEnd"/>
+      <w:r>
+        <w:t xml:space="preserve"> araya girer, </w:t>
+      </w:r>
+      <w:proofErr w:type="spellStart"/>
+      <w:r>
+        <w:t>token'ı</w:t>
+      </w:r>
+      <w:proofErr w:type="spellEnd"/>
+      <w:r>
+        <w:t xml:space="preserve"> </w:t>
+      </w:r>
+      <w:proofErr w:type="spellStart"/>
+      <w:r>
+        <w:t>JwtUtil</w:t>
+      </w:r>
+      <w:proofErr w:type="spellEnd"/>
+      <w:r>
+        <w:t xml:space="preserve"> ile doğrular ve Spring </w:t>
+      </w:r>
+      <w:proofErr w:type="spellStart"/>
+      <w:r>
+        <w:t>Security'ye</w:t>
+      </w:r>
+      <w:proofErr w:type="spellEnd"/>
+      <w:r>
+        <w:t xml:space="preserve"> "Bu kişi güvenli" der.</w:t>
       </w:r>
     </w:p>
     <w:p>
@@ -685,7 +999,15 @@
     </w:p>
     <w:p>
       <w:r>
-        <w:t>Şu an altyapı bitti, artık iş mantığına (Business Logic) geçmeye hazırız:</w:t>
+        <w:t xml:space="preserve">Şu an altyapı bitti, artık iş mantığına (Business </w:t>
+      </w:r>
+      <w:proofErr w:type="spellStart"/>
+      <w:r>
+        <w:t>Logic</w:t>
+      </w:r>
+      <w:proofErr w:type="spellEnd"/>
+      <w:r>
+        <w:t>) geçmeye hazırız:</w:t>
       </w:r>
     </w:p>
     <w:p>
@@ -695,12 +1017,21 @@
           <w:numId w:val="3"/>
         </w:numPr>
       </w:pPr>
-      <w:r>
-        <w:rPr>
-          <w:b/>
-          <w:bCs/>
-        </w:rPr>
-        <w:t>Page (Not) CRUD:</w:t>
+      <w:proofErr w:type="spellStart"/>
+      <w:r>
+        <w:rPr>
+          <w:b/>
+          <w:bCs/>
+        </w:rPr>
+        <w:t>Page</w:t>
+      </w:r>
+      <w:proofErr w:type="spellEnd"/>
+      <w:r>
+        <w:rPr>
+          <w:b/>
+          <w:bCs/>
+        </w:rPr>
+        <w:t xml:space="preserve"> (Not) CRUD:</w:t>
       </w:r>
       <w:r>
         <w:t xml:space="preserve"> Kullanıcının sadece kendi notlarını ekleyip görebileceği servisleri yazacağız.</w:t>
@@ -713,15 +1044,32 @@
           <w:numId w:val="3"/>
         </w:numPr>
       </w:pPr>
-      <w:r>
-        <w:rPr>
-          <w:b/>
-          <w:bCs/>
-        </w:rPr>
-        <w:t>Pagination:</w:t>
-      </w:r>
-      <w:r>
-        <w:t xml:space="preserve"> Çok fazla not olduğunda bunları 10'arlı 10'arlı sayfalara böleceğiz.</w:t>
+      <w:proofErr w:type="spellStart"/>
+      <w:r>
+        <w:rPr>
+          <w:b/>
+          <w:bCs/>
+        </w:rPr>
+        <w:t>Pagination</w:t>
+      </w:r>
+      <w:proofErr w:type="spellEnd"/>
+      <w:r>
+        <w:rPr>
+          <w:b/>
+          <w:bCs/>
+        </w:rPr>
+        <w:t>:</w:t>
+      </w:r>
+      <w:r>
+        <w:t xml:space="preserve"> Çok fazla not olduğunda bunları 10'arlı </w:t>
+      </w:r>
+      <w:proofErr w:type="spellStart"/>
+      <w:r>
+        <w:t>10'arlı</w:t>
+      </w:r>
+      <w:proofErr w:type="spellEnd"/>
+      <w:r>
+        <w:t xml:space="preserve"> sayfalara böleceğiz.</w:t>
       </w:r>
     </w:p>
     <w:p>
@@ -731,15 +1079,48 @@
           <w:numId w:val="3"/>
         </w:numPr>
       </w:pPr>
-      <w:r>
-        <w:rPr>
-          <w:b/>
-          <w:bCs/>
-        </w:rPr>
-        <w:t>Group/Category:</w:t>
-      </w:r>
-      <w:r>
-        <w:t xml:space="preserve"> Notları klasörlemek için yeni bir tablo ve ilişki kuracağız.</w:t>
+      <w:proofErr w:type="spellStart"/>
+      <w:r>
+        <w:rPr>
+          <w:b/>
+          <w:bCs/>
+        </w:rPr>
+        <w:t>Group</w:t>
+      </w:r>
+      <w:proofErr w:type="spellEnd"/>
+      <w:r>
+        <w:rPr>
+          <w:b/>
+          <w:bCs/>
+        </w:rPr>
+        <w:t>/</w:t>
+      </w:r>
+      <w:proofErr w:type="spellStart"/>
+      <w:r>
+        <w:rPr>
+          <w:b/>
+          <w:bCs/>
+        </w:rPr>
+        <w:t>Category</w:t>
+      </w:r>
+      <w:proofErr w:type="spellEnd"/>
+      <w:r>
+        <w:rPr>
+          <w:b/>
+          <w:bCs/>
+        </w:rPr>
+        <w:t>:</w:t>
+      </w:r>
+      <w:r>
+        <w:t xml:space="preserve"> Notları </w:t>
+      </w:r>
+      <w:proofErr w:type="spellStart"/>
+      <w:r>
+        <w:t>klasörlemek</w:t>
+      </w:r>
+      <w:proofErr w:type="spellEnd"/>
+      <w:r>
+        <w:t xml:space="preserve"> için yeni bir tablo ve ilişki kuracağız.</w:t>
       </w:r>
     </w:p>
     <w:p>
@@ -764,7 +1145,23 @@
           <w:i/>
           <w:iCs/>
         </w:rPr>
-        <w:t>"Kaldığımız yerden devam edelim, PageController ve Service katmanını yazalım"</w:t>
+        <w:t xml:space="preserve">"Kaldığımız yerden devam edelim, </w:t>
+      </w:r>
+      <w:proofErr w:type="spellStart"/>
+      <w:r>
+        <w:rPr>
+          <w:i/>
+          <w:iCs/>
+        </w:rPr>
+        <w:t>PageController</w:t>
+      </w:r>
+      <w:proofErr w:type="spellEnd"/>
+      <w:r>
+        <w:rPr>
+          <w:i/>
+          <w:iCs/>
+        </w:rPr>
+        <w:t xml:space="preserve"> ve Service katmanını yazalım"</w:t>
       </w:r>
       <w:r>
         <w:t xml:space="preserve"> demen yeterli olacaktır. Kodların ve mimarin şu an tertemiz bir şekilde seni bekliyor!</w:t>
@@ -811,7 +1208,39 @@
           <w:b/>
           <w:bCs/>
         </w:rPr>
-        <w:t xml:space="preserve"> NoteP Backend Proje El Kitabı</w:t>
+        <w:t xml:space="preserve"> </w:t>
+      </w:r>
+      <w:proofErr w:type="spellStart"/>
+      <w:r>
+        <w:rPr>
+          <w:b/>
+          <w:bCs/>
+        </w:rPr>
+        <w:t>NoteP</w:t>
+      </w:r>
+      <w:proofErr w:type="spellEnd"/>
+      <w:r>
+        <w:rPr>
+          <w:b/>
+          <w:bCs/>
+        </w:rPr>
+        <w:t xml:space="preserve"> </w:t>
+      </w:r>
+      <w:proofErr w:type="spellStart"/>
+      <w:r>
+        <w:rPr>
+          <w:b/>
+          <w:bCs/>
+        </w:rPr>
+        <w:t>Backend</w:t>
+      </w:r>
+      <w:proofErr w:type="spellEnd"/>
+      <w:r>
+        <w:rPr>
+          <w:b/>
+          <w:bCs/>
+        </w:rPr>
+        <w:t xml:space="preserve"> Proje El Kitabı</w:t>
       </w:r>
     </w:p>
     <w:p>
@@ -831,7 +1260,23 @@
     </w:p>
     <w:p>
       <w:r>
-        <w:t>Mobil uygulama üzerinden kullanıcıların kayıt olabildiği, giriş yapabildiği ve kendilerine özel notlarını (Page) güvenli bir şekilde saklayabildiği bir REST API altyapısıdır.</w:t>
+        <w:t xml:space="preserve">Mobil uygulama üzerinden kullanıcıların </w:t>
+      </w:r>
+      <w:proofErr w:type="gramStart"/>
+      <w:r>
+        <w:t>kayıt olabildiği</w:t>
+      </w:r>
+      <w:proofErr w:type="gramEnd"/>
+      <w:r>
+        <w:t>, giriş yapabildiği ve kendilerine özel notlarını (</w:t>
+      </w:r>
+      <w:proofErr w:type="spellStart"/>
+      <w:r>
+        <w:t>Page</w:t>
+      </w:r>
+      <w:proofErr w:type="spellEnd"/>
+      <w:r>
+        <w:t>) güvenli bir şekilde saklayabildiği bir REST API altyapısıdır.</w:t>
       </w:r>
     </w:p>
     <w:p>
@@ -865,7 +1310,23 @@
           <w:b/>
           <w:bCs/>
         </w:rPr>
-        <w:t>N-Tier (Çok Katmanlı)</w:t>
+        <w:t>N-</w:t>
+      </w:r>
+      <w:proofErr w:type="spellStart"/>
+      <w:r>
+        <w:rPr>
+          <w:b/>
+          <w:bCs/>
+        </w:rPr>
+        <w:t>Tier</w:t>
+      </w:r>
+      <w:proofErr w:type="spellEnd"/>
+      <w:r>
+        <w:rPr>
+          <w:b/>
+          <w:bCs/>
+        </w:rPr>
+        <w:t xml:space="preserve"> (Çok Katmanlı)</w:t>
       </w:r>
       <w:r>
         <w:t xml:space="preserve"> mimari üzerine kuruludur:</w:t>
@@ -886,7 +1347,15 @@
         <w:t>Controller:</w:t>
       </w:r>
       <w:r>
-        <w:t xml:space="preserve"> Dış dünyaya açılan kapı (Endpoint'ler).</w:t>
+        <w:t xml:space="preserve"> Dış dünyaya açılan kapı (</w:t>
+      </w:r>
+      <w:proofErr w:type="spellStart"/>
+      <w:r>
+        <w:t>Endpoint'ler</w:t>
+      </w:r>
+      <w:proofErr w:type="spellEnd"/>
+      <w:r>
+        <w:t>).</w:t>
       </w:r>
     </w:p>
     <w:p>
@@ -914,15 +1383,32 @@
           <w:numId w:val="4"/>
         </w:numPr>
       </w:pPr>
-      <w:r>
-        <w:rPr>
-          <w:b/>
-          <w:bCs/>
-        </w:rPr>
-        <w:t>Repository:</w:t>
-      </w:r>
-      <w:r>
-        <w:t xml:space="preserve"> Veritabanı ile konuşan katman.</w:t>
+      <w:proofErr w:type="spellStart"/>
+      <w:r>
+        <w:rPr>
+          <w:b/>
+          <w:bCs/>
+        </w:rPr>
+        <w:t>Repository</w:t>
+      </w:r>
+      <w:proofErr w:type="spellEnd"/>
+      <w:r>
+        <w:rPr>
+          <w:b/>
+          <w:bCs/>
+        </w:rPr>
+        <w:t>:</w:t>
+      </w:r>
+      <w:r>
+        <w:t xml:space="preserve"> </w:t>
+      </w:r>
+      <w:proofErr w:type="spellStart"/>
+      <w:r>
+        <w:t>Veritabanı</w:t>
+      </w:r>
+      <w:proofErr w:type="spellEnd"/>
+      <w:r>
+        <w:t xml:space="preserve"> ile konuşan katman.</w:t>
       </w:r>
     </w:p>
     <w:p>
@@ -932,15 +1418,32 @@
           <w:numId w:val="4"/>
         </w:numPr>
       </w:pPr>
-      <w:r>
-        <w:rPr>
-          <w:b/>
-          <w:bCs/>
-        </w:rPr>
-        <w:t>Entity:</w:t>
-      </w:r>
-      <w:r>
-        <w:t xml:space="preserve"> Veritabanındaki tabloların Java'daki karşılığı.</w:t>
+      <w:proofErr w:type="spellStart"/>
+      <w:r>
+        <w:rPr>
+          <w:b/>
+          <w:bCs/>
+        </w:rPr>
+        <w:t>Entity</w:t>
+      </w:r>
+      <w:proofErr w:type="spellEnd"/>
+      <w:r>
+        <w:rPr>
+          <w:b/>
+          <w:bCs/>
+        </w:rPr>
+        <w:t>:</w:t>
+      </w:r>
+      <w:r>
+        <w:t xml:space="preserve"> </w:t>
+      </w:r>
+      <w:proofErr w:type="spellStart"/>
+      <w:r>
+        <w:t>Veritabanındaki</w:t>
+      </w:r>
+      <w:proofErr w:type="spellEnd"/>
+      <w:r>
+        <w:t xml:space="preserve"> tabloların Java'daki karşılığı.</w:t>
       </w:r>
     </w:p>
     <w:p>
@@ -958,7 +1461,15 @@
         <w:t>DTO:</w:t>
       </w:r>
       <w:r>
-        <w:t xml:space="preserve"> Veri transfer paketleri (Güvenlik için Entity'leri doğrudan dışarı açmıyoruz).</w:t>
+        <w:t xml:space="preserve"> Veri transfer paketleri (Güvenlik için </w:t>
+      </w:r>
+      <w:proofErr w:type="spellStart"/>
+      <w:r>
+        <w:t>Entity'leri</w:t>
+      </w:r>
+      <w:proofErr w:type="spellEnd"/>
+      <w:r>
+        <w:t xml:space="preserve"> doğrudan dışarı açmıyoruz).</w:t>
       </w:r>
     </w:p>
     <w:p>
@@ -980,7 +1491,23 @@
           <w:b/>
           <w:bCs/>
         </w:rPr>
-        <w:t>3. Veritabanı İlişki Şeması</w:t>
+        <w:t xml:space="preserve">3. </w:t>
+      </w:r>
+      <w:proofErr w:type="spellStart"/>
+      <w:r>
+        <w:rPr>
+          <w:b/>
+          <w:bCs/>
+        </w:rPr>
+        <w:t>Veritabanı</w:t>
+      </w:r>
+      <w:proofErr w:type="spellEnd"/>
+      <w:r>
+        <w:rPr>
+          <w:b/>
+          <w:bCs/>
+        </w:rPr>
+        <w:t xml:space="preserve"> İlişki Şeması</w:t>
       </w:r>
     </w:p>
     <w:p>
@@ -1003,7 +1530,23 @@
         <w:t>User:</w:t>
       </w:r>
       <w:r>
-        <w:t xml:space="preserve"> id, name, email, password.</w:t>
+        <w:t xml:space="preserve"> id, name, </w:t>
+      </w:r>
+      <w:proofErr w:type="spellStart"/>
+      <w:r>
+        <w:t>email</w:t>
+      </w:r>
+      <w:proofErr w:type="spellEnd"/>
+      <w:r>
+        <w:t xml:space="preserve">, </w:t>
+      </w:r>
+      <w:proofErr w:type="spellStart"/>
+      <w:r>
+        <w:t>password</w:t>
+      </w:r>
+      <w:proofErr w:type="spellEnd"/>
+      <w:r>
+        <w:t>.</w:t>
       </w:r>
     </w:p>
     <w:p>
@@ -1013,15 +1556,72 @@
           <w:numId w:val="5"/>
         </w:numPr>
       </w:pPr>
-      <w:r>
-        <w:rPr>
-          <w:b/>
-          <w:bCs/>
-        </w:rPr>
-        <w:t>Page:</w:t>
-      </w:r>
-      <w:r>
-        <w:t xml:space="preserve"> id, title, content, created_date, user_id (Foreign Key).</w:t>
+      <w:proofErr w:type="spellStart"/>
+      <w:r>
+        <w:rPr>
+          <w:b/>
+          <w:bCs/>
+        </w:rPr>
+        <w:t>Page</w:t>
+      </w:r>
+      <w:proofErr w:type="spellEnd"/>
+      <w:r>
+        <w:rPr>
+          <w:b/>
+          <w:bCs/>
+        </w:rPr>
+        <w:t>:</w:t>
+      </w:r>
+      <w:r>
+        <w:t xml:space="preserve"> id, </w:t>
+      </w:r>
+      <w:proofErr w:type="spellStart"/>
+      <w:r>
+        <w:t>title</w:t>
+      </w:r>
+      <w:proofErr w:type="spellEnd"/>
+      <w:r>
+        <w:t xml:space="preserve">, </w:t>
+      </w:r>
+      <w:proofErr w:type="spellStart"/>
+      <w:r>
+        <w:t>content</w:t>
+      </w:r>
+      <w:proofErr w:type="spellEnd"/>
+      <w:r>
+        <w:t xml:space="preserve">, </w:t>
+      </w:r>
+      <w:proofErr w:type="spellStart"/>
+      <w:r>
+        <w:t>created_date</w:t>
+      </w:r>
+      <w:proofErr w:type="spellEnd"/>
+      <w:r>
+        <w:t xml:space="preserve">, </w:t>
+      </w:r>
+      <w:proofErr w:type="spellStart"/>
+      <w:r>
+        <w:t>user_id</w:t>
+      </w:r>
+      <w:proofErr w:type="spellEnd"/>
+      <w:r>
+        <w:t xml:space="preserve"> (</w:t>
+      </w:r>
+      <w:proofErr w:type="spellStart"/>
+      <w:r>
+        <w:t>Foreign</w:t>
+      </w:r>
+      <w:proofErr w:type="spellEnd"/>
+      <w:r>
+        <w:t xml:space="preserve"> </w:t>
+      </w:r>
+      <w:proofErr w:type="spellStart"/>
+      <w:r>
+        <w:t>Key</w:t>
+      </w:r>
+      <w:proofErr w:type="spellEnd"/>
+      <w:r>
+        <w:t>).</w:t>
       </w:r>
     </w:p>
     <w:p>
@@ -1039,7 +1639,15 @@
         <w:t>İlişki:</w:t>
       </w:r>
       <w:r>
-        <w:t xml:space="preserve"> One-To-Many (Bir kullanıcının çok sayıda notu olabilir).</w:t>
+        <w:t xml:space="preserve"> </w:t>
+      </w:r>
+      <w:proofErr w:type="spellStart"/>
+      <w:r>
+        <w:t>One-To-Many</w:t>
+      </w:r>
+      <w:proofErr w:type="spellEnd"/>
+      <w:r>
+        <w:t xml:space="preserve"> (Bir kullanıcının çok sayıda notu olabilir).</w:t>
       </w:r>
     </w:p>
     <w:p>
@@ -1066,7 +1674,15 @@
     </w:p>
     <w:p>
       <w:r>
-        <w:t>Geri geldiğinde "Bu token işi nasıl oluyordu?" dersen, işte bu akış sana yardımcı olacak:</w:t>
+        <w:t xml:space="preserve">Geri geldiğinde "Bu </w:t>
+      </w:r>
+      <w:proofErr w:type="spellStart"/>
+      <w:r>
+        <w:t>token</w:t>
+      </w:r>
+      <w:proofErr w:type="spellEnd"/>
+      <w:r>
+        <w:t xml:space="preserve"> işi nasıl oluyordu?" dersen, işte bu akış sana yardımcı olacak:</w:t>
       </w:r>
     </w:p>
     <w:p>
@@ -1102,7 +1718,23 @@
         <w:t>Mühürleme:</w:t>
       </w:r>
       <w:r>
-        <w:t xml:space="preserve"> UserService şifreyi kontrol eder, doğruysa JwtUtil ile bir "Dijital Anahtar" (JWT) üretir ve kullanıcıya verir.</w:t>
+        <w:t xml:space="preserve"> </w:t>
+      </w:r>
+      <w:proofErr w:type="spellStart"/>
+      <w:r>
+        <w:t>UserService</w:t>
+      </w:r>
+      <w:proofErr w:type="spellEnd"/>
+      <w:r>
+        <w:t xml:space="preserve"> şifreyi kontrol eder, doğruysa </w:t>
+      </w:r>
+      <w:proofErr w:type="spellStart"/>
+      <w:r>
+        <w:t>JwtUtil</w:t>
+      </w:r>
+      <w:proofErr w:type="spellEnd"/>
+      <w:r>
+        <w:t xml:space="preserve"> ile bir "Dijital Anahtar" (JWT) üretir ve kullanıcıya verir.</w:t>
       </w:r>
     </w:p>
     <w:p>
@@ -1117,10 +1749,34 @@
           <w:b/>
           <w:bCs/>
         </w:rPr>
-        <w:t>Bekçi (Filter):</w:t>
-      </w:r>
-      <w:r>
-        <w:t xml:space="preserve"> Kullanıcı sonraki her isteğinde bu anahtarı yanında getirir. JwtFilter kapıda anahtarı kontrol eder.</w:t>
+        <w:t>Bekçi (</w:t>
+      </w:r>
+      <w:proofErr w:type="spellStart"/>
+      <w:r>
+        <w:rPr>
+          <w:b/>
+          <w:bCs/>
+        </w:rPr>
+        <w:t>Filter</w:t>
+      </w:r>
+      <w:proofErr w:type="spellEnd"/>
+      <w:r>
+        <w:rPr>
+          <w:b/>
+          <w:bCs/>
+        </w:rPr>
+        <w:t>):</w:t>
+      </w:r>
+      <w:r>
+        <w:t xml:space="preserve"> Kullanıcı sonraki her isteğinde bu anahtarı yanında getirir. </w:t>
+      </w:r>
+      <w:proofErr w:type="spellStart"/>
+      <w:r>
+        <w:t>JwtFilter</w:t>
+      </w:r>
+      <w:proofErr w:type="spellEnd"/>
+      <w:r>
+        <w:t xml:space="preserve"> kapıda anahtarı kontrol eder.</w:t>
       </w:r>
     </w:p>
     <w:p>
@@ -1138,7 +1794,15 @@
         <w:t>Yetki:</w:t>
       </w:r>
       <w:r>
-        <w:t xml:space="preserve"> Eğer anahtar gerçekse, SecurityContext üzerinden kapı açılır ve kullanıcı içeri alınır.</w:t>
+        <w:t xml:space="preserve"> Eğer anahtar gerçekse, </w:t>
+      </w:r>
+      <w:proofErr w:type="spellStart"/>
+      <w:r>
+        <w:t>SecurityContext</w:t>
+      </w:r>
+      <w:proofErr w:type="spellEnd"/>
+      <w:r>
+        <w:t xml:space="preserve"> üzerinden kapı açılır ve kullanıcı içeri alınır.</w:t>
       </w:r>
     </w:p>
     <w:p>
@@ -1270,6 +1934,7 @@
             <w:hideMark/>
           </w:tcPr>
           <w:p>
+            <w:proofErr w:type="spellStart"/>
             <w:r>
               <w:rPr>
                 <w:b/>
@@ -1277,6 +1942,7 @@
               </w:rPr>
               <w:t>JwtUtil</w:t>
             </w:r>
+            <w:proofErr w:type="spellEnd"/>
           </w:p>
         </w:tc>
         <w:tc>
@@ -1310,8 +1976,15 @@
             <w:hideMark/>
           </w:tcPr>
           <w:p>
+            <w:proofErr w:type="spellStart"/>
+            <w:proofErr w:type="gramStart"/>
             <w:r>
-              <w:t>secretKey gizli kalmalı!</w:t>
+              <w:t>secretKey</w:t>
+            </w:r>
+            <w:proofErr w:type="spellEnd"/>
+            <w:proofErr w:type="gramEnd"/>
+            <w:r>
+              <w:t xml:space="preserve"> gizli kalmalı!</w:t>
             </w:r>
           </w:p>
         </w:tc>
@@ -1333,6 +2006,7 @@
             <w:hideMark/>
           </w:tcPr>
           <w:p>
+            <w:proofErr w:type="spellStart"/>
             <w:r>
               <w:rPr>
                 <w:b/>
@@ -1340,6 +2014,7 @@
               </w:rPr>
               <w:t>JwtFilter</w:t>
             </w:r>
+            <w:proofErr w:type="spellEnd"/>
           </w:p>
         </w:tc>
         <w:tc>
@@ -1396,6 +2071,7 @@
             <w:hideMark/>
           </w:tcPr>
           <w:p>
+            <w:proofErr w:type="spellStart"/>
             <w:r>
               <w:rPr>
                 <w:b/>
@@ -1403,6 +2079,7 @@
               </w:rPr>
               <w:t>SecurityConfig</w:t>
             </w:r>
+            <w:proofErr w:type="spellEnd"/>
           </w:p>
         </w:tc>
         <w:tc>
@@ -1459,6 +2136,7 @@
             <w:hideMark/>
           </w:tcPr>
           <w:p>
+            <w:proofErr w:type="spellStart"/>
             <w:r>
               <w:rPr>
                 <w:b/>
@@ -1466,6 +2144,7 @@
               </w:rPr>
               <w:t>BCrypt</w:t>
             </w:r>
+            <w:proofErr w:type="spellEnd"/>
           </w:p>
         </w:tc>
         <w:tc>
@@ -1536,7 +2215,15 @@
         </w:numPr>
       </w:pPr>
       <w:r>
-        <w:t>[x] Kullanıcı Kayıt / Giriş</w:t>
+        <w:t>[</w:t>
+      </w:r>
+      <w:proofErr w:type="gramStart"/>
+      <w:r>
+        <w:t>x</w:t>
+      </w:r>
+      <w:proofErr w:type="gramEnd"/>
+      <w:r>
+        <w:t>] Kullanıcı Kayıt / Giriş</w:t>
       </w:r>
     </w:p>
     <w:p>
@@ -1547,7 +2234,15 @@
         </w:numPr>
       </w:pPr>
       <w:r>
-        <w:t>[x] JWT Entegrasyonu</w:t>
+        <w:t>[</w:t>
+      </w:r>
+      <w:proofErr w:type="gramStart"/>
+      <w:r>
+        <w:t>x</w:t>
+      </w:r>
+      <w:proofErr w:type="gramEnd"/>
+      <w:r>
+        <w:t>] JWT Entegrasyonu</w:t>
       </w:r>
     </w:p>
     <w:p>
@@ -1558,7 +2253,15 @@
         </w:numPr>
       </w:pPr>
       <w:r>
-        <w:t>[x] Güvenlik Filtreleri</w:t>
+        <w:t>[</w:t>
+      </w:r>
+      <w:proofErr w:type="gramStart"/>
+      <w:r>
+        <w:t>x</w:t>
+      </w:r>
+      <w:proofErr w:type="gramEnd"/>
+      <w:r>
+        <w:t>] Güvenlik Filtreleri</w:t>
       </w:r>
     </w:p>
     <w:p>
@@ -1568,15 +2271,29 @@
           <w:numId w:val="7"/>
         </w:numPr>
       </w:pPr>
-      <w:r>
-        <w:t xml:space="preserve">[ ] </w:t>
-      </w:r>
-      <w:r>
-        <w:rPr>
-          <w:b/>
-          <w:bCs/>
-        </w:rPr>
-        <w:t>Page CRUD (Sıradaki Adım):</w:t>
+      <w:proofErr w:type="gramStart"/>
+      <w:r>
+        <w:t>[ ]</w:t>
+      </w:r>
+      <w:proofErr w:type="gramEnd"/>
+      <w:r>
+        <w:t xml:space="preserve"> </w:t>
+      </w:r>
+      <w:proofErr w:type="spellStart"/>
+      <w:r>
+        <w:rPr>
+          <w:b/>
+          <w:bCs/>
+        </w:rPr>
+        <w:t>Page</w:t>
+      </w:r>
+      <w:proofErr w:type="spellEnd"/>
+      <w:r>
+        <w:rPr>
+          <w:b/>
+          <w:bCs/>
+        </w:rPr>
+        <w:t xml:space="preserve"> CRUD (Sıradaki Adım):</w:t>
       </w:r>
       <w:r>
         <w:t xml:space="preserve"> Not ekleme, silme ve düzenleme.</w:t>
@@ -1589,15 +2306,29 @@
           <w:numId w:val="7"/>
         </w:numPr>
       </w:pPr>
-      <w:r>
-        <w:t xml:space="preserve">[ ] </w:t>
-      </w:r>
-      <w:r>
-        <w:rPr>
-          <w:b/>
-          <w:bCs/>
-        </w:rPr>
-        <w:t>Pagination:</w:t>
+      <w:proofErr w:type="gramStart"/>
+      <w:r>
+        <w:t>[ ]</w:t>
+      </w:r>
+      <w:proofErr w:type="gramEnd"/>
+      <w:r>
+        <w:t xml:space="preserve"> </w:t>
+      </w:r>
+      <w:proofErr w:type="spellStart"/>
+      <w:r>
+        <w:rPr>
+          <w:b/>
+          <w:bCs/>
+        </w:rPr>
+        <w:t>Pagination</w:t>
+      </w:r>
+      <w:proofErr w:type="spellEnd"/>
+      <w:r>
+        <w:rPr>
+          <w:b/>
+          <w:bCs/>
+        </w:rPr>
+        <w:t>:</w:t>
       </w:r>
       <w:r>
         <w:t xml:space="preserve"> Notları sayfalara bölerek getirme.</w:t>
@@ -1610,15 +2341,36 @@
           <w:numId w:val="7"/>
         </w:numPr>
       </w:pPr>
-      <w:r>
-        <w:t xml:space="preserve">[ ] </w:t>
-      </w:r>
-      <w:r>
-        <w:rPr>
-          <w:b/>
-          <w:bCs/>
-        </w:rPr>
-        <w:t>Global Error Handling:</w:t>
+      <w:proofErr w:type="gramStart"/>
+      <w:r>
+        <w:t>[ ]</w:t>
+      </w:r>
+      <w:proofErr w:type="gramEnd"/>
+      <w:r>
+        <w:t xml:space="preserve"> </w:t>
+      </w:r>
+      <w:r>
+        <w:rPr>
+          <w:b/>
+          <w:bCs/>
+        </w:rPr>
+        <w:t xml:space="preserve">Global </w:t>
+      </w:r>
+      <w:proofErr w:type="spellStart"/>
+      <w:r>
+        <w:rPr>
+          <w:b/>
+          <w:bCs/>
+        </w:rPr>
+        <w:t>Error</w:t>
+      </w:r>
+      <w:proofErr w:type="spellEnd"/>
+      <w:r>
+        <w:rPr>
+          <w:b/>
+          <w:bCs/>
+        </w:rPr>
+        <w:t xml:space="preserve"> Handling:</w:t>
       </w:r>
       <w:r>
         <w:t xml:space="preserve"> Hataları tek bir merkezden yönetme.</w:t>
@@ -1656,7 +2408,41 @@
     </w:p>
     <w:p>
       <w:r>
-        <w:t>Bilgisayarını açıp projeyi yüklediğinde, JwtUtil içindeki secretKey'in application.properties dosyasında tanımlı olduğundan emin ol. Ardından PageController yazarak not ekleme işlemlerine başlayabiliriz.</w:t>
+        <w:t xml:space="preserve">Bilgisayarını açıp projeyi yüklediğinde, </w:t>
+      </w:r>
+      <w:proofErr w:type="spellStart"/>
+      <w:r>
+        <w:t>JwtUtil</w:t>
+      </w:r>
+      <w:proofErr w:type="spellEnd"/>
+      <w:r>
+        <w:t xml:space="preserve"> içindeki </w:t>
+      </w:r>
+      <w:proofErr w:type="spellStart"/>
+      <w:r>
+        <w:t>secretKey'in</w:t>
+      </w:r>
+      <w:proofErr w:type="spellEnd"/>
+      <w:r>
+        <w:t xml:space="preserve"> </w:t>
+      </w:r>
+      <w:proofErr w:type="spellStart"/>
+      <w:proofErr w:type="gramStart"/>
+      <w:r>
+        <w:t>application.properties</w:t>
+      </w:r>
+      <w:proofErr w:type="spellEnd"/>
+      <w:proofErr w:type="gramEnd"/>
+      <w:r>
+        <w:t xml:space="preserve"> dosyasında tanımlı olduğundan emin ol. Ardından </w:t>
+      </w:r>
+      <w:proofErr w:type="spellStart"/>
+      <w:r>
+        <w:t>PageController</w:t>
+      </w:r>
+      <w:proofErr w:type="spellEnd"/>
+      <w:r>
+        <w:t xml:space="preserve"> yazarak not ekleme işlemlerine başlayabiliriz.</w:t>
       </w:r>
     </w:p>
     <w:p>
@@ -1688,12 +2474,36 @@
           <w:bCs/>
         </w:rPr>
         <w:lastRenderedPageBreak/>
-        <w:t>1. HAFTA: Temeller ve Güvenlik (Backend Odaklı)</w:t>
-      </w:r>
-    </w:p>
-    <w:p>
-      <w:r>
-        <w:t>Bu hafta sistemin "kapılarını" ve veritabanı akışını tamamen bitiriyoruz.</w:t>
+        <w:t>1. HAFTA: Temeller ve Güvenlik (</w:t>
+      </w:r>
+      <w:proofErr w:type="spellStart"/>
+      <w:r>
+        <w:rPr>
+          <w:b/>
+          <w:bCs/>
+        </w:rPr>
+        <w:t>Backend</w:t>
+      </w:r>
+      <w:proofErr w:type="spellEnd"/>
+      <w:r>
+        <w:rPr>
+          <w:b/>
+          <w:bCs/>
+        </w:rPr>
+        <w:t xml:space="preserve"> Odaklı)</w:t>
+      </w:r>
+    </w:p>
+    <w:p>
+      <w:r>
+        <w:t xml:space="preserve">Bu hafta sistemin "kapılarını" ve </w:t>
+      </w:r>
+      <w:proofErr w:type="spellStart"/>
+      <w:r>
+        <w:t>veritabanı</w:t>
+      </w:r>
+      <w:proofErr w:type="spellEnd"/>
+      <w:r>
+        <w:t xml:space="preserve"> akışını tamamen bitiriyoruz.</w:t>
       </w:r>
     </w:p>
     <w:p>
@@ -1711,7 +2521,47 @@
         <w:t>1-2. Gün:</w:t>
       </w:r>
       <w:r>
-        <w:t xml:space="preserve"> UserService içindeki Login/Register süreçlerini test et. Postman kullanarak kayıt ol ve Token alabildiğini doğrula.</w:t>
+        <w:t xml:space="preserve"> </w:t>
+      </w:r>
+      <w:proofErr w:type="spellStart"/>
+      <w:r>
+        <w:t>UserService</w:t>
+      </w:r>
+      <w:proofErr w:type="spellEnd"/>
+      <w:r>
+        <w:t xml:space="preserve"> içindeki Login/</w:t>
+      </w:r>
+      <w:proofErr w:type="spellStart"/>
+      <w:r>
+        <w:t>Register</w:t>
+      </w:r>
+      <w:proofErr w:type="spellEnd"/>
+      <w:r>
+        <w:t xml:space="preserve"> süreçlerini test et. </w:t>
+      </w:r>
+      <w:proofErr w:type="spellStart"/>
+      <w:r>
+        <w:t>Postman</w:t>
+      </w:r>
+      <w:proofErr w:type="spellEnd"/>
+      <w:r>
+        <w:t xml:space="preserve"> kullanarak </w:t>
+      </w:r>
+      <w:proofErr w:type="gramStart"/>
+      <w:r>
+        <w:t>kayıt ol</w:t>
+      </w:r>
+      <w:proofErr w:type="gramEnd"/>
+      <w:r>
+        <w:t xml:space="preserve"> ve </w:t>
+      </w:r>
+      <w:proofErr w:type="spellStart"/>
+      <w:r>
+        <w:t>Token</w:t>
+      </w:r>
+      <w:proofErr w:type="spellEnd"/>
+      <w:r>
+        <w:t xml:space="preserve"> alabildiğini doğrula.</w:t>
       </w:r>
     </w:p>
     <w:p>
@@ -1729,7 +2579,23 @@
         <w:t>3. Gün:</w:t>
       </w:r>
       <w:r>
-        <w:t xml:space="preserve"> PageRepository ve PageService oluşturma. Temel "Not Ekleme" ve "Listeleme" metotlarını yaz.</w:t>
+        <w:t xml:space="preserve"> </w:t>
+      </w:r>
+      <w:proofErr w:type="spellStart"/>
+      <w:r>
+        <w:t>PageRepository</w:t>
+      </w:r>
+      <w:proofErr w:type="spellEnd"/>
+      <w:r>
+        <w:t xml:space="preserve"> ve </w:t>
+      </w:r>
+      <w:proofErr w:type="spellStart"/>
+      <w:r>
+        <w:t>PageService</w:t>
+      </w:r>
+      <w:proofErr w:type="spellEnd"/>
+      <w:r>
+        <w:t xml:space="preserve"> oluşturma. Temel "Not Ekleme" ve "Listeleme" metotlarını yaz.</w:t>
       </w:r>
     </w:p>
     <w:p>
@@ -1747,7 +2613,23 @@
         <w:t>4. Gün:</w:t>
       </w:r>
       <w:r>
-        <w:t xml:space="preserve"> SecurityContextHolder kullanarak, Token ile gelen isteğin hangi kullanıcıya ait olduğunu bulan yardımcı metodu yaz.</w:t>
+        <w:t xml:space="preserve"> </w:t>
+      </w:r>
+      <w:proofErr w:type="spellStart"/>
+      <w:r>
+        <w:t>SecurityContextHolder</w:t>
+      </w:r>
+      <w:proofErr w:type="spellEnd"/>
+      <w:r>
+        <w:t xml:space="preserve"> kullanarak, </w:t>
+      </w:r>
+      <w:proofErr w:type="spellStart"/>
+      <w:r>
+        <w:t>Token</w:t>
+      </w:r>
+      <w:proofErr w:type="spellEnd"/>
+      <w:r>
+        <w:t xml:space="preserve"> ile gelen isteğin hangi kullanıcıya ait olduğunu bulan yardımcı metodu yaz.</w:t>
       </w:r>
     </w:p>
     <w:p>
@@ -1767,15 +2649,56 @@
       <w:r>
         <w:t xml:space="preserve"> </w:t>
       </w:r>
-      <w:r>
-        <w:rPr>
-          <w:b/>
-          <w:bCs/>
-        </w:rPr>
-        <w:t>Flutter Kurulumu:</w:t>
-      </w:r>
-      <w:r>
-        <w:t xml:space="preserve"> Flutter SDK ve Android Studio ayarlarını yap. İlk "Hello World" projesini Xiaomi telefonunda çalıştır.</w:t>
+      <w:proofErr w:type="spellStart"/>
+      <w:r>
+        <w:rPr>
+          <w:b/>
+          <w:bCs/>
+        </w:rPr>
+        <w:t>Flutter</w:t>
+      </w:r>
+      <w:proofErr w:type="spellEnd"/>
+      <w:r>
+        <w:rPr>
+          <w:b/>
+          <w:bCs/>
+        </w:rPr>
+        <w:t xml:space="preserve"> Kurulumu:</w:t>
+      </w:r>
+      <w:r>
+        <w:t xml:space="preserve"> </w:t>
+      </w:r>
+      <w:proofErr w:type="spellStart"/>
+      <w:r>
+        <w:t>Flutter</w:t>
+      </w:r>
+      <w:proofErr w:type="spellEnd"/>
+      <w:r>
+        <w:t xml:space="preserve"> SDK ve Android </w:t>
+      </w:r>
+      <w:proofErr w:type="spellStart"/>
+      <w:r>
+        <w:t>Studio</w:t>
+      </w:r>
+      <w:proofErr w:type="spellEnd"/>
+      <w:r>
+        <w:t xml:space="preserve"> ayarlarını yap. İlk "</w:t>
+      </w:r>
+      <w:proofErr w:type="spellStart"/>
+      <w:r>
+        <w:t>Hello</w:t>
+      </w:r>
+      <w:proofErr w:type="spellEnd"/>
+      <w:r>
+        <w:t xml:space="preserve"> World" projesini </w:t>
+      </w:r>
+      <w:proofErr w:type="spellStart"/>
+      <w:r>
+        <w:t>Xiaomi</w:t>
+      </w:r>
+      <w:proofErr w:type="spellEnd"/>
+      <w:r>
+        <w:t xml:space="preserve"> telefonunda çalıştır.</w:t>
       </w:r>
     </w:p>
     <w:p>
@@ -1793,7 +2716,23 @@
         <w:t>6. Gün:</w:t>
       </w:r>
       <w:r>
-        <w:t xml:space="preserve"> Flutter UI: Login ve Register ekranlarının tasarımını yap (Sadece görsel, kodlama haftaya).</w:t>
+        <w:t xml:space="preserve"> </w:t>
+      </w:r>
+      <w:proofErr w:type="spellStart"/>
+      <w:r>
+        <w:t>Flutter</w:t>
+      </w:r>
+      <w:proofErr w:type="spellEnd"/>
+      <w:r>
+        <w:t xml:space="preserve"> UI: Login ve </w:t>
+      </w:r>
+      <w:proofErr w:type="spellStart"/>
+      <w:r>
+        <w:t>Register</w:t>
+      </w:r>
+      <w:proofErr w:type="spellEnd"/>
+      <w:r>
+        <w:t xml:space="preserve"> ekranlarının tasarımını yap (Sadece görsel, kodlama haftaya).</w:t>
       </w:r>
     </w:p>
     <w:p>
@@ -1811,7 +2750,23 @@
         <w:t>7. Gün:</w:t>
       </w:r>
       <w:r>
-        <w:t xml:space="preserve"> Haftalık Değerlendirme: Backend'deki tüm CRUD (Ekle/Sil/Güncelle) işlemlerinin Postman'de çalıştığından emin ol.</w:t>
+        <w:t xml:space="preserve"> Haftalık Değerlendirme: </w:t>
+      </w:r>
+      <w:proofErr w:type="spellStart"/>
+      <w:r>
+        <w:t>Backend'deki</w:t>
+      </w:r>
+      <w:proofErr w:type="spellEnd"/>
+      <w:r>
+        <w:t xml:space="preserve"> tüm CRUD (Ekle/Sil/Güncelle) işlemlerinin </w:t>
+      </w:r>
+      <w:proofErr w:type="spellStart"/>
+      <w:r>
+        <w:t>Postman'de</w:t>
+      </w:r>
+      <w:proofErr w:type="spellEnd"/>
+      <w:r>
+        <w:t xml:space="preserve"> çalıştığından emin ol.</w:t>
       </w:r>
     </w:p>
     <w:p>
@@ -1856,7 +2811,31 @@
         <w:t>8. Gün:</w:t>
       </w:r>
       <w:r>
-        <w:t xml:space="preserve"> Flutter'da http paketini kur. Login ekranından Spring Boot'a istek at ve dönen Token'ı ekranda gör.</w:t>
+        <w:t xml:space="preserve"> </w:t>
+      </w:r>
+      <w:proofErr w:type="spellStart"/>
+      <w:r>
+        <w:t>Flutter'da</w:t>
+      </w:r>
+      <w:proofErr w:type="spellEnd"/>
+      <w:r>
+        <w:t xml:space="preserve"> http paketini kur. Login ekranından Spring </w:t>
+      </w:r>
+      <w:proofErr w:type="spellStart"/>
+      <w:r>
+        <w:t>Boot'a</w:t>
+      </w:r>
+      <w:proofErr w:type="spellEnd"/>
+      <w:r>
+        <w:t xml:space="preserve"> istek at ve dönen </w:t>
+      </w:r>
+      <w:proofErr w:type="spellStart"/>
+      <w:r>
+        <w:t>Token'ı</w:t>
+      </w:r>
+      <w:proofErr w:type="spellEnd"/>
+      <w:r>
+        <w:t xml:space="preserve"> ekranda gör.</w:t>
       </w:r>
     </w:p>
     <w:p>
@@ -1876,15 +2855,48 @@
       <w:r>
         <w:t xml:space="preserve"> </w:t>
       </w:r>
-      <w:r>
-        <w:rPr>
-          <w:b/>
-          <w:bCs/>
-        </w:rPr>
-        <w:t>Token Saklama:</w:t>
-      </w:r>
-      <w:r>
-        <w:t xml:space="preserve"> shared_preferences kullanarak Token'ı telefon hafızasına kaydet. Uygulama açıldığında Token varsa direkt ana sayfaya yönlendir.</w:t>
+      <w:proofErr w:type="spellStart"/>
+      <w:r>
+        <w:rPr>
+          <w:b/>
+          <w:bCs/>
+        </w:rPr>
+        <w:t>Token</w:t>
+      </w:r>
+      <w:proofErr w:type="spellEnd"/>
+      <w:r>
+        <w:rPr>
+          <w:b/>
+          <w:bCs/>
+        </w:rPr>
+        <w:t xml:space="preserve"> Saklama:</w:t>
+      </w:r>
+      <w:r>
+        <w:t xml:space="preserve"> </w:t>
+      </w:r>
+      <w:proofErr w:type="spellStart"/>
+      <w:r>
+        <w:t>shared_preferences</w:t>
+      </w:r>
+      <w:proofErr w:type="spellEnd"/>
+      <w:r>
+        <w:t xml:space="preserve"> kullanarak </w:t>
+      </w:r>
+      <w:proofErr w:type="spellStart"/>
+      <w:r>
+        <w:t>Token'ı</w:t>
+      </w:r>
+      <w:proofErr w:type="spellEnd"/>
+      <w:r>
+        <w:t xml:space="preserve"> telefon hafızasına kaydet. Uygulama açıldığında </w:t>
+      </w:r>
+      <w:proofErr w:type="spellStart"/>
+      <w:r>
+        <w:t>Token</w:t>
+      </w:r>
+      <w:proofErr w:type="spellEnd"/>
+      <w:r>
+        <w:t xml:space="preserve"> varsa direkt ana sayfaya yönlendir.</w:t>
       </w:r>
     </w:p>
     <w:p>
@@ -1912,7 +2924,31 @@
         <w:t>Ana Sayfa (Listeleme):</w:t>
       </w:r>
       <w:r>
-        <w:t xml:space="preserve"> Backend'den gelen notları ListView içinde listele. Şık bir kart (Card) tasarımı yap.</w:t>
+        <w:t xml:space="preserve"> </w:t>
+      </w:r>
+      <w:proofErr w:type="spellStart"/>
+      <w:r>
+        <w:t>Backend'den</w:t>
+      </w:r>
+      <w:proofErr w:type="spellEnd"/>
+      <w:r>
+        <w:t xml:space="preserve"> gelen notları </w:t>
+      </w:r>
+      <w:proofErr w:type="spellStart"/>
+      <w:r>
+        <w:t>ListView</w:t>
+      </w:r>
+      <w:proofErr w:type="spellEnd"/>
+      <w:r>
+        <w:t xml:space="preserve"> içinde listele. Şık bir kart (</w:t>
+      </w:r>
+      <w:proofErr w:type="spellStart"/>
+      <w:r>
+        <w:t>Card</w:t>
+      </w:r>
+      <w:proofErr w:type="spellEnd"/>
+      <w:r>
+        <w:t>) tasarımı yap.</w:t>
       </w:r>
     </w:p>
     <w:p>
@@ -1940,7 +2976,23 @@
         <w:t>Not Ekleme:</w:t>
       </w:r>
       <w:r>
-        <w:t xml:space="preserve"> Flutter'da bir "Yeni Not" sayfası yap. Başlık ve içeriği Spring Boot'a gönder.</w:t>
+        <w:t xml:space="preserve"> </w:t>
+      </w:r>
+      <w:proofErr w:type="spellStart"/>
+      <w:r>
+        <w:t>Flutter'da</w:t>
+      </w:r>
+      <w:proofErr w:type="spellEnd"/>
+      <w:r>
+        <w:t xml:space="preserve"> bir "Yeni Not" sayfası yap. Başlık ve içeriği Spring </w:t>
+      </w:r>
+      <w:proofErr w:type="spellStart"/>
+      <w:r>
+        <w:t>Boot'a</w:t>
+      </w:r>
+      <w:proofErr w:type="spellEnd"/>
+      <w:r>
+        <w:t xml:space="preserve"> gönder.</w:t>
       </w:r>
     </w:p>
     <w:p>
@@ -1996,7 +3048,15 @@
         <w:t>Hata Yönetimi:</w:t>
       </w:r>
       <w:r>
-        <w:t xml:space="preserve"> Yanlış şifre girildiğinde veya internet olmadığında kullanıcıya "SnackBar" ile uyarı göster.</w:t>
+        <w:t xml:space="preserve"> Yanlış şifre girildiğinde veya internet olmadığında kullanıcıya "</w:t>
+      </w:r>
+      <w:proofErr w:type="spellStart"/>
+      <w:r>
+        <w:t>SnackBar</w:t>
+      </w:r>
+      <w:proofErr w:type="spellEnd"/>
+      <w:r>
+        <w:t>" ile uyarı göster.</w:t>
       </w:r>
     </w:p>
     <w:p>
@@ -2016,15 +3076,56 @@
       <w:r>
         <w:t xml:space="preserve"> </w:t>
       </w:r>
-      <w:r>
-        <w:rPr>
-          <w:b/>
-          <w:bCs/>
-        </w:rPr>
-        <w:t>Refactoring:</w:t>
-      </w:r>
-      <w:r>
-        <w:t xml:space="preserve"> Kodları temizle. Backend ve Frontend arasındaki değişken isimlerinin (eMail, title vb.) tam uyumlu olduğunu kontrol et.</w:t>
+      <w:proofErr w:type="spellStart"/>
+      <w:r>
+        <w:rPr>
+          <w:b/>
+          <w:bCs/>
+        </w:rPr>
+        <w:t>Refactoring</w:t>
+      </w:r>
+      <w:proofErr w:type="spellEnd"/>
+      <w:r>
+        <w:rPr>
+          <w:b/>
+          <w:bCs/>
+        </w:rPr>
+        <w:t>:</w:t>
+      </w:r>
+      <w:r>
+        <w:t xml:space="preserve"> Kodları temizle. </w:t>
+      </w:r>
+      <w:proofErr w:type="spellStart"/>
+      <w:r>
+        <w:t>Backend</w:t>
+      </w:r>
+      <w:proofErr w:type="spellEnd"/>
+      <w:r>
+        <w:t xml:space="preserve"> ve </w:t>
+      </w:r>
+      <w:proofErr w:type="spellStart"/>
+      <w:r>
+        <w:t>Frontend</w:t>
+      </w:r>
+      <w:proofErr w:type="spellEnd"/>
+      <w:r>
+        <w:t xml:space="preserve"> arasındaki değişken isimlerinin (</w:t>
+      </w:r>
+      <w:proofErr w:type="spellStart"/>
+      <w:r>
+        <w:t>eMail</w:t>
+      </w:r>
+      <w:proofErr w:type="spellEnd"/>
+      <w:r>
+        <w:t xml:space="preserve">, </w:t>
+      </w:r>
+      <w:proofErr w:type="spellStart"/>
+      <w:r>
+        <w:t>title</w:t>
+      </w:r>
+      <w:proofErr w:type="spellEnd"/>
+      <w:r>
+        <w:t xml:space="preserve"> vb.) tam uyumlu olduğunu kontrol et.</w:t>
       </w:r>
     </w:p>
     <w:p>
@@ -2072,12 +3173,46 @@
       <w:r>
         <w:t xml:space="preserve"> </w:t>
       </w:r>
-      <w:r>
-        <w:rPr>
-          <w:b/>
-          <w:bCs/>
-        </w:rPr>
-        <w:t>Backend - GroupService:</w:t>
+      <w:proofErr w:type="spellStart"/>
+      <w:proofErr w:type="gramStart"/>
+      <w:r>
+        <w:rPr>
+          <w:b/>
+          <w:bCs/>
+        </w:rPr>
+        <w:t>Backend</w:t>
+      </w:r>
+      <w:proofErr w:type="spellEnd"/>
+      <w:r>
+        <w:rPr>
+          <w:b/>
+          <w:bCs/>
+        </w:rPr>
+        <w:t xml:space="preserve"> -</w:t>
+      </w:r>
+      <w:proofErr w:type="gramEnd"/>
+      <w:r>
+        <w:rPr>
+          <w:b/>
+          <w:bCs/>
+        </w:rPr>
+        <w:t xml:space="preserve"> </w:t>
+      </w:r>
+      <w:proofErr w:type="spellStart"/>
+      <w:r>
+        <w:rPr>
+          <w:b/>
+          <w:bCs/>
+        </w:rPr>
+        <w:t>GroupService</w:t>
+      </w:r>
+      <w:proofErr w:type="spellEnd"/>
+      <w:r>
+        <w:rPr>
+          <w:b/>
+          <w:bCs/>
+        </w:rPr>
+        <w:t>:</w:t>
       </w:r>
       <w:r>
         <w:t xml:space="preserve"> Kullanıcıların grup kurmasını sağlayacak metotları yaz.</w:t>
@@ -2100,15 +3235,83 @@
       <w:r>
         <w:t xml:space="preserve"> </w:t>
       </w:r>
-      <w:r>
-        <w:rPr>
-          <w:b/>
-          <w:bCs/>
-        </w:rPr>
-        <w:t>Backend - Group Assignment:</w:t>
-      </w:r>
-      <w:r>
-        <w:t xml:space="preserve"> Bir notun bir gruba nasıl atanacağını (page.setGroup(group)) kodla.</w:t>
+      <w:proofErr w:type="spellStart"/>
+      <w:proofErr w:type="gramStart"/>
+      <w:r>
+        <w:rPr>
+          <w:b/>
+          <w:bCs/>
+        </w:rPr>
+        <w:t>Backend</w:t>
+      </w:r>
+      <w:proofErr w:type="spellEnd"/>
+      <w:r>
+        <w:rPr>
+          <w:b/>
+          <w:bCs/>
+        </w:rPr>
+        <w:t xml:space="preserve"> -</w:t>
+      </w:r>
+      <w:proofErr w:type="gramEnd"/>
+      <w:r>
+        <w:rPr>
+          <w:b/>
+          <w:bCs/>
+        </w:rPr>
+        <w:t xml:space="preserve"> </w:t>
+      </w:r>
+      <w:proofErr w:type="spellStart"/>
+      <w:r>
+        <w:rPr>
+          <w:b/>
+          <w:bCs/>
+        </w:rPr>
+        <w:t>Group</w:t>
+      </w:r>
+      <w:proofErr w:type="spellEnd"/>
+      <w:r>
+        <w:rPr>
+          <w:b/>
+          <w:bCs/>
+        </w:rPr>
+        <w:t xml:space="preserve"> </w:t>
+      </w:r>
+      <w:proofErr w:type="spellStart"/>
+      <w:r>
+        <w:rPr>
+          <w:b/>
+          <w:bCs/>
+        </w:rPr>
+        <w:t>Assignment</w:t>
+      </w:r>
+      <w:proofErr w:type="spellEnd"/>
+      <w:r>
+        <w:rPr>
+          <w:b/>
+          <w:bCs/>
+        </w:rPr>
+        <w:t>:</w:t>
+      </w:r>
+      <w:r>
+        <w:t xml:space="preserve"> Bir notun bir gruba nasıl atanacağını (</w:t>
+      </w:r>
+      <w:proofErr w:type="spellStart"/>
+      <w:proofErr w:type="gramStart"/>
+      <w:r>
+        <w:t>page.setGroup</w:t>
+      </w:r>
+      <w:proofErr w:type="spellEnd"/>
+      <w:proofErr w:type="gramEnd"/>
+      <w:r>
+        <w:t>(</w:t>
+      </w:r>
+      <w:proofErr w:type="spellStart"/>
+      <w:r>
+        <w:t>group</w:t>
+      </w:r>
+      <w:proofErr w:type="spellEnd"/>
+      <w:r>
+        <w:t>)) kodla.</w:t>
       </w:r>
     </w:p>
     <w:p>
@@ -2128,12 +3331,30 @@
       <w:r>
         <w:t xml:space="preserve"> </w:t>
       </w:r>
-      <w:r>
-        <w:rPr>
-          <w:b/>
-          <w:bCs/>
-        </w:rPr>
-        <w:t>Flutter - Grup Ekranı:</w:t>
+      <w:proofErr w:type="spellStart"/>
+      <w:proofErr w:type="gramStart"/>
+      <w:r>
+        <w:rPr>
+          <w:b/>
+          <w:bCs/>
+        </w:rPr>
+        <w:t>Flutter</w:t>
+      </w:r>
+      <w:proofErr w:type="spellEnd"/>
+      <w:r>
+        <w:rPr>
+          <w:b/>
+          <w:bCs/>
+        </w:rPr>
+        <w:t xml:space="preserve"> -</w:t>
+      </w:r>
+      <w:proofErr w:type="gramEnd"/>
+      <w:r>
+        <w:rPr>
+          <w:b/>
+          <w:bCs/>
+        </w:rPr>
+        <w:t xml:space="preserve"> Grup Ekranı:</w:t>
       </w:r>
       <w:r>
         <w:t xml:space="preserve"> Kullanıcının dahil olduğu grupları listele.</w:t>
@@ -2192,7 +3413,23 @@
         <w:t>UI/UX İyileştirme:</w:t>
       </w:r>
       <w:r>
-        <w:t xml:space="preserve"> Uygulamanın renklerini düzenle, bir logo ekle ve açılış ekranı (Splash Screen) yap.</w:t>
+        <w:t xml:space="preserve"> Uygulamanın renklerini düzenle, bir logo ekle ve açılış ekranı (</w:t>
+      </w:r>
+      <w:proofErr w:type="spellStart"/>
+      <w:r>
+        <w:t>Splash</w:t>
+      </w:r>
+      <w:proofErr w:type="spellEnd"/>
+      <w:r>
+        <w:t xml:space="preserve"> </w:t>
+      </w:r>
+      <w:proofErr w:type="spellStart"/>
+      <w:r>
+        <w:t>Screen</w:t>
+      </w:r>
+      <w:proofErr w:type="spellEnd"/>
+      <w:r>
+        <w:t>) yap.</w:t>
       </w:r>
     </w:p>
     <w:p>
@@ -2220,7 +3457,39 @@
         <w:t>Full Test:</w:t>
       </w:r>
       <w:r>
-        <w:t xml:space="preserve"> Kayıt ol -&gt; Giriş yap -&gt; Not ekle -&gt; Grup kur -&gt; Ortak not paylaş. Tüm akışı telefonda test et.</w:t>
+        <w:t xml:space="preserve"> Kayıt </w:t>
+      </w:r>
+      <w:proofErr w:type="gramStart"/>
+      <w:r>
+        <w:t>ol -</w:t>
+      </w:r>
+      <w:proofErr w:type="gramEnd"/>
+      <w:r>
+        <w:t xml:space="preserve">&gt; Giriş </w:t>
+      </w:r>
+      <w:proofErr w:type="gramStart"/>
+      <w:r>
+        <w:t>yap -</w:t>
+      </w:r>
+      <w:proofErr w:type="gramEnd"/>
+      <w:r>
+        <w:t xml:space="preserve">&gt; Not </w:t>
+      </w:r>
+      <w:proofErr w:type="gramStart"/>
+      <w:r>
+        <w:t>ekle -</w:t>
+      </w:r>
+      <w:proofErr w:type="gramEnd"/>
+      <w:r>
+        <w:t xml:space="preserve">&gt; Grup </w:t>
+      </w:r>
+      <w:proofErr w:type="gramStart"/>
+      <w:r>
+        <w:t>kur -</w:t>
+      </w:r>
+      <w:proofErr w:type="gramEnd"/>
+      <w:r>
+        <w:t>&gt; Ortak not paylaş. Tüm akışı telefonda test et.</w:t>
       </w:r>
     </w:p>
     <w:p>
@@ -2240,15 +3509,32 @@
       <w:r>
         <w:t xml:space="preserve"> </w:t>
       </w:r>
-      <w:r>
-        <w:rPr>
-          <w:b/>
-          <w:bCs/>
-        </w:rPr>
-        <w:t>Release:</w:t>
-      </w:r>
-      <w:r>
-        <w:t xml:space="preserve"> Uygulamanın APK'sını al ve bir arkadaşının telefonuna kurup dene!</w:t>
+      <w:proofErr w:type="spellStart"/>
+      <w:r>
+        <w:rPr>
+          <w:b/>
+          <w:bCs/>
+        </w:rPr>
+        <w:t>Release</w:t>
+      </w:r>
+      <w:proofErr w:type="spellEnd"/>
+      <w:r>
+        <w:rPr>
+          <w:b/>
+          <w:bCs/>
+        </w:rPr>
+        <w:t>:</w:t>
+      </w:r>
+      <w:r>
+        <w:t xml:space="preserve"> Uygulamanın </w:t>
+      </w:r>
+      <w:proofErr w:type="spellStart"/>
+      <w:r>
+        <w:t>APK'sını</w:t>
+      </w:r>
+      <w:proofErr w:type="spellEnd"/>
+      <w:r>
+        <w:t xml:space="preserve"> al ve bir arkadaşının telefonuna kurup dene!</w:t>
       </w:r>
     </w:p>
     <w:p>
@@ -2270,7 +3556,23 @@
           <w:b/>
           <w:bCs/>
         </w:rPr>
-        <w:t>Başarı İçin 3 Altın Kural:</w:t>
+        <w:t xml:space="preserve">Başarı </w:t>
+      </w:r>
+      <w:proofErr w:type="gramStart"/>
+      <w:r>
+        <w:rPr>
+          <w:b/>
+          <w:bCs/>
+        </w:rPr>
+        <w:t>İçin</w:t>
+      </w:r>
+      <w:proofErr w:type="gramEnd"/>
+      <w:r>
+        <w:rPr>
+          <w:b/>
+          <w:bCs/>
+        </w:rPr>
+        <w:t xml:space="preserve"> 3 Altın Kural:</w:t>
       </w:r>
     </w:p>
     <w:p>
@@ -2280,15 +3582,56 @@
           <w:numId w:val="11"/>
         </w:numPr>
       </w:pPr>
-      <w:r>
-        <w:rPr>
-          <w:b/>
-          <w:bCs/>
-        </w:rPr>
-        <w:t>Backend Önce Gelir:</w:t>
-      </w:r>
-      <w:r>
-        <w:t xml:space="preserve"> Backend'de bir özellik (örn: silme) çalışmıyorsa Flutter'da onu kodlamaya çalışma. Önce Postman'de gör.</w:t>
+      <w:proofErr w:type="spellStart"/>
+      <w:r>
+        <w:rPr>
+          <w:b/>
+          <w:bCs/>
+        </w:rPr>
+        <w:t>Backend</w:t>
+      </w:r>
+      <w:proofErr w:type="spellEnd"/>
+      <w:r>
+        <w:rPr>
+          <w:b/>
+          <w:bCs/>
+        </w:rPr>
+        <w:t xml:space="preserve"> Önce Gelir:</w:t>
+      </w:r>
+      <w:r>
+        <w:t xml:space="preserve"> </w:t>
+      </w:r>
+      <w:proofErr w:type="spellStart"/>
+      <w:r>
+        <w:t>Backend'de</w:t>
+      </w:r>
+      <w:proofErr w:type="spellEnd"/>
+      <w:r>
+        <w:t xml:space="preserve"> bir özellik (</w:t>
+      </w:r>
+      <w:proofErr w:type="spellStart"/>
+      <w:r>
+        <w:t>örn</w:t>
+      </w:r>
+      <w:proofErr w:type="spellEnd"/>
+      <w:r>
+        <w:t xml:space="preserve">: silme) çalışmıyorsa </w:t>
+      </w:r>
+      <w:proofErr w:type="spellStart"/>
+      <w:r>
+        <w:t>Flutter'da</w:t>
+      </w:r>
+      <w:proofErr w:type="spellEnd"/>
+      <w:r>
+        <w:t xml:space="preserve"> onu kodlamaya çalışma. Önce </w:t>
+      </w:r>
+      <w:proofErr w:type="spellStart"/>
+      <w:r>
+        <w:t>Postman'de</w:t>
+      </w:r>
+      <w:proofErr w:type="spellEnd"/>
+      <w:r>
+        <w:t xml:space="preserve"> gör.</w:t>
       </w:r>
     </w:p>
     <w:p>
@@ -2324,7 +3667,47 @@
         <w:t>Hata Almaktan Korkma:</w:t>
       </w:r>
       <w:r>
-        <w:t xml:space="preserve"> Xiaomi telefonunda "Install via USB" hatası alırsan veya Spring'de "403 Forbidden" görürsen durma, o hatayı çözmek sana en büyük tecrübeyi katacak.</w:t>
+        <w:t xml:space="preserve"> </w:t>
+      </w:r>
+      <w:proofErr w:type="spellStart"/>
+      <w:r>
+        <w:t>Xiaomi</w:t>
+      </w:r>
+      <w:proofErr w:type="spellEnd"/>
+      <w:r>
+        <w:t xml:space="preserve"> telefonunda "</w:t>
+      </w:r>
+      <w:proofErr w:type="spellStart"/>
+      <w:r>
+        <w:t>Install</w:t>
+      </w:r>
+      <w:proofErr w:type="spellEnd"/>
+      <w:r>
+        <w:t xml:space="preserve"> </w:t>
+      </w:r>
+      <w:proofErr w:type="spellStart"/>
+      <w:r>
+        <w:t>via</w:t>
+      </w:r>
+      <w:proofErr w:type="spellEnd"/>
+      <w:r>
+        <w:t xml:space="preserve"> USB" hatası alırsan veya </w:t>
+      </w:r>
+      <w:proofErr w:type="spellStart"/>
+      <w:r>
+        <w:t>Spring'de</w:t>
+      </w:r>
+      <w:proofErr w:type="spellEnd"/>
+      <w:r>
+        <w:t xml:space="preserve"> "403 </w:t>
+      </w:r>
+      <w:proofErr w:type="spellStart"/>
+      <w:r>
+        <w:t>Forbidden</w:t>
+      </w:r>
+      <w:proofErr w:type="spellEnd"/>
+      <w:r>
+        <w:t>" görürsen durma, o hatayı çözmek sana en büyük tecrübeyi katacak.</w:t>
       </w:r>
     </w:p>
     <w:p/>
@@ -2336,19 +3719,133 @@
     <w:p>
       <w:r>
         <w:lastRenderedPageBreak/>
-        <w:t>19.04.2026 – group service/controller yapısı kurulduktan sonra page işlemlerini düzenle/göz at(request response yapısı),bir notun gruplu veya grupsuz olacağı durumlarında ayrı fonksiyonmu kullanılacak karar ver.</w:t>
-      </w:r>
-    </w:p>
-    <w:p>
-      <w:r>
-        <w:t>Mevcut controllerlar çalışıyor.</w:t>
+        <w:t xml:space="preserve">19.04.2026 – </w:t>
+      </w:r>
+      <w:proofErr w:type="spellStart"/>
+      <w:r>
+        <w:t>group</w:t>
+      </w:r>
+      <w:proofErr w:type="spellEnd"/>
+      <w:r>
+        <w:t xml:space="preserve"> service/</w:t>
+      </w:r>
+      <w:proofErr w:type="spellStart"/>
+      <w:r>
+        <w:t>controller</w:t>
+      </w:r>
+      <w:proofErr w:type="spellEnd"/>
+      <w:r>
+        <w:t xml:space="preserve"> yapısı kurulduktan sonra </w:t>
+      </w:r>
+      <w:proofErr w:type="spellStart"/>
+      <w:r>
+        <w:t>page</w:t>
+      </w:r>
+      <w:proofErr w:type="spellEnd"/>
+      <w:r>
+        <w:t xml:space="preserve"> işlemlerini düzenle/göz </w:t>
+      </w:r>
+      <w:proofErr w:type="gramStart"/>
+      <w:r>
+        <w:t>at(</w:t>
+      </w:r>
+      <w:proofErr w:type="spellStart"/>
+      <w:proofErr w:type="gramEnd"/>
+      <w:r>
+        <w:t>request</w:t>
+      </w:r>
+      <w:proofErr w:type="spellEnd"/>
+      <w:r>
+        <w:t xml:space="preserve"> </w:t>
+      </w:r>
+      <w:proofErr w:type="spellStart"/>
+      <w:r>
+        <w:t>response</w:t>
+      </w:r>
+      <w:proofErr w:type="spellEnd"/>
+      <w:r>
+        <w:t xml:space="preserve"> yapısı</w:t>
+      </w:r>
+      <w:proofErr w:type="gramStart"/>
+      <w:r>
+        <w:t>),bir</w:t>
+      </w:r>
+      <w:proofErr w:type="gramEnd"/>
+      <w:r>
+        <w:t xml:space="preserve"> notun gruplu veya grupsuz olacağı durumlarında ayrı </w:t>
+      </w:r>
+      <w:proofErr w:type="spellStart"/>
+      <w:r>
+        <w:t>fonksiyonmu</w:t>
+      </w:r>
+      <w:proofErr w:type="spellEnd"/>
+      <w:r>
+        <w:t xml:space="preserve"> kullanılacak karar ver.</w:t>
+      </w:r>
+    </w:p>
+    <w:p>
+      <w:r>
+        <w:t xml:space="preserve">Mevcut </w:t>
+      </w:r>
+      <w:proofErr w:type="spellStart"/>
+      <w:r>
+        <w:t>controllerlar</w:t>
+      </w:r>
+      <w:proofErr w:type="spellEnd"/>
+      <w:r>
+        <w:t xml:space="preserve"> çalışıyor.</w:t>
       </w:r>
     </w:p>
     <w:p/>
     <w:p/>
     <w:p>
-      <w:r>
-        <w:t>GlobalexceptionHandler a genel ayar çek,</w:t>
+      <w:proofErr w:type="spellStart"/>
+      <w:r>
+        <w:rPr>
+          <w:highlight w:val="yellow"/>
+        </w:rPr>
+        <w:t>GlobalexceptionHandler</w:t>
+      </w:r>
+      <w:proofErr w:type="spellEnd"/>
+      <w:r>
+        <w:rPr>
+          <w:highlight w:val="yellow"/>
+        </w:rPr>
+        <w:t xml:space="preserve"> a genel ayar çek,</w:t>
+      </w:r>
+      <w:r>
+        <w:rPr>
+          <w:highlight w:val="yellow"/>
+        </w:rPr>
+        <w:t xml:space="preserve"> UPDATE </w:t>
+      </w:r>
+      <w:proofErr w:type="spellStart"/>
+      <w:r>
+        <w:rPr>
+          <w:highlight w:val="yellow"/>
+        </w:rPr>
+        <w:t>endpoint</w:t>
+      </w:r>
+      <w:proofErr w:type="spellEnd"/>
+      <w:r>
+        <w:rPr>
+          <w:highlight w:val="yellow"/>
+        </w:rPr>
+        <w:t xml:space="preserve"> </w:t>
+      </w:r>
+      <w:proofErr w:type="spellStart"/>
+      <w:r>
+        <w:rPr>
+          <w:highlight w:val="yellow"/>
+        </w:rPr>
+        <w:t>lerini</w:t>
+      </w:r>
+      <w:proofErr w:type="spellEnd"/>
+      <w:r>
+        <w:rPr>
+          <w:highlight w:val="yellow"/>
+        </w:rPr>
+        <w:t xml:space="preserve"> tekrar yaz</w:t>
       </w:r>
     </w:p>
     <w:sectPr>

</xml_diff>

<commit_message>
feat: implement file storage service with S3 integration and attachment management
</commit_message>
<xml_diff>
--- a/Rapor.docx
+++ b/Rapor.docx
@@ -400,14 +400,97 @@
       </w:r>
     </w:p>
     <w:p/>
+    <w:p/>
     <w:p>
       <w:r>
-        <w:br w:type="page"/>
+        <w:t>A</w:t>
+      </w:r>
+      <w:r>
+        <w:t>dmin paneli eklenebilir sonra</w:t>
       </w:r>
     </w:p>
     <w:p>
       <w:r>
+        <w:t>İleride bu yapının çok daha performanslı çalışması için uygulayabileceğimiz iki harika Clean Code stratejisi var:</w:t>
+      </w:r>
+    </w:p>
+    <w:p/>
+    <w:p>
+      <w:r>
         <w:lastRenderedPageBreak/>
+        <w:t>Asenkron Yükleme (Thread/Task): Şu anki kodumuzda s3Client.putObject işlemi bitene kadar HTTP isteği bloklanıyor (bekliyor). İleride dosyayı arka planda (@Async kullanarak) yükletip, kullanıcıya anında "Yükleme başlatıldı" yanıtı dönebiliriz.</w:t>
+      </w:r>
+    </w:p>
+    <w:p/>
+    <w:p>
+      <w:pPr>
+        <w:rPr>
+          <w:b/>
+          <w:bCs/>
+        </w:rPr>
+      </w:pPr>
+      <w:r>
+        <w:t>Doğrudan Buluttan Okuma: Dosya yüklenirken backend'den geçiyor ama dosyayı okurken/görüntülerken Spring Boot hiç yorulmuyor. Flutter direkt olarak veri tabanından gelen public fileUrl adresine istek atıp dosyayı Supabase üzerinden çok hızlı bir şekilde (CDN avantajıyla) indiriyor.</w:t>
+      </w:r>
+      <w:r>
+        <w:br w:type="page"/>
+      </w:r>
+      <w:r>
+        <w:rPr>
+          <w:b/>
+          <w:bCs/>
+        </w:rPr>
+        <w:lastRenderedPageBreak/>
+        <w:t xml:space="preserve">Flutter (Frontend) ve AI Chatbot için Mimari İpuçları </w:t>
+      </w:r>
+      <w:r>
+        <w:rPr>
+          <w:rFonts w:ascii="Segoe UI Emoji" w:hAnsi="Segoe UI Emoji" w:cs="Segoe UI Emoji"/>
+          <w:b/>
+          <w:bCs/>
+        </w:rPr>
+        <w:t>💡</w:t>
+      </w:r>
+    </w:p>
+    <w:p>
+      <w:pPr>
+        <w:numPr>
+          <w:ilvl w:val="0"/>
+          <w:numId w:val="14"/>
+        </w:numPr>
+      </w:pPr>
+      <w:r>
+        <w:rPr>
+          <w:b/>
+          <w:bCs/>
+        </w:rPr>
+        <w:t>Flutter Entegrasyonu:</w:t>
+      </w:r>
+      <w:r>
+        <w:t xml:space="preserve"> Flutter tarafında dio paketini kullanarak bir FormData nesnesi oluşturmalı ve dosyayı MultipartFile.fromFile ile sarmalayıp göndermelisin. Gelen fileUrl bilgisini Flutter direkt olarak NetworkImage veya uygun dosya görüntüleyiciler ile ekrana basabilir.</w:t>
+      </w:r>
+    </w:p>
+    <w:p>
+      <w:pPr>
+        <w:numPr>
+          <w:ilvl w:val="0"/>
+          <w:numId w:val="14"/>
+        </w:numPr>
+      </w:pPr>
+      <w:r>
+        <w:rPr>
+          <w:b/>
+          <w:bCs/>
+        </w:rPr>
+        <w:t>AI Chatbot (Spring AI Hazırlığı):</w:t>
+      </w:r>
+      <w:r>
+        <w:t xml:space="preserve"> İleride entegre edeceğimiz yapay zeka ajanına bir notu (Page) analiz etmesini söylediğimizde, yapay zeka page.getAttachments() listesine bakacak. Eğer orada bir resim (image/png) veya doküman (application/pdf) varsa, Spring AI'ın multimodal desteği sayesinde bu URL'i doğrudan LLM'e girdi (context) olarak besleyebileceğiz. Veritabanımız hiçbir zaman devasa ikili (binary) dosyalarla yorulmayacak.</w:t>
+      </w:r>
+    </w:p>
+    <w:p/>
+    <w:p>
+      <w:r>
         <w:t>19.04.2026 – group service/controller yapısı kurulduktan sonra page işlemlerini düzenle/göz at(request response yapısı),bir notun gruplu veya grupsuz olacağı durumlarında ayrı fonksiyonmu kullanılacak karar ver.</w:t>
       </w:r>
     </w:p>
@@ -2199,6 +2282,119 @@
         <w:rFonts w:ascii="Wingdings" w:hAnsi="Wingdings" w:hint="default"/>
         <w:sz w:val="20"/>
       </w:rPr>
+    </w:lvl>
+  </w:abstractNum>
+  <w:abstractNum w:abstractNumId="13" w15:restartNumberingAfterBreak="0">
+    <w:nsid w:val="5E925E9C"/>
+    <w:multiLevelType w:val="multilevel"/>
+    <w:tmpl w:val="8CF8AE60"/>
+    <w:lvl w:ilvl="0">
+      <w:start w:val="1"/>
+      <w:numFmt w:val="decimal"/>
+      <w:lvlText w:val="%1."/>
+      <w:lvlJc w:val="left"/>
+      <w:pPr>
+        <w:tabs>
+          <w:tab w:val="num" w:pos="720"/>
+        </w:tabs>
+        <w:ind w:left="720" w:hanging="360"/>
+      </w:pPr>
+    </w:lvl>
+    <w:lvl w:ilvl="1" w:tentative="1">
+      <w:start w:val="1"/>
+      <w:numFmt w:val="decimal"/>
+      <w:lvlText w:val="%2."/>
+      <w:lvlJc w:val="left"/>
+      <w:pPr>
+        <w:tabs>
+          <w:tab w:val="num" w:pos="1440"/>
+        </w:tabs>
+        <w:ind w:left="1440" w:hanging="360"/>
+      </w:pPr>
+    </w:lvl>
+    <w:lvl w:ilvl="2" w:tentative="1">
+      <w:start w:val="1"/>
+      <w:numFmt w:val="decimal"/>
+      <w:lvlText w:val="%3."/>
+      <w:lvlJc w:val="left"/>
+      <w:pPr>
+        <w:tabs>
+          <w:tab w:val="num" w:pos="2160"/>
+        </w:tabs>
+        <w:ind w:left="2160" w:hanging="360"/>
+      </w:pPr>
+    </w:lvl>
+    <w:lvl w:ilvl="3" w:tentative="1">
+      <w:start w:val="1"/>
+      <w:numFmt w:val="decimal"/>
+      <w:lvlText w:val="%4."/>
+      <w:lvlJc w:val="left"/>
+      <w:pPr>
+        <w:tabs>
+          <w:tab w:val="num" w:pos="2880"/>
+        </w:tabs>
+        <w:ind w:left="2880" w:hanging="360"/>
+      </w:pPr>
+    </w:lvl>
+    <w:lvl w:ilvl="4" w:tentative="1">
+      <w:start w:val="1"/>
+      <w:numFmt w:val="decimal"/>
+      <w:lvlText w:val="%5."/>
+      <w:lvlJc w:val="left"/>
+      <w:pPr>
+        <w:tabs>
+          <w:tab w:val="num" w:pos="3600"/>
+        </w:tabs>
+        <w:ind w:left="3600" w:hanging="360"/>
+      </w:pPr>
+    </w:lvl>
+    <w:lvl w:ilvl="5" w:tentative="1">
+      <w:start w:val="1"/>
+      <w:numFmt w:val="decimal"/>
+      <w:lvlText w:val="%6."/>
+      <w:lvlJc w:val="left"/>
+      <w:pPr>
+        <w:tabs>
+          <w:tab w:val="num" w:pos="4320"/>
+        </w:tabs>
+        <w:ind w:left="4320" w:hanging="360"/>
+      </w:pPr>
+    </w:lvl>
+    <w:lvl w:ilvl="6" w:tentative="1">
+      <w:start w:val="1"/>
+      <w:numFmt w:val="decimal"/>
+      <w:lvlText w:val="%7."/>
+      <w:lvlJc w:val="left"/>
+      <w:pPr>
+        <w:tabs>
+          <w:tab w:val="num" w:pos="5040"/>
+        </w:tabs>
+        <w:ind w:left="5040" w:hanging="360"/>
+      </w:pPr>
+    </w:lvl>
+    <w:lvl w:ilvl="7" w:tentative="1">
+      <w:start w:val="1"/>
+      <w:numFmt w:val="decimal"/>
+      <w:lvlText w:val="%8."/>
+      <w:lvlJc w:val="left"/>
+      <w:pPr>
+        <w:tabs>
+          <w:tab w:val="num" w:pos="5760"/>
+        </w:tabs>
+        <w:ind w:left="5760" w:hanging="360"/>
+      </w:pPr>
+    </w:lvl>
+    <w:lvl w:ilvl="8" w:tentative="1">
+      <w:start w:val="1"/>
+      <w:numFmt w:val="decimal"/>
+      <w:lvlText w:val="%9."/>
+      <w:lvlJc w:val="left"/>
+      <w:pPr>
+        <w:tabs>
+          <w:tab w:val="num" w:pos="6480"/>
+        </w:tabs>
+        <w:ind w:left="6480" w:hanging="360"/>
+      </w:pPr>
     </w:lvl>
   </w:abstractNum>
   <w:num w:numId="1" w16cid:durableId="1835801531">
@@ -2239,6 +2435,9 @@
   </w:num>
   <w:num w:numId="13" w16cid:durableId="203098334">
     <w:abstractNumId w:val="11"/>
+  </w:num>
+  <w:num w:numId="14" w16cid:durableId="362554874">
+    <w:abstractNumId w:val="13"/>
   </w:num>
 </w:numbering>
 </file>

</xml_diff>

<commit_message>
feat: enhance file storage and attachment management, update documentation and schema
</commit_message>
<xml_diff>
--- a/Rapor.docx
+++ b/Rapor.docx
@@ -41,9 +41,144 @@
         <w:t>AI CHATBOT</w:t>
       </w:r>
     </w:p>
-    <w:p/>
-    <w:p/>
-    <w:p/>
+    <w:p>
+      <w:pPr>
+        <w:rPr>
+          <w:rStyle w:val="KitapBal"/>
+        </w:rPr>
+      </w:pPr>
+    </w:p>
+    <w:p>
+      <w:pPr>
+        <w:rPr>
+          <w:rStyle w:val="KitapBal"/>
+        </w:rPr>
+      </w:pPr>
+      <w:r>
+        <w:rPr>
+          <w:rStyle w:val="KitapBal"/>
+        </w:rPr>
+        <w:t>!!! GUVENLIK SORUNU</w:t>
+      </w:r>
+      <w:r>
+        <w:rPr>
+          <w:rStyle w:val="KitapBal"/>
+        </w:rPr>
+        <w:t>!!!</w:t>
+      </w:r>
+    </w:p>
+    <w:p>
+      <w:pPr>
+        <w:rPr>
+          <w:rStyle w:val="KitapBal"/>
+        </w:rPr>
+      </w:pPr>
+      <w:r>
+        <w:rPr>
+          <w:rStyle w:val="KitapBal"/>
+        </w:rPr>
+        <w:t xml:space="preserve"> </w:t>
+      </w:r>
+      <w:proofErr w:type="spellStart"/>
+      <w:r>
+        <w:rPr>
+          <w:rStyle w:val="KitapBal"/>
+        </w:rPr>
+        <w:t>Eger</w:t>
+      </w:r>
+      <w:proofErr w:type="spellEnd"/>
+      <w:r>
+        <w:rPr>
+          <w:rStyle w:val="KitapBal"/>
+        </w:rPr>
+        <w:t xml:space="preserve"> </w:t>
+      </w:r>
+      <w:proofErr w:type="spellStart"/>
+      <w:r>
+        <w:rPr>
+          <w:rStyle w:val="KitapBal"/>
+        </w:rPr>
+        <w:t>istegi</w:t>
+      </w:r>
+      <w:proofErr w:type="spellEnd"/>
+      <w:r>
+        <w:rPr>
+          <w:rStyle w:val="KitapBal"/>
+        </w:rPr>
+        <w:t xml:space="preserve"> atan kullanıcı grup </w:t>
+      </w:r>
+      <w:proofErr w:type="spellStart"/>
+      <w:r>
+        <w:rPr>
+          <w:rStyle w:val="KitapBal"/>
+        </w:rPr>
+        <w:t>uyesi</w:t>
+      </w:r>
+      <w:proofErr w:type="spellEnd"/>
+      <w:r>
+        <w:rPr>
+          <w:rStyle w:val="KitapBal"/>
+        </w:rPr>
+        <w:t xml:space="preserve"> ise  gruba bakılmaksızın </w:t>
+      </w:r>
+      <w:proofErr w:type="spellStart"/>
+      <w:r>
+        <w:rPr>
+          <w:rStyle w:val="KitapBal"/>
+        </w:rPr>
+        <w:t>istedigi</w:t>
+      </w:r>
+      <w:proofErr w:type="spellEnd"/>
+      <w:r>
+        <w:rPr>
+          <w:rStyle w:val="KitapBal"/>
+        </w:rPr>
+        <w:t xml:space="preserve"> herhangi bir </w:t>
+      </w:r>
+      <w:proofErr w:type="spellStart"/>
+      <w:r>
+        <w:rPr>
+          <w:rStyle w:val="KitapBal"/>
+        </w:rPr>
+        <w:t>page</w:t>
+      </w:r>
+      <w:proofErr w:type="spellEnd"/>
+      <w:r>
+        <w:rPr>
+          <w:rStyle w:val="KitapBal"/>
+        </w:rPr>
+        <w:t xml:space="preserve"> in </w:t>
+      </w:r>
+      <w:proofErr w:type="spellStart"/>
+      <w:r>
+        <w:rPr>
+          <w:rStyle w:val="KitapBal"/>
+        </w:rPr>
+        <w:t>ıd</w:t>
+      </w:r>
+      <w:proofErr w:type="spellEnd"/>
+      <w:r>
+        <w:rPr>
+          <w:rStyle w:val="KitapBal"/>
+        </w:rPr>
+        <w:t xml:space="preserve"> sini tahmin ederek </w:t>
+      </w:r>
+      <w:proofErr w:type="spellStart"/>
+      <w:r>
+        <w:rPr>
+          <w:rStyle w:val="KitapBal"/>
+        </w:rPr>
+        <w:t>degiştirebiliyor</w:t>
+      </w:r>
+      <w:proofErr w:type="spellEnd"/>
+    </w:p>
+    <w:p>
+      <w:pPr>
+        <w:rPr>
+          <w:color w:val="77206D" w:themeColor="accent5" w:themeShade="BF"/>
+        </w:rPr>
+      </w:pPr>
+    </w:p>
     <w:p>
       <w:r>
         <w:rPr>
@@ -53,7 +188,31 @@
         <w:t>Spring AI</w:t>
       </w:r>
       <w:r>
-        <w:t xml:space="preserve">, Spring ekosisteminin yapay zeka modelleriyle (OpenAI, Google Gemini, Anthropic Claude vb.) entegrasyonunu kolaylaştırmak için resmi olarak geliştirdiği harika bir kütüphanedir. Tıpkı veritabanı işlerini kolaylaştıran </w:t>
+        <w:t>, Spring ekosisteminin yapay zeka modelleriyle (</w:t>
+      </w:r>
+      <w:proofErr w:type="spellStart"/>
+      <w:r>
+        <w:t>OpenAI</w:t>
+      </w:r>
+      <w:proofErr w:type="spellEnd"/>
+      <w:r>
+        <w:t xml:space="preserve">, Google Gemini, </w:t>
+      </w:r>
+      <w:proofErr w:type="spellStart"/>
+      <w:r>
+        <w:t>Anthropic</w:t>
+      </w:r>
+      <w:proofErr w:type="spellEnd"/>
+      <w:r>
+        <w:t xml:space="preserve"> Claude vb.) entegrasyonunu kolaylaştırmak için resmi olarak geliştirdiği harika bir kütüphanedir. Tıpkı </w:t>
+      </w:r>
+      <w:proofErr w:type="spellStart"/>
+      <w:r>
+        <w:t>veritabanı</w:t>
+      </w:r>
+      <w:proofErr w:type="spellEnd"/>
+      <w:r>
+        <w:t xml:space="preserve"> işlerini kolaylaştıran </w:t>
       </w:r>
       <w:r>
         <w:rPr>
@@ -78,7 +237,39 @@
     </w:p>
     <w:p>
       <w:r>
-        <w:t>Normalde yapay zeka API'lerine bağlanmak için her şirketin kendi kütüphanesini öğrenmen veya HTTP istekleri yazman gerekirken, Spring AI sana tek bir arayüz sağlar. Yarın bir gün projedeki yapay zekayı Gemini'dan OpenAI'a taşımak istersen, Java kodunu neredeyse hiç değiştirmeden sadece pom.xml ve application.properties dosyalarını güncelleyerek bunu yapabilirsin.</w:t>
+        <w:t xml:space="preserve">Normalde yapay zeka </w:t>
+      </w:r>
+      <w:proofErr w:type="spellStart"/>
+      <w:r>
+        <w:t>API'lerine</w:t>
+      </w:r>
+      <w:proofErr w:type="spellEnd"/>
+      <w:r>
+        <w:t xml:space="preserve"> bağlanmak için her şirketin kendi kütüphanesini öğrenmen veya HTTP istekleri yazman gerekirken, Spring AI sana tek bir arayüz sağlar. Yarın bir gün projedeki yapay zekayı </w:t>
+      </w:r>
+      <w:proofErr w:type="spellStart"/>
+      <w:r>
+        <w:t>Gemini'dan</w:t>
+      </w:r>
+      <w:proofErr w:type="spellEnd"/>
+      <w:r>
+        <w:t xml:space="preserve"> </w:t>
+      </w:r>
+      <w:proofErr w:type="spellStart"/>
+      <w:r>
+        <w:t>OpenAI'a</w:t>
+      </w:r>
+      <w:proofErr w:type="spellEnd"/>
+      <w:r>
+        <w:t xml:space="preserve"> taşımak istersen, Java kodunu neredeyse hiç değiştirmeden sadece pom.xml ve </w:t>
+      </w:r>
+      <w:proofErr w:type="spellStart"/>
+      <w:r>
+        <w:t>application.properties</w:t>
+      </w:r>
+      <w:proofErr w:type="spellEnd"/>
+      <w:r>
+        <w:t xml:space="preserve"> dosyalarını güncelleyerek bunu yapabilirsin.</w:t>
       </w:r>
     </w:p>
     <w:p>
@@ -101,13 +292,30 @@
           <w:b/>
           <w:bCs/>
         </w:rPr>
-        <w:t xml:space="preserve"> Spring AI'ın Temel Yapı Taşları</w:t>
+        <w:t xml:space="preserve"> Spring </w:t>
+      </w:r>
+      <w:proofErr w:type="spellStart"/>
+      <w:r>
+        <w:rPr>
+          <w:b/>
+          <w:bCs/>
+        </w:rPr>
+        <w:t>AI'ın</w:t>
+      </w:r>
+      <w:proofErr w:type="spellEnd"/>
+      <w:r>
+        <w:rPr>
+          <w:b/>
+          <w:bCs/>
+        </w:rPr>
+        <w:t xml:space="preserve"> Temel Yapı Taşları</w:t>
       </w:r>
     </w:p>
     <w:p>
       <w:r>
         <w:t xml:space="preserve">Spring AI sadece basit bir sohbet kütüphanesi değildir. Bir not uygulaması olan </w:t>
       </w:r>
+      <w:proofErr w:type="spellStart"/>
       <w:r>
         <w:rPr>
           <w:b/>
@@ -115,6 +323,7 @@
         </w:rPr>
         <w:t>NoteP</w:t>
       </w:r>
+      <w:proofErr w:type="spellEnd"/>
       <w:r>
         <w:t xml:space="preserve"> için biçilmiş kaftan olmasını sağlayan 3 devasa özelliği vardır:</w:t>
       </w:r>
@@ -131,27 +340,91 @@
           <w:b/>
           <w:bCs/>
         </w:rPr>
-        <w:t>1. ChatClient &amp; ChatModel (Model Bağımsızlığı)</w:t>
-      </w:r>
-    </w:p>
-    <w:p>
-      <w:r>
-        <w:t>Yapay zekaya soru sorup cevap aldığın ana yapıdır. Kodunda ChatModel arayüzünü kullanırsın. Arkada Google Gemini mı var yoksa OpenAI mı var, kodun bunu umursamaz.</w:t>
-      </w:r>
-    </w:p>
-    <w:p>
-      <w:pPr>
-        <w:rPr>
-          <w:b/>
-          <w:bCs/>
-        </w:rPr>
-      </w:pPr>
-      <w:r>
-        <w:rPr>
-          <w:b/>
-          <w:bCs/>
-        </w:rPr>
-        <w:t>2. Embeddings (Notları Vektöre Çevirme)</w:t>
+        <w:t xml:space="preserve">1. </w:t>
+      </w:r>
+      <w:proofErr w:type="spellStart"/>
+      <w:r>
+        <w:rPr>
+          <w:b/>
+          <w:bCs/>
+        </w:rPr>
+        <w:t>ChatClient</w:t>
+      </w:r>
+      <w:proofErr w:type="spellEnd"/>
+      <w:r>
+        <w:rPr>
+          <w:b/>
+          <w:bCs/>
+        </w:rPr>
+        <w:t xml:space="preserve"> &amp; </w:t>
+      </w:r>
+      <w:proofErr w:type="spellStart"/>
+      <w:r>
+        <w:rPr>
+          <w:b/>
+          <w:bCs/>
+        </w:rPr>
+        <w:t>ChatModel</w:t>
+      </w:r>
+      <w:proofErr w:type="spellEnd"/>
+      <w:r>
+        <w:rPr>
+          <w:b/>
+          <w:bCs/>
+        </w:rPr>
+        <w:t xml:space="preserve"> (Model Bağımsızlığı)</w:t>
+      </w:r>
+    </w:p>
+    <w:p>
+      <w:r>
+        <w:t xml:space="preserve">Yapay zekaya soru sorup cevap aldığın ana yapıdır. Kodunda </w:t>
+      </w:r>
+      <w:proofErr w:type="spellStart"/>
+      <w:r>
+        <w:t>ChatModel</w:t>
+      </w:r>
+      <w:proofErr w:type="spellEnd"/>
+      <w:r>
+        <w:t xml:space="preserve"> arayüzünü kullanırsın. Arkada Google Gemini mı var yoksa </w:t>
+      </w:r>
+      <w:proofErr w:type="spellStart"/>
+      <w:r>
+        <w:t>OpenAI</w:t>
+      </w:r>
+      <w:proofErr w:type="spellEnd"/>
+      <w:r>
+        <w:t xml:space="preserve"> mı var, kodun bunu umursamaz.</w:t>
+      </w:r>
+    </w:p>
+    <w:p>
+      <w:pPr>
+        <w:rPr>
+          <w:b/>
+          <w:bCs/>
+        </w:rPr>
+      </w:pPr>
+      <w:r>
+        <w:rPr>
+          <w:b/>
+          <w:bCs/>
+        </w:rPr>
+        <w:t xml:space="preserve">2. </w:t>
+      </w:r>
+      <w:proofErr w:type="spellStart"/>
+      <w:r>
+        <w:rPr>
+          <w:b/>
+          <w:bCs/>
+        </w:rPr>
+        <w:t>Embeddings</w:t>
+      </w:r>
+      <w:proofErr w:type="spellEnd"/>
+      <w:r>
+        <w:rPr>
+          <w:b/>
+          <w:bCs/>
+        </w:rPr>
+        <w:t xml:space="preserve"> (Notları Vektöre Çevirme)</w:t>
       </w:r>
     </w:p>
     <w:p>
@@ -171,12 +444,101 @@
           <w:b/>
           <w:bCs/>
         </w:rPr>
-        <w:t>3. Vector Databases (Vektör Veritabanları)</w:t>
-      </w:r>
-    </w:p>
-    <w:p>
-      <w:r>
-        <w:t xml:space="preserve">Vektöre dönüştürülen notlar, geleneksel veritabanları yerine Pgvector (PostgreSQL eklentisi), Pinecone veya Milvus gibi vektör veritabanlarında saklanır. Bir kullanıcı chatbot'a </w:t>
+        <w:t xml:space="preserve">3. </w:t>
+      </w:r>
+      <w:proofErr w:type="spellStart"/>
+      <w:r>
+        <w:rPr>
+          <w:b/>
+          <w:bCs/>
+        </w:rPr>
+        <w:t>Vector</w:t>
+      </w:r>
+      <w:proofErr w:type="spellEnd"/>
+      <w:r>
+        <w:rPr>
+          <w:b/>
+          <w:bCs/>
+        </w:rPr>
+        <w:t xml:space="preserve"> Databases (Vektör </w:t>
+      </w:r>
+      <w:proofErr w:type="spellStart"/>
+      <w:r>
+        <w:rPr>
+          <w:b/>
+          <w:bCs/>
+        </w:rPr>
+        <w:t>Veritabanları</w:t>
+      </w:r>
+      <w:proofErr w:type="spellEnd"/>
+      <w:r>
+        <w:rPr>
+          <w:b/>
+          <w:bCs/>
+        </w:rPr>
+        <w:t>)</w:t>
+      </w:r>
+    </w:p>
+    <w:p>
+      <w:r>
+        <w:t xml:space="preserve">Vektöre dönüştürülen notlar, geleneksel </w:t>
+      </w:r>
+      <w:proofErr w:type="spellStart"/>
+      <w:r>
+        <w:t>veritabanları</w:t>
+      </w:r>
+      <w:proofErr w:type="spellEnd"/>
+      <w:r>
+        <w:t xml:space="preserve"> yerine </w:t>
+      </w:r>
+      <w:proofErr w:type="spellStart"/>
+      <w:r>
+        <w:t>Pgvector</w:t>
+      </w:r>
+      <w:proofErr w:type="spellEnd"/>
+      <w:r>
+        <w:t xml:space="preserve"> (</w:t>
+      </w:r>
+      <w:proofErr w:type="spellStart"/>
+      <w:r>
+        <w:t>PostgreSQL</w:t>
+      </w:r>
+      <w:proofErr w:type="spellEnd"/>
+      <w:r>
+        <w:t xml:space="preserve"> eklentisi), </w:t>
+      </w:r>
+      <w:proofErr w:type="spellStart"/>
+      <w:r>
+        <w:t>Pinecone</w:t>
+      </w:r>
+      <w:proofErr w:type="spellEnd"/>
+      <w:r>
+        <w:t xml:space="preserve"> veya </w:t>
+      </w:r>
+      <w:proofErr w:type="spellStart"/>
+      <w:r>
+        <w:t>Milvus</w:t>
+      </w:r>
+      <w:proofErr w:type="spellEnd"/>
+      <w:r>
+        <w:t xml:space="preserve"> gibi vektör </w:t>
+      </w:r>
+      <w:proofErr w:type="spellStart"/>
+      <w:r>
+        <w:t>veritabanlarında</w:t>
+      </w:r>
+      <w:proofErr w:type="spellEnd"/>
+      <w:r>
+        <w:t xml:space="preserve"> saklanır. Bir kullanıcı </w:t>
+      </w:r>
+      <w:proofErr w:type="spellStart"/>
+      <w:r>
+        <w:lastRenderedPageBreak/>
+        <w:t>chatbot'a</w:t>
+      </w:r>
+      <w:proofErr w:type="spellEnd"/>
+      <w:r>
+        <w:t xml:space="preserve"> </w:t>
       </w:r>
       <w:r>
         <w:rPr>
@@ -186,7 +548,15 @@
         <w:t>"Geçen haftaki ders notumu özetle"</w:t>
       </w:r>
       <w:r>
-        <w:t xml:space="preserve"> dediğinde, Spring AI kullanıcının sorusuyla en ilişkili notları bu veritabanından saniyeler içinde bulur.</w:t>
+        <w:t xml:space="preserve"> dediğinde, Spring AI kullanıcının sorusuyla en ilişkili notları bu </w:t>
+      </w:r>
+      <w:proofErr w:type="spellStart"/>
+      <w:r>
+        <w:t>veritabanından</w:t>
+      </w:r>
+      <w:proofErr w:type="spellEnd"/>
+      <w:r>
+        <w:t xml:space="preserve"> saniyeler içinde bulur.</w:t>
       </w:r>
     </w:p>
     <w:p>
@@ -202,7 +572,6 @@
           <w:b/>
           <w:bCs/>
         </w:rPr>
-        <w:lastRenderedPageBreak/>
         <w:t>🧠</w:t>
       </w:r>
       <w:r>
@@ -210,12 +579,76 @@
           <w:b/>
           <w:bCs/>
         </w:rPr>
-        <w:t xml:space="preserve"> NoteP İçin Gelecek Mimarisi: RAG (Retrieval-Augmented Generation)</w:t>
-      </w:r>
-    </w:p>
-    <w:p>
-      <w:r>
-        <w:t xml:space="preserve">Spring AI kullanarak NoteP uygulamana chatbot eklediğinde kuracağımız mimarinin adı </w:t>
+        <w:t xml:space="preserve"> </w:t>
+      </w:r>
+      <w:proofErr w:type="spellStart"/>
+      <w:r>
+        <w:rPr>
+          <w:b/>
+          <w:bCs/>
+        </w:rPr>
+        <w:t>NoteP</w:t>
+      </w:r>
+      <w:proofErr w:type="spellEnd"/>
+      <w:r>
+        <w:rPr>
+          <w:b/>
+          <w:bCs/>
+        </w:rPr>
+        <w:t xml:space="preserve"> İçin Gelecek Mimarisi: RAG (</w:t>
+      </w:r>
+      <w:proofErr w:type="spellStart"/>
+      <w:r>
+        <w:rPr>
+          <w:b/>
+          <w:bCs/>
+        </w:rPr>
+        <w:t>Retrieval-Augmented</w:t>
+      </w:r>
+      <w:proofErr w:type="spellEnd"/>
+      <w:r>
+        <w:rPr>
+          <w:b/>
+          <w:bCs/>
+        </w:rPr>
+        <w:t xml:space="preserve"> </w:t>
+      </w:r>
+      <w:proofErr w:type="spellStart"/>
+      <w:r>
+        <w:rPr>
+          <w:b/>
+          <w:bCs/>
+        </w:rPr>
+        <w:t>Generation</w:t>
+      </w:r>
+      <w:proofErr w:type="spellEnd"/>
+      <w:r>
+        <w:rPr>
+          <w:b/>
+          <w:bCs/>
+        </w:rPr>
+        <w:t>)</w:t>
+      </w:r>
+    </w:p>
+    <w:p>
+      <w:r>
+        <w:t xml:space="preserve">Spring AI kullanarak </w:t>
+      </w:r>
+      <w:proofErr w:type="spellStart"/>
+      <w:r>
+        <w:t>NoteP</w:t>
+      </w:r>
+      <w:proofErr w:type="spellEnd"/>
+      <w:r>
+        <w:t xml:space="preserve"> uygulamana </w:t>
+      </w:r>
+      <w:proofErr w:type="spellStart"/>
+      <w:r>
+        <w:t>chatbot</w:t>
+      </w:r>
+      <w:proofErr w:type="spellEnd"/>
+      <w:r>
+        <w:t xml:space="preserve"> eklediğinde kuracağımız mimarinin adı </w:t>
       </w:r>
       <w:r>
         <w:rPr>
@@ -258,7 +691,15 @@
         <w:t>Kullanıcı Sorar:</w:t>
       </w:r>
       <w:r>
-        <w:t xml:space="preserve"> Flutter'dan soru gelir: </w:t>
+        <w:t xml:space="preserve"> </w:t>
+      </w:r>
+      <w:proofErr w:type="spellStart"/>
+      <w:r>
+        <w:t>Flutter'dan</w:t>
+      </w:r>
+      <w:proofErr w:type="spellEnd"/>
+      <w:r>
+        <w:t xml:space="preserve"> soru gelir: </w:t>
       </w:r>
       <w:r>
         <w:rPr>
@@ -283,7 +724,15 @@
         <w:t>Spring AI Notları Bulur:</w:t>
       </w:r>
       <w:r>
-        <w:t xml:space="preserve"> Spring AI, kullanıcının veritabanındaki tüm notlarını tarar ve "Biyoloji" ile ilgili olan sayfaları çeker.</w:t>
+        <w:t xml:space="preserve"> Spring AI, kullanıcının </w:t>
+      </w:r>
+      <w:proofErr w:type="spellStart"/>
+      <w:r>
+        <w:t>veritabanındaki</w:t>
+      </w:r>
+      <w:proofErr w:type="spellEnd"/>
+      <w:r>
+        <w:t xml:space="preserve"> tüm notlarını tarar ve "Biyoloji" ile ilgili olan sayfaları çeker.</w:t>
       </w:r>
     </w:p>
     <w:p>
@@ -298,7 +747,23 @@
           <w:b/>
           <w:bCs/>
         </w:rPr>
-        <w:t>Zenginleştirilmiş Prompt:</w:t>
+        <w:t xml:space="preserve">Zenginleştirilmiş </w:t>
+      </w:r>
+      <w:proofErr w:type="spellStart"/>
+      <w:r>
+        <w:rPr>
+          <w:b/>
+          <w:bCs/>
+        </w:rPr>
+        <w:t>Prompt</w:t>
+      </w:r>
+      <w:proofErr w:type="spellEnd"/>
+      <w:r>
+        <w:rPr>
+          <w:b/>
+          <w:bCs/>
+        </w:rPr>
+        <w:t>:</w:t>
       </w:r>
       <w:r>
         <w:t xml:space="preserve"> Spring AI, yapay zekaya (Gemini) şu gizli emri gönderir: </w:t>
@@ -326,7 +791,15 @@
         <w:t>Kişiselleştirilmiş Cevap:</w:t>
       </w:r>
       <w:r>
-        <w:t xml:space="preserve"> Yapay zeka, kullanıcının kendi notlarından referanslar vererek harika bir çalışma planı üretir ve bu cevap Flutter'a akar.</w:t>
+        <w:t xml:space="preserve"> Yapay zeka, kullanıcının kendi notlarından referanslar vererek harika bir çalışma planı üretir ve bu cevap </w:t>
+      </w:r>
+      <w:proofErr w:type="spellStart"/>
+      <w:r>
+        <w:t>Flutter'a</w:t>
+      </w:r>
+      <w:proofErr w:type="spellEnd"/>
+      <w:r>
+        <w:t xml:space="preserve"> akar.</w:t>
       </w:r>
     </w:p>
     <w:p>
@@ -354,94 +827,1266 @@
     </w:p>
     <w:p>
       <w:r>
-        <w:t>Spring AI, projemize inanılmaz bir vizyon katacak ancak şu an geliştirme aşaması (milestone) sürecinde olduğu için dependency (bağımlılık) ayarları normal kütüphanelere göre biraz daha hassastır.</w:t>
-      </w:r>
-    </w:p>
-    <w:p>
-      <w:r>
-        <w:t>Sana tavsiyem:</w:t>
+        <w:t>Spring AI, projemize inanılmaz bir vizyon katacak ancak şu an geliştirme aşaması (</w:t>
+      </w:r>
+      <w:proofErr w:type="spellStart"/>
+      <w:r>
+        <w:t>milestone</w:t>
+      </w:r>
+      <w:proofErr w:type="spellEnd"/>
+      <w:r>
+        <w:t xml:space="preserve">) sürecinde olduğu için </w:t>
+      </w:r>
+      <w:proofErr w:type="spellStart"/>
+      <w:r>
+        <w:t>dependency</w:t>
+      </w:r>
+      <w:proofErr w:type="spellEnd"/>
+      <w:r>
+        <w:t xml:space="preserve"> (bağımlılık) ayarları normal kütüphanelere göre biraz daha hassastır.</w:t>
+      </w:r>
+    </w:p>
+    <w:p/>
+    <w:p/>
+    <w:p/>
+    <w:p/>
+    <w:p/>
+    <w:p/>
+    <w:p/>
+    <w:p>
+      <w:pPr>
+        <w:rPr>
+          <w:color w:val="EE0000"/>
+        </w:rPr>
+      </w:pPr>
+      <w:proofErr w:type="spellStart"/>
+      <w:r>
+        <w:rPr>
+          <w:color w:val="EE0000"/>
+        </w:rPr>
+        <w:t>Flutter</w:t>
+      </w:r>
+      <w:proofErr w:type="spellEnd"/>
+      <w:r>
+        <w:rPr>
+          <w:color w:val="EE0000"/>
+        </w:rPr>
+        <w:t xml:space="preserve"> tarafında </w:t>
+      </w:r>
+      <w:proofErr w:type="spellStart"/>
+      <w:r>
+        <w:rPr>
+          <w:color w:val="EE0000"/>
+        </w:rPr>
+        <w:t>chatte</w:t>
+      </w:r>
+      <w:proofErr w:type="spellEnd"/>
+      <w:r>
+        <w:rPr>
+          <w:color w:val="EE0000"/>
+        </w:rPr>
+        <w:t xml:space="preserve"> soru yazarken, @NoteAdı şeklinde not belirtme </w:t>
+      </w:r>
+      <w:proofErr w:type="spellStart"/>
+      <w:r>
+        <w:rPr>
+          <w:color w:val="EE0000"/>
+        </w:rPr>
+        <w:t>desteği,pageid</w:t>
+      </w:r>
+      <w:proofErr w:type="spellEnd"/>
+      <w:r>
+        <w:rPr>
+          <w:color w:val="EE0000"/>
+        </w:rPr>
+        <w:t xml:space="preserve"> dönecek.</w:t>
+      </w:r>
+    </w:p>
+    <w:p>
+      <w:r>
+        <w:t xml:space="preserve">Harika bir vizyon Hacı! </w:t>
+      </w:r>
+      <w:proofErr w:type="spellStart"/>
+      <w:r>
+        <w:t>Flutter</w:t>
+      </w:r>
+      <w:proofErr w:type="spellEnd"/>
+      <w:r>
+        <w:t xml:space="preserve"> desteğini arkamıza alarak, istekle beraber </w:t>
+      </w:r>
+      <w:r>
+        <w:rPr>
+          <w:b/>
+          <w:bCs/>
+        </w:rPr>
+        <w:t xml:space="preserve">bir veya birden fazla </w:t>
+      </w:r>
+      <w:proofErr w:type="spellStart"/>
+      <w:r>
+        <w:t>pageId</w:t>
+      </w:r>
+      <w:proofErr w:type="spellEnd"/>
+      <w:r>
+        <w:t xml:space="preserve"> listesini taşımak mimariyi hem kırılmaz (fail-</w:t>
+      </w:r>
+      <w:proofErr w:type="spellStart"/>
+      <w:r>
+        <w:t>proof</w:t>
+      </w:r>
+      <w:proofErr w:type="spellEnd"/>
+      <w:r>
+        <w:t>) yapar hem de inanılmaz esnetir.</w:t>
+      </w:r>
+    </w:p>
+    <w:p>
+      <w:r>
+        <w:lastRenderedPageBreak/>
+        <w:t xml:space="preserve">Kullanıcının aynı anda "Staj Notları", "Yazılım Mimarisi Ders Notu" ve "Proje Planı" gibi 3 farklı notu seçip, </w:t>
+      </w:r>
+      <w:r>
+        <w:rPr>
+          <w:i/>
+          <w:iCs/>
+        </w:rPr>
+        <w:t xml:space="preserve">"Bu 3 nottaki ortak maddeleri bana listele ve ekteki </w:t>
+      </w:r>
+      <w:proofErr w:type="spellStart"/>
+      <w:r>
+        <w:rPr>
+          <w:i/>
+          <w:iCs/>
+        </w:rPr>
+        <w:t>PDF'leri</w:t>
+      </w:r>
+      <w:proofErr w:type="spellEnd"/>
+      <w:r>
+        <w:rPr>
+          <w:i/>
+          <w:iCs/>
+        </w:rPr>
+        <w:t xml:space="preserve"> karşılaştır"</w:t>
+      </w:r>
+      <w:r>
+        <w:t xml:space="preserve"> diyebildiği bir senaryoyu kurguluyoruz.</w:t>
+      </w:r>
+    </w:p>
+    <w:p>
+      <w:r>
+        <w:t xml:space="preserve">Gelin bu yapının </w:t>
+      </w:r>
+      <w:proofErr w:type="spellStart"/>
+      <w:r>
+        <w:t>backend</w:t>
+      </w:r>
+      <w:proofErr w:type="spellEnd"/>
+      <w:r>
+        <w:t xml:space="preserve"> tarafında nasıl akacağını adım adım canlandıralım.</w:t>
+      </w:r>
+    </w:p>
+    <w:p>
+      <w:pPr>
+        <w:rPr>
+          <w:b/>
+          <w:bCs/>
+        </w:rPr>
+      </w:pPr>
+      <w:r>
+        <w:rPr>
+          <w:rFonts w:ascii="Segoe UI Emoji" w:hAnsi="Segoe UI Emoji" w:cs="Segoe UI Emoji"/>
+          <w:b/>
+          <w:bCs/>
+        </w:rPr>
+        <w:t>🏗️</w:t>
+      </w:r>
+      <w:r>
+        <w:rPr>
+          <w:b/>
+          <w:bCs/>
+        </w:rPr>
+        <w:t xml:space="preserve"> Çoklu Bağlamlı (Multi-</w:t>
+      </w:r>
+      <w:proofErr w:type="spellStart"/>
+      <w:r>
+        <w:rPr>
+          <w:b/>
+          <w:bCs/>
+        </w:rPr>
+        <w:t>Context</w:t>
+      </w:r>
+      <w:proofErr w:type="spellEnd"/>
+      <w:r>
+        <w:rPr>
+          <w:b/>
+          <w:bCs/>
+        </w:rPr>
+        <w:t xml:space="preserve">) </w:t>
+      </w:r>
+      <w:proofErr w:type="spellStart"/>
+      <w:r>
+        <w:rPr>
+          <w:b/>
+          <w:bCs/>
+        </w:rPr>
+        <w:t>Chatbot</w:t>
+      </w:r>
+      <w:proofErr w:type="spellEnd"/>
+      <w:r>
+        <w:rPr>
+          <w:b/>
+          <w:bCs/>
+        </w:rPr>
+        <w:t xml:space="preserve"> Çalışma Mimarisi</w:t>
+      </w:r>
+    </w:p>
+    <w:p>
+      <w:r>
+        <w:t xml:space="preserve">Kullanıcı genel </w:t>
+      </w:r>
+      <w:proofErr w:type="spellStart"/>
+      <w:r>
+        <w:t>chat</w:t>
+      </w:r>
+      <w:proofErr w:type="spellEnd"/>
+      <w:r>
+        <w:t xml:space="preserve"> ekranında notlarını seçip mesajı gönderdiğinde süreç tamamen </w:t>
+      </w:r>
+      <w:proofErr w:type="spellStart"/>
+      <w:r>
+        <w:rPr>
+          <w:b/>
+          <w:bCs/>
+        </w:rPr>
+        <w:t>Clean</w:t>
+      </w:r>
+      <w:proofErr w:type="spellEnd"/>
+      <w:r>
+        <w:rPr>
+          <w:b/>
+          <w:bCs/>
+        </w:rPr>
+        <w:t xml:space="preserve"> </w:t>
+      </w:r>
+      <w:proofErr w:type="spellStart"/>
+      <w:r>
+        <w:rPr>
+          <w:b/>
+          <w:bCs/>
+        </w:rPr>
+        <w:t>Code</w:t>
+      </w:r>
+      <w:proofErr w:type="spellEnd"/>
+      <w:r>
+        <w:t xml:space="preserve"> ve katmanlı mimariye uygun olarak şöyle işleyecek:</w:t>
+      </w:r>
+    </w:p>
+    <w:p>
+      <w:pPr>
+        <w:rPr>
+          <w:b/>
+          <w:bCs/>
+        </w:rPr>
+      </w:pPr>
+      <w:r>
+        <w:rPr>
+          <w:b/>
+          <w:bCs/>
+        </w:rPr>
+        <w:t>1. İstek Gövdesi (</w:t>
+      </w:r>
+      <w:proofErr w:type="spellStart"/>
+      <w:r>
+        <w:rPr>
+          <w:b/>
+          <w:bCs/>
+        </w:rPr>
+        <w:t>Request</w:t>
+      </w:r>
+      <w:proofErr w:type="spellEnd"/>
+      <w:r>
+        <w:rPr>
+          <w:b/>
+          <w:bCs/>
+        </w:rPr>
+        <w:t xml:space="preserve"> </w:t>
+      </w:r>
+      <w:proofErr w:type="spellStart"/>
+      <w:r>
+        <w:rPr>
+          <w:b/>
+          <w:bCs/>
+        </w:rPr>
+        <w:t>Payload</w:t>
+      </w:r>
+      <w:proofErr w:type="spellEnd"/>
+      <w:r>
+        <w:rPr>
+          <w:b/>
+          <w:bCs/>
+        </w:rPr>
+        <w:t>) Tasarımı</w:t>
+      </w:r>
+    </w:p>
+    <w:p>
+      <w:proofErr w:type="spellStart"/>
+      <w:r>
+        <w:t>Flutter</w:t>
+      </w:r>
+      <w:proofErr w:type="spellEnd"/>
+      <w:r>
+        <w:t xml:space="preserve"> </w:t>
+      </w:r>
+      <w:proofErr w:type="spellStart"/>
+      <w:r>
+        <w:t>backend'e</w:t>
+      </w:r>
+      <w:proofErr w:type="spellEnd"/>
+      <w:r>
+        <w:t xml:space="preserve"> istek atarken sadece düz metin değil, bir JSON objesi gönderecek. Bu objenin içinde kullanıcının mesajı ve seçtiği notların benzersiz ID listesi yer alacak:</w:t>
+      </w:r>
+    </w:p>
+    <w:p>
+      <w:r>
+        <w:t>JSON</w:t>
+      </w:r>
+    </w:p>
+    <w:p>
+      <w:r>
+        <w:t>{</w:t>
+      </w:r>
+    </w:p>
+    <w:p>
+      <w:r>
+        <w:t xml:space="preserve">  "</w:t>
+      </w:r>
+      <w:proofErr w:type="spellStart"/>
+      <w:r>
+        <w:t>message</w:t>
+      </w:r>
+      <w:proofErr w:type="spellEnd"/>
+      <w:r>
+        <w:t>": "Seçtiğim bu notlardaki staj şartlarını karşılaştırır mısın?",</w:t>
+      </w:r>
+    </w:p>
+    <w:p>
+      <w:r>
+        <w:t xml:space="preserve">  "</w:t>
+      </w:r>
+      <w:proofErr w:type="spellStart"/>
+      <w:r>
+        <w:t>pageIds</w:t>
+      </w:r>
+      <w:proofErr w:type="spellEnd"/>
+      <w:r>
+        <w:t>": [1, 3, 5]</w:t>
+      </w:r>
+    </w:p>
+    <w:p>
+      <w:r>
+        <w:t>}</w:t>
+      </w:r>
+    </w:p>
+    <w:p>
+      <w:pPr>
+        <w:rPr>
+          <w:b/>
+          <w:bCs/>
+        </w:rPr>
+      </w:pPr>
+      <w:r>
+        <w:rPr>
+          <w:b/>
+          <w:bCs/>
+        </w:rPr>
+        <w:t>2. Controller Katmanının Görevi</w:t>
+      </w:r>
+    </w:p>
+    <w:p>
+      <w:proofErr w:type="spellStart"/>
+      <w:r>
+        <w:t>ChatController</w:t>
+      </w:r>
+      <w:proofErr w:type="spellEnd"/>
+      <w:r>
+        <w:t xml:space="preserve"> bu isteği karşılayacak. Gelen </w:t>
+      </w:r>
+      <w:proofErr w:type="spellStart"/>
+      <w:r>
+        <w:t>pageIds</w:t>
+      </w:r>
+      <w:proofErr w:type="spellEnd"/>
+      <w:r>
+        <w:t xml:space="preserve"> listesi boş da gelebilir (Kullanıcı hiçbir not seçmeden genel bir sohbet de edebilir, sistem buna da izin vermeli). Controller bu verileri doğrudan </w:t>
+      </w:r>
+      <w:proofErr w:type="spellStart"/>
+      <w:r>
+        <w:t>ChatService</w:t>
+      </w:r>
+      <w:proofErr w:type="spellEnd"/>
+      <w:r>
+        <w:t xml:space="preserve"> katmanına </w:t>
+      </w:r>
+      <w:proofErr w:type="spellStart"/>
+      <w:r>
+        <w:t>paslayacak</w:t>
+      </w:r>
+      <w:proofErr w:type="spellEnd"/>
+      <w:r>
+        <w:t>.</w:t>
+      </w:r>
+    </w:p>
+    <w:p>
+      <w:pPr>
+        <w:rPr>
+          <w:b/>
+          <w:bCs/>
+        </w:rPr>
+      </w:pPr>
+      <w:r>
+        <w:rPr>
+          <w:b/>
+          <w:bCs/>
+        </w:rPr>
+        <w:t>3. Business (</w:t>
+      </w:r>
+      <w:proofErr w:type="spellStart"/>
+      <w:r>
+        <w:rPr>
+          <w:b/>
+          <w:bCs/>
+        </w:rPr>
+        <w:t>ChatService</w:t>
+      </w:r>
+      <w:proofErr w:type="spellEnd"/>
+      <w:r>
+        <w:rPr>
+          <w:b/>
+          <w:bCs/>
+        </w:rPr>
+        <w:t>) Katmanının Sihirli Dokunuşu</w:t>
+      </w:r>
+    </w:p>
+    <w:p>
+      <w:r>
+        <w:t>İşte tüm verinin toplanıp yapay zekanın anlayacağı bir "Büyük Bağlam" (</w:t>
+      </w:r>
+      <w:proofErr w:type="spellStart"/>
+      <w:r>
+        <w:t>Context</w:t>
+      </w:r>
+      <w:proofErr w:type="spellEnd"/>
+      <w:r>
+        <w:t xml:space="preserve">) haline getirildiği yer burasıdır. </w:t>
+      </w:r>
+      <w:proofErr w:type="spellStart"/>
+      <w:r>
+        <w:t>ChatService</w:t>
+      </w:r>
+      <w:proofErr w:type="spellEnd"/>
+      <w:r>
+        <w:t xml:space="preserve"> şu adımları izleyecek:</w:t>
       </w:r>
     </w:p>
     <w:p>
       <w:pPr>
         <w:numPr>
           <w:ilvl w:val="0"/>
-          <w:numId w:val="13"/>
+          <w:numId w:val="15"/>
         </w:numPr>
       </w:pPr>
       <w:r>
-        <w:t>Önce Flutter ile şu anki backend’imizi pürüzsüzce konuşturalım, kullanıcı giriş yapsın, grubunu görsün ve notunu yazsın.</w:t>
+        <w:rPr>
+          <w:b/>
+          <w:bCs/>
+        </w:rPr>
+        <w:t>Veri Toplama Döngüsü:</w:t>
+      </w:r>
+      <w:r>
+        <w:t xml:space="preserve"> Gelen </w:t>
+      </w:r>
+      <w:proofErr w:type="spellStart"/>
+      <w:r>
+        <w:t>pageIds</w:t>
+      </w:r>
+      <w:proofErr w:type="spellEnd"/>
+      <w:r>
+        <w:t xml:space="preserve"> listesindeki her bir ID için veri tabanına (</w:t>
+      </w:r>
+      <w:proofErr w:type="spellStart"/>
+      <w:r>
+        <w:t>PageRepository</w:t>
+      </w:r>
+      <w:proofErr w:type="spellEnd"/>
+      <w:r>
+        <w:t xml:space="preserve"> ve </w:t>
+      </w:r>
+      <w:proofErr w:type="spellStart"/>
+      <w:r>
+        <w:t>AttachmentRepository</w:t>
+      </w:r>
+      <w:proofErr w:type="spellEnd"/>
+      <w:r>
+        <w:t>) sorgu atılacak.</w:t>
       </w:r>
     </w:p>
     <w:p>
       <w:pPr>
         <w:numPr>
           <w:ilvl w:val="0"/>
-          <w:numId w:val="13"/>
+          <w:numId w:val="15"/>
         </w:numPr>
       </w:pPr>
       <w:r>
-        <w:t xml:space="preserve">Bu temel akış bittiği an, </w:t>
-      </w:r>
-      <w:r>
-        <w:rPr>
-          <w:b/>
-          <w:bCs/>
-        </w:rPr>
-        <w:t>"Spring AI Kampı"</w:t>
-      </w:r>
-      <w:r>
-        <w:t xml:space="preserve"> başlatalım. pom.xml’e kütüphaneleri ekleyip, Render.com üzerinden bir Gemini API key bağlayarak NoteP'yi yapay zekayla taçlandıralım.</w:t>
-      </w:r>
-    </w:p>
-    <w:p>
-      <w:r>
-        <w:t>Bu kütüphanenin mantığı kafana yattı mı bro? Eğer her şey tamamsa, Flutter'da backend ile nasıl konuşacağımızı bildiğimize göre yeni sohbete geçiş için tüm cephanemiz hazır!</w:t>
+        <w:rPr>
+          <w:b/>
+          <w:bCs/>
+        </w:rPr>
+        <w:t>Güvenlik Kontrolü:</w:t>
+      </w:r>
+      <w:r>
+        <w:t xml:space="preserve"> Tıpkı sayfa güncelleme veya silme işlemlerinde yaptığın gibi, istek atan kullanıcının o notlara gerçekten erişim yetkisi (ya sahibi mi ya da o notun bulunduğu grubun üyesi mi) tek tek kontrol edilecek. Yetkisiz bir ID varsa sistem hata fırlatacak.</w:t>
+      </w:r>
+    </w:p>
+    <w:p>
+      <w:pPr>
+        <w:numPr>
+          <w:ilvl w:val="0"/>
+          <w:numId w:val="15"/>
+        </w:numPr>
+      </w:pPr>
+      <w:r>
+        <w:rPr>
+          <w:b/>
+          <w:bCs/>
+        </w:rPr>
+        <w:t>Bağlamı Paketleme (</w:t>
+      </w:r>
+      <w:proofErr w:type="spellStart"/>
+      <w:r>
+        <w:rPr>
+          <w:b/>
+          <w:bCs/>
+        </w:rPr>
+        <w:t>Prompt</w:t>
+      </w:r>
+      <w:proofErr w:type="spellEnd"/>
+      <w:r>
+        <w:rPr>
+          <w:b/>
+          <w:bCs/>
+        </w:rPr>
+        <w:t xml:space="preserve"> </w:t>
+      </w:r>
+      <w:proofErr w:type="spellStart"/>
+      <w:r>
+        <w:rPr>
+          <w:b/>
+          <w:bCs/>
+        </w:rPr>
+        <w:t>Engineering</w:t>
+      </w:r>
+      <w:proofErr w:type="spellEnd"/>
+      <w:r>
+        <w:rPr>
+          <w:b/>
+          <w:bCs/>
+        </w:rPr>
+        <w:t>):</w:t>
+      </w:r>
+      <w:r>
+        <w:t xml:space="preserve"> Yetkili tüm notların içerisindeki metinler ve o notlara bağlı olan </w:t>
+      </w:r>
+      <w:proofErr w:type="spellStart"/>
+      <w:r>
+        <w:t>Supabase</w:t>
+      </w:r>
+      <w:proofErr w:type="spellEnd"/>
+      <w:r>
+        <w:t xml:space="preserve"> dosya URL'leri tek bir metin </w:t>
+      </w:r>
+      <w:proofErr w:type="spellStart"/>
+      <w:r>
+        <w:t>dökümanı</w:t>
+      </w:r>
+      <w:proofErr w:type="spellEnd"/>
+      <w:r>
+        <w:t xml:space="preserve"> haline getirilecek. Yapay zekaya verilecek yapı kabaca şuna benzeyecek:</w:t>
+      </w:r>
+    </w:p>
+    <w:p>
+      <w:r>
+        <w:rPr>
+          <w:b/>
+          <w:bCs/>
+        </w:rPr>
+        <w:lastRenderedPageBreak/>
+        <w:t>Sistem Rolü:</w:t>
+      </w:r>
+      <w:r>
+        <w:t xml:space="preserve"> Sen </w:t>
+      </w:r>
+      <w:proofErr w:type="spellStart"/>
+      <w:r>
+        <w:t>NoteP</w:t>
+      </w:r>
+      <w:proofErr w:type="spellEnd"/>
+      <w:r>
+        <w:t xml:space="preserve"> uygulaması asistanısın. Aşağıda kullanıcının seçtiği notların içerikleri ve ekli dosyaların internet adresleri verilmiştir. Yanıtını sadece bu verilere dayanarak ve Türkçe olarak oluştur.</w:t>
+      </w:r>
+    </w:p>
+    <w:p>
+      <w:r>
+        <w:rPr>
+          <w:b/>
+          <w:bCs/>
+        </w:rPr>
+        <w:t>Seçilen Notlar ve Dosyalar:</w:t>
+      </w:r>
+    </w:p>
+    <w:p>
+      <w:pPr>
+        <w:numPr>
+          <w:ilvl w:val="0"/>
+          <w:numId w:val="16"/>
+        </w:numPr>
+      </w:pPr>
+      <w:r>
+        <w:rPr>
+          <w:b/>
+          <w:bCs/>
+        </w:rPr>
+        <w:t>Not 1 Başlığı:</w:t>
+      </w:r>
+      <w:r>
+        <w:t xml:space="preserve"> "Staj Planı" -&gt; </w:t>
+      </w:r>
+      <w:r>
+        <w:rPr>
+          <w:b/>
+          <w:bCs/>
+        </w:rPr>
+        <w:t>İçerik:</w:t>
+      </w:r>
+      <w:r>
+        <w:t xml:space="preserve"> "..." -&gt; </w:t>
+      </w:r>
+      <w:r>
+        <w:rPr>
+          <w:b/>
+          <w:bCs/>
+        </w:rPr>
+        <w:t>Ekli Dosyalar:</w:t>
+      </w:r>
+      <w:r>
+        <w:t xml:space="preserve"> [URL-1, URL-2]</w:t>
+      </w:r>
+    </w:p>
+    <w:p>
+      <w:pPr>
+        <w:numPr>
+          <w:ilvl w:val="0"/>
+          <w:numId w:val="16"/>
+        </w:numPr>
+      </w:pPr>
+      <w:r>
+        <w:rPr>
+          <w:b/>
+          <w:bCs/>
+        </w:rPr>
+        <w:t>Not 2 Başlığı:</w:t>
+      </w:r>
+      <w:r>
+        <w:t xml:space="preserve"> "Şirket Kuralları" -&gt; </w:t>
+      </w:r>
+      <w:r>
+        <w:rPr>
+          <w:b/>
+          <w:bCs/>
+        </w:rPr>
+        <w:t>İçerik:</w:t>
+      </w:r>
+      <w:r>
+        <w:t xml:space="preserve"> "..." -&gt; </w:t>
+      </w:r>
+      <w:r>
+        <w:rPr>
+          <w:b/>
+          <w:bCs/>
+        </w:rPr>
+        <w:t>Ekli Dosyalar:</w:t>
+      </w:r>
+      <w:r>
+        <w:t xml:space="preserve"> [URL-3]</w:t>
+      </w:r>
+    </w:p>
+    <w:p>
+      <w:r>
+        <w:rPr>
+          <w:b/>
+          <w:bCs/>
+        </w:rPr>
+        <w:t>Kullanıcının Sorusu:</w:t>
+      </w:r>
+      <w:r>
+        <w:t xml:space="preserve"> Seçtiğim bu notlardaki staj şartlarını karşılaştırır mısın?</w:t>
+      </w:r>
+    </w:p>
+    <w:p>
+      <w:pPr>
+        <w:rPr>
+          <w:b/>
+          <w:bCs/>
+        </w:rPr>
+      </w:pPr>
+      <w:r>
+        <w:rPr>
+          <w:b/>
+          <w:bCs/>
+        </w:rPr>
+        <w:t>4. Esnek LLM (</w:t>
+      </w:r>
+      <w:proofErr w:type="spellStart"/>
+      <w:r>
+        <w:rPr>
+          <w:b/>
+          <w:bCs/>
+        </w:rPr>
+        <w:t>ChatModel</w:t>
+      </w:r>
+      <w:proofErr w:type="spellEnd"/>
+      <w:r>
+        <w:rPr>
+          <w:b/>
+          <w:bCs/>
+        </w:rPr>
+        <w:t>) Katmanı</w:t>
+      </w:r>
+    </w:p>
+    <w:p>
+      <w:r>
+        <w:t xml:space="preserve">Oluşturulan bu devasa paket, Spring </w:t>
+      </w:r>
+      <w:proofErr w:type="spellStart"/>
+      <w:r>
+        <w:t>AI'ın</w:t>
+      </w:r>
+      <w:proofErr w:type="spellEnd"/>
+      <w:r>
+        <w:t xml:space="preserve"> bize sunduğu soyut </w:t>
+      </w:r>
+      <w:proofErr w:type="spellStart"/>
+      <w:r>
+        <w:t>ChatModel</w:t>
+      </w:r>
+      <w:proofErr w:type="spellEnd"/>
+      <w:r>
+        <w:t xml:space="preserve"> (veya </w:t>
+      </w:r>
+      <w:proofErr w:type="spellStart"/>
+      <w:r>
+        <w:t>ChatClient</w:t>
+      </w:r>
+      <w:proofErr w:type="spellEnd"/>
+      <w:r>
+        <w:t xml:space="preserve">) </w:t>
+      </w:r>
+      <w:proofErr w:type="spellStart"/>
+      <w:r>
+        <w:t>interface'i</w:t>
+      </w:r>
+      <w:proofErr w:type="spellEnd"/>
+      <w:r>
+        <w:t xml:space="preserve"> üzerinden o an arkada hangi yapay zeka motoru tanımlıysa (Gemini, </w:t>
+      </w:r>
+      <w:proofErr w:type="spellStart"/>
+      <w:r>
+        <w:t>OpenAI</w:t>
+      </w:r>
+      <w:proofErr w:type="spellEnd"/>
+      <w:r>
+        <w:t xml:space="preserve"> vb.) ona gönderilecek.</w:t>
+      </w:r>
+    </w:p>
+    <w:p>
+      <w:r>
+        <w:t xml:space="preserve">Gemini, </w:t>
+      </w:r>
+      <w:proofErr w:type="spellStart"/>
+      <w:r>
+        <w:t>prompt'un</w:t>
+      </w:r>
+      <w:proofErr w:type="spellEnd"/>
+      <w:r>
+        <w:t xml:space="preserve"> içindeki </w:t>
+      </w:r>
+      <w:proofErr w:type="spellStart"/>
+      <w:r>
+        <w:t>Supabase</w:t>
+      </w:r>
+      <w:proofErr w:type="spellEnd"/>
+      <w:r>
+        <w:t xml:space="preserve"> URL'lerini görecek, o dosyalara anlık olarak erişip okuyacak, not metinleriyle birleştirecek ve kullanıcıya nokta atışı bir kıyaslama cevabı üretecek.</w:t>
+      </w:r>
+    </w:p>
+    <w:p>
+      <w:pPr>
+        <w:rPr>
+          <w:b/>
+          <w:bCs/>
+        </w:rPr>
+      </w:pPr>
+      <w:r>
+        <w:rPr>
+          <w:rFonts w:ascii="Segoe UI Emoji" w:hAnsi="Segoe UI Emoji" w:cs="Segoe UI Emoji"/>
+          <w:b/>
+          <w:bCs/>
+        </w:rPr>
+        <w:t>🛠️</w:t>
+      </w:r>
+      <w:r>
+        <w:rPr>
+          <w:b/>
+          <w:bCs/>
+        </w:rPr>
+        <w:t xml:space="preserve"> LLM Değiştirilebilirliğini Sağlayan </w:t>
+      </w:r>
+      <w:proofErr w:type="spellStart"/>
+      <w:r>
+        <w:rPr>
+          <w:b/>
+          <w:bCs/>
+        </w:rPr>
+        <w:t>abstraction</w:t>
+      </w:r>
+      <w:proofErr w:type="spellEnd"/>
+      <w:r>
+        <w:rPr>
+          <w:b/>
+          <w:bCs/>
+        </w:rPr>
+        <w:t xml:space="preserve"> (Soyutlama) Yapısı</w:t>
+      </w:r>
+    </w:p>
+    <w:p>
+      <w:r>
+        <w:t xml:space="preserve">"Yapay zekayı ileride değiştirebilir miyiz?" soruna istinaden kuracağımız </w:t>
+      </w:r>
+      <w:proofErr w:type="spellStart"/>
+      <w:r>
+        <w:t>interface</w:t>
+      </w:r>
+      <w:proofErr w:type="spellEnd"/>
+      <w:r>
+        <w:t xml:space="preserve"> yapısı tam olarak şöyle olacak:</w:t>
+      </w:r>
+    </w:p>
+    <w:p>
+      <w:pPr>
+        <w:numPr>
+          <w:ilvl w:val="0"/>
+          <w:numId w:val="17"/>
+        </w:numPr>
+      </w:pPr>
+      <w:r>
+        <w:t>AiService.java</w:t>
+      </w:r>
+      <w:r>
+        <w:rPr>
+          <w:b/>
+          <w:bCs/>
+        </w:rPr>
+        <w:t xml:space="preserve"> (</w:t>
+      </w:r>
+      <w:proofErr w:type="spellStart"/>
+      <w:r>
+        <w:rPr>
+          <w:b/>
+          <w:bCs/>
+        </w:rPr>
+        <w:t>Interface</w:t>
+      </w:r>
+      <w:proofErr w:type="spellEnd"/>
+      <w:r>
+        <w:rPr>
+          <w:b/>
+          <w:bCs/>
+        </w:rPr>
+        <w:t>):</w:t>
+      </w:r>
+      <w:r>
+        <w:t xml:space="preserve"> Bizim yazdığımız soyut arayüz.</w:t>
+      </w:r>
+    </w:p>
+    <w:p>
+      <w:r>
+        <w:t>Java</w:t>
+      </w:r>
+    </w:p>
+    <w:p>
+      <w:proofErr w:type="spellStart"/>
+      <w:r>
+        <w:t>public</w:t>
+      </w:r>
+      <w:proofErr w:type="spellEnd"/>
+      <w:r>
+        <w:t xml:space="preserve"> </w:t>
+      </w:r>
+      <w:proofErr w:type="spellStart"/>
+      <w:r>
+        <w:t>interface</w:t>
+      </w:r>
+      <w:proofErr w:type="spellEnd"/>
+      <w:r>
+        <w:t xml:space="preserve"> </w:t>
+      </w:r>
+      <w:proofErr w:type="spellStart"/>
+      <w:r>
+        <w:t>AiService</w:t>
+      </w:r>
+      <w:proofErr w:type="spellEnd"/>
+      <w:r>
+        <w:t xml:space="preserve"> {</w:t>
+      </w:r>
+    </w:p>
+    <w:p>
+      <w:r>
+        <w:t xml:space="preserve">    </w:t>
+      </w:r>
+      <w:proofErr w:type="spellStart"/>
+      <w:r>
+        <w:t>String</w:t>
+      </w:r>
+      <w:proofErr w:type="spellEnd"/>
+      <w:r>
+        <w:t xml:space="preserve"> </w:t>
+      </w:r>
+      <w:proofErr w:type="spellStart"/>
+      <w:r>
+        <w:t>generateResponse</w:t>
+      </w:r>
+      <w:proofErr w:type="spellEnd"/>
+      <w:r>
+        <w:t>(</w:t>
+      </w:r>
+      <w:proofErr w:type="spellStart"/>
+      <w:r>
+        <w:t>String</w:t>
+      </w:r>
+      <w:proofErr w:type="spellEnd"/>
+      <w:r>
+        <w:t xml:space="preserve"> </w:t>
+      </w:r>
+      <w:proofErr w:type="spellStart"/>
+      <w:r>
+        <w:t>userMessage</w:t>
+      </w:r>
+      <w:proofErr w:type="spellEnd"/>
+      <w:r>
+        <w:t xml:space="preserve">, </w:t>
+      </w:r>
+      <w:proofErr w:type="spellStart"/>
+      <w:r>
+        <w:t>List</w:t>
+      </w:r>
+      <w:proofErr w:type="spellEnd"/>
+      <w:r>
+        <w:t>&lt;</w:t>
+      </w:r>
+      <w:proofErr w:type="spellStart"/>
+      <w:r>
+        <w:t>PageContextDTO</w:t>
+      </w:r>
+      <w:proofErr w:type="spellEnd"/>
+      <w:r>
+        <w:t xml:space="preserve">&gt; </w:t>
+      </w:r>
+      <w:proofErr w:type="spellStart"/>
+      <w:r>
+        <w:t>contexts</w:t>
+      </w:r>
+      <w:proofErr w:type="spellEnd"/>
+      <w:r>
+        <w:t>);</w:t>
+      </w:r>
+    </w:p>
+    <w:p>
+      <w:r>
+        <w:t>}</w:t>
+      </w:r>
+    </w:p>
+    <w:p>
+      <w:pPr>
+        <w:numPr>
+          <w:ilvl w:val="0"/>
+          <w:numId w:val="17"/>
+        </w:numPr>
+      </w:pPr>
+      <w:r>
+        <w:t>GeminiAiServiceImpl.java</w:t>
+      </w:r>
+      <w:r>
+        <w:rPr>
+          <w:b/>
+          <w:bCs/>
+        </w:rPr>
+        <w:t xml:space="preserve"> (</w:t>
+      </w:r>
+      <w:proofErr w:type="spellStart"/>
+      <w:r>
+        <w:rPr>
+          <w:b/>
+          <w:bCs/>
+        </w:rPr>
+        <w:t>Implementation</w:t>
+      </w:r>
+      <w:proofErr w:type="spellEnd"/>
+      <w:r>
+        <w:rPr>
+          <w:b/>
+          <w:bCs/>
+        </w:rPr>
+        <w:t>):</w:t>
+      </w:r>
+      <w:r>
+        <w:t xml:space="preserve"> Bu arayüzü uygulayan ve içinde Spring </w:t>
+      </w:r>
+      <w:proofErr w:type="spellStart"/>
+      <w:r>
+        <w:t>AI'ın</w:t>
+      </w:r>
+      <w:proofErr w:type="spellEnd"/>
+      <w:r>
+        <w:t xml:space="preserve"> </w:t>
+      </w:r>
+      <w:proofErr w:type="spellStart"/>
+      <w:r>
+        <w:t>ChatModel</w:t>
+      </w:r>
+      <w:proofErr w:type="spellEnd"/>
+      <w:r>
+        <w:t xml:space="preserve"> nesnesini kullanan sınıf. Yarın </w:t>
+      </w:r>
+      <w:proofErr w:type="spellStart"/>
+      <w:r>
+        <w:t>OpenAI'a</w:t>
+      </w:r>
+      <w:proofErr w:type="spellEnd"/>
+      <w:r>
+        <w:t xml:space="preserve"> geçmek istersen sadece OpenAiServiceImpl.java yazıp bırakacaksın. Business katmanın (</w:t>
+      </w:r>
+      <w:proofErr w:type="spellStart"/>
+      <w:r>
+        <w:t>ChatService</w:t>
+      </w:r>
+      <w:proofErr w:type="spellEnd"/>
+      <w:r>
+        <w:t xml:space="preserve">), hangi modelin çalıştığını ruhu bile duymadan </w:t>
+      </w:r>
+      <w:proofErr w:type="spellStart"/>
+      <w:r>
+        <w:t>AiService</w:t>
+      </w:r>
+      <w:proofErr w:type="spellEnd"/>
+      <w:r>
+        <w:t xml:space="preserve"> </w:t>
+      </w:r>
+      <w:proofErr w:type="spellStart"/>
+      <w:r>
+        <w:t>interface'ini</w:t>
+      </w:r>
+      <w:proofErr w:type="spellEnd"/>
+      <w:r>
+        <w:t xml:space="preserve"> çağırarak işine devam edecek.</w:t>
+      </w:r>
+    </w:p>
+    <w:p>
+      <w:r>
+        <w:t>Mimarinin bu şekilde kurgulanması kafana yattı mı Hacı? Eğer her şey netleştiyse, bir sonraki aşamada bu yapay zeka modelini projemize dahil etmek için pom.xml bağımlılıklarını ekleyip yapılandırmayı (</w:t>
+      </w:r>
+      <w:proofErr w:type="spellStart"/>
+      <w:r>
+        <w:t>Configuration</w:t>
+      </w:r>
+      <w:proofErr w:type="spellEnd"/>
+      <w:r>
+        <w:t>) yapmaya başlayalım mı?</w:t>
       </w:r>
     </w:p>
     <w:p/>
     <w:p/>
     <w:p>
       <w:r>
-        <w:t>A</w:t>
-      </w:r>
-      <w:r>
-        <w:t>dmin paneli eklenebilir sonra</w:t>
-      </w:r>
-    </w:p>
-    <w:p>
-      <w:r>
-        <w:t>İleride bu yapının çok daha performanslı çalışması için uygulayabileceğimiz iki harika Clean Code stratejisi var:</w:t>
+        <w:lastRenderedPageBreak/>
+        <w:t>Admin paneli eklenebilir sonra</w:t>
+      </w:r>
+    </w:p>
+    <w:p>
+      <w:r>
+        <w:t xml:space="preserve">İleride bu yapının çok daha performanslı çalışması için uygulayabileceğimiz iki harika </w:t>
+      </w:r>
+      <w:proofErr w:type="spellStart"/>
+      <w:r>
+        <w:t>Clean</w:t>
+      </w:r>
+      <w:proofErr w:type="spellEnd"/>
+      <w:r>
+        <w:t xml:space="preserve"> </w:t>
+      </w:r>
+      <w:proofErr w:type="spellStart"/>
+      <w:r>
+        <w:t>Code</w:t>
+      </w:r>
+      <w:proofErr w:type="spellEnd"/>
+      <w:r>
+        <w:t xml:space="preserve"> stratejisi var:</w:t>
       </w:r>
     </w:p>
     <w:p/>
     <w:p>
       <w:r>
-        <w:lastRenderedPageBreak/>
-        <w:t>Asenkron Yükleme (Thread/Task): Şu anki kodumuzda s3Client.putObject işlemi bitene kadar HTTP isteği bloklanıyor (bekliyor). İleride dosyayı arka planda (@Async kullanarak) yükletip, kullanıcıya anında "Yükleme başlatıldı" yanıtı dönebiliriz.</w:t>
+        <w:t>Asenkron Yükleme (</w:t>
+      </w:r>
+      <w:proofErr w:type="spellStart"/>
+      <w:r>
+        <w:t>Thread</w:t>
+      </w:r>
+      <w:proofErr w:type="spellEnd"/>
+      <w:r>
+        <w:t>/</w:t>
+      </w:r>
+      <w:proofErr w:type="spellStart"/>
+      <w:r>
+        <w:t>Task</w:t>
+      </w:r>
+      <w:proofErr w:type="spellEnd"/>
+      <w:r>
+        <w:t xml:space="preserve">): Şu anki kodumuzda s3Client.putObject işlemi bitene kadar HTTP isteği </w:t>
+      </w:r>
+      <w:proofErr w:type="spellStart"/>
+      <w:r>
+        <w:t>bloklanıyor</w:t>
+      </w:r>
+      <w:proofErr w:type="spellEnd"/>
+      <w:r>
+        <w:t xml:space="preserve"> (bekliyor). İleride dosyayı arka planda (@Async kullanarak) yükletip, kullanıcıya anında "Yükleme başlatıldı" yanıtı dönebiliriz.</w:t>
       </w:r>
     </w:p>
     <w:p/>
     <w:p>
-      <w:pPr>
-        <w:rPr>
-          <w:b/>
-          <w:bCs/>
-        </w:rPr>
-      </w:pPr>
-      <w:r>
-        <w:t>Doğrudan Buluttan Okuma: Dosya yüklenirken backend'den geçiyor ama dosyayı okurken/görüntülerken Spring Boot hiç yorulmuyor. Flutter direkt olarak veri tabanından gelen public fileUrl adresine istek atıp dosyayı Supabase üzerinden çok hızlı bir şekilde (CDN avantajıyla) indiriyor.</w:t>
-      </w:r>
-      <w:r>
-        <w:br w:type="page"/>
-      </w:r>
-      <w:r>
-        <w:rPr>
-          <w:b/>
-          <w:bCs/>
-        </w:rPr>
-        <w:lastRenderedPageBreak/>
-        <w:t xml:space="preserve">Flutter (Frontend) ve AI Chatbot için Mimari İpuçları </w:t>
+      <w:r>
+        <w:t xml:space="preserve">Doğrudan Buluttan Okuma: Dosya yüklenirken </w:t>
+      </w:r>
+      <w:proofErr w:type="spellStart"/>
+      <w:r>
+        <w:t>backend'den</w:t>
+      </w:r>
+      <w:proofErr w:type="spellEnd"/>
+      <w:r>
+        <w:t xml:space="preserve"> geçiyor ama dosyayı okurken/görüntülerken Spring </w:t>
+      </w:r>
+      <w:proofErr w:type="spellStart"/>
+      <w:r>
+        <w:t>Boot</w:t>
+      </w:r>
+      <w:proofErr w:type="spellEnd"/>
+      <w:r>
+        <w:t xml:space="preserve"> hiç yorulmuyor. </w:t>
+      </w:r>
+      <w:proofErr w:type="spellStart"/>
+      <w:r>
+        <w:t>Flutter</w:t>
+      </w:r>
+      <w:proofErr w:type="spellEnd"/>
+      <w:r>
+        <w:t xml:space="preserve"> direkt olarak veri tabanından gelen </w:t>
+      </w:r>
+      <w:proofErr w:type="spellStart"/>
+      <w:r>
+        <w:t>public</w:t>
+      </w:r>
+      <w:proofErr w:type="spellEnd"/>
+      <w:r>
+        <w:t xml:space="preserve"> </w:t>
+      </w:r>
+      <w:proofErr w:type="spellStart"/>
+      <w:r>
+        <w:t>fileUrl</w:t>
+      </w:r>
+      <w:proofErr w:type="spellEnd"/>
+      <w:r>
+        <w:t xml:space="preserve"> adresine istek atıp dosyayı </w:t>
+      </w:r>
+      <w:proofErr w:type="spellStart"/>
+      <w:r>
+        <w:t>Supabase</w:t>
+      </w:r>
+      <w:proofErr w:type="spellEnd"/>
+      <w:r>
+        <w:t xml:space="preserve"> üzerinden çok hızlı bir şekilde (CDN avantajıyla) indiriyor.</w:t>
+      </w:r>
+    </w:p>
+    <w:p/>
+    <w:p/>
+    <w:p>
+      <w:pPr>
+        <w:rPr>
+          <w:b/>
+          <w:bCs/>
+        </w:rPr>
+      </w:pPr>
+      <w:r>
+        <w:rPr>
+          <w:b/>
+          <w:bCs/>
+        </w:rPr>
+        <w:t xml:space="preserve"> </w:t>
+      </w:r>
+      <w:proofErr w:type="spellStart"/>
+      <w:r>
+        <w:rPr>
+          <w:b/>
+          <w:bCs/>
+        </w:rPr>
+        <w:t>Flutter</w:t>
+      </w:r>
+      <w:proofErr w:type="spellEnd"/>
+      <w:r>
+        <w:rPr>
+          <w:b/>
+          <w:bCs/>
+        </w:rPr>
+        <w:t xml:space="preserve"> (</w:t>
+      </w:r>
+      <w:proofErr w:type="spellStart"/>
+      <w:r>
+        <w:rPr>
+          <w:b/>
+          <w:bCs/>
+        </w:rPr>
+        <w:t>Frontend</w:t>
+      </w:r>
+      <w:proofErr w:type="spellEnd"/>
+      <w:r>
+        <w:rPr>
+          <w:b/>
+          <w:bCs/>
+        </w:rPr>
+        <w:t xml:space="preserve">) ve AI </w:t>
+      </w:r>
+      <w:proofErr w:type="spellStart"/>
+      <w:r>
+        <w:rPr>
+          <w:b/>
+          <w:bCs/>
+        </w:rPr>
+        <w:t>Chatbot</w:t>
+      </w:r>
+      <w:proofErr w:type="spellEnd"/>
+      <w:r>
+        <w:rPr>
+          <w:b/>
+          <w:bCs/>
+        </w:rPr>
+        <w:t xml:space="preserve"> için Mimari İpuçları </w:t>
       </w:r>
       <w:r>
         <w:rPr>
@@ -459,15 +2104,80 @@
           <w:numId w:val="14"/>
         </w:numPr>
       </w:pPr>
-      <w:r>
-        <w:rPr>
-          <w:b/>
-          <w:bCs/>
-        </w:rPr>
-        <w:t>Flutter Entegrasyonu:</w:t>
-      </w:r>
-      <w:r>
-        <w:t xml:space="preserve"> Flutter tarafında dio paketini kullanarak bir FormData nesnesi oluşturmalı ve dosyayı MultipartFile.fromFile ile sarmalayıp göndermelisin. Gelen fileUrl bilgisini Flutter direkt olarak NetworkImage veya uygun dosya görüntüleyiciler ile ekrana basabilir.</w:t>
+      <w:proofErr w:type="spellStart"/>
+      <w:r>
+        <w:rPr>
+          <w:b/>
+          <w:bCs/>
+        </w:rPr>
+        <w:t>Flutter</w:t>
+      </w:r>
+      <w:proofErr w:type="spellEnd"/>
+      <w:r>
+        <w:rPr>
+          <w:b/>
+          <w:bCs/>
+        </w:rPr>
+        <w:t xml:space="preserve"> Entegrasyonu:</w:t>
+      </w:r>
+      <w:r>
+        <w:t xml:space="preserve"> </w:t>
+      </w:r>
+      <w:proofErr w:type="spellStart"/>
+      <w:r>
+        <w:t>Flutter</w:t>
+      </w:r>
+      <w:proofErr w:type="spellEnd"/>
+      <w:r>
+        <w:t xml:space="preserve"> tarafında </w:t>
+      </w:r>
+      <w:proofErr w:type="spellStart"/>
+      <w:r>
+        <w:t>dio</w:t>
+      </w:r>
+      <w:proofErr w:type="spellEnd"/>
+      <w:r>
+        <w:t xml:space="preserve"> paketini kullanarak bir </w:t>
+      </w:r>
+      <w:proofErr w:type="spellStart"/>
+      <w:r>
+        <w:t>FormData</w:t>
+      </w:r>
+      <w:proofErr w:type="spellEnd"/>
+      <w:r>
+        <w:t xml:space="preserve"> nesnesi oluşturmalı ve dosyayı </w:t>
+      </w:r>
+      <w:proofErr w:type="spellStart"/>
+      <w:r>
+        <w:t>MultipartFile.fromFile</w:t>
+      </w:r>
+      <w:proofErr w:type="spellEnd"/>
+      <w:r>
+        <w:t xml:space="preserve"> ile sarmalayıp göndermelisin. Gelen </w:t>
+      </w:r>
+      <w:proofErr w:type="spellStart"/>
+      <w:r>
+        <w:t>fileUrl</w:t>
+      </w:r>
+      <w:proofErr w:type="spellEnd"/>
+      <w:r>
+        <w:t xml:space="preserve"> bilgisini </w:t>
+      </w:r>
+      <w:proofErr w:type="spellStart"/>
+      <w:r>
+        <w:t>Flutter</w:t>
+      </w:r>
+      <w:proofErr w:type="spellEnd"/>
+      <w:r>
+        <w:t xml:space="preserve"> direkt olarak </w:t>
+      </w:r>
+      <w:proofErr w:type="spellStart"/>
+      <w:r>
+        <w:t>NetworkImage</w:t>
+      </w:r>
+      <w:proofErr w:type="spellEnd"/>
+      <w:r>
+        <w:t xml:space="preserve"> veya uygun dosya görüntüleyiciler ile ekrana basabilir.</w:t>
       </w:r>
     </w:p>
     <w:p>
@@ -482,37 +2192,225 @@
           <w:b/>
           <w:bCs/>
         </w:rPr>
-        <w:t>AI Chatbot (Spring AI Hazırlığı):</w:t>
-      </w:r>
-      <w:r>
-        <w:t xml:space="preserve"> İleride entegre edeceğimiz yapay zeka ajanına bir notu (Page) analiz etmesini söylediğimizde, yapay zeka page.getAttachments() listesine bakacak. Eğer orada bir resim (image/png) veya doküman (application/pdf) varsa, Spring AI'ın multimodal desteği sayesinde bu URL'i doğrudan LLM'e girdi (context) olarak besleyebileceğiz. Veritabanımız hiçbir zaman devasa ikili (binary) dosyalarla yorulmayacak.</w:t>
+        <w:t xml:space="preserve">AI </w:t>
+      </w:r>
+      <w:proofErr w:type="spellStart"/>
+      <w:r>
+        <w:rPr>
+          <w:b/>
+          <w:bCs/>
+        </w:rPr>
+        <w:t>Chatbot</w:t>
+      </w:r>
+      <w:proofErr w:type="spellEnd"/>
+      <w:r>
+        <w:rPr>
+          <w:b/>
+          <w:bCs/>
+        </w:rPr>
+        <w:t xml:space="preserve"> (Spring AI Hazırlığı):</w:t>
+      </w:r>
+      <w:r>
+        <w:t xml:space="preserve"> İleride entegre edeceğimiz yapay zeka ajanına bir notu (</w:t>
+      </w:r>
+      <w:proofErr w:type="spellStart"/>
+      <w:r>
+        <w:t>Page</w:t>
+      </w:r>
+      <w:proofErr w:type="spellEnd"/>
+      <w:r>
+        <w:t xml:space="preserve">) analiz etmesini söylediğimizde, yapay zeka </w:t>
+      </w:r>
+      <w:proofErr w:type="spellStart"/>
+      <w:r>
+        <w:t>page.getAttachments</w:t>
+      </w:r>
+      <w:proofErr w:type="spellEnd"/>
+      <w:r>
+        <w:t>() listesine bakacak. Eğer orada bir resim (</w:t>
+      </w:r>
+      <w:proofErr w:type="spellStart"/>
+      <w:r>
+        <w:t>image</w:t>
+      </w:r>
+      <w:proofErr w:type="spellEnd"/>
+      <w:r>
+        <w:t>/</w:t>
+      </w:r>
+      <w:proofErr w:type="spellStart"/>
+      <w:r>
+        <w:t>png</w:t>
+      </w:r>
+      <w:proofErr w:type="spellEnd"/>
+      <w:r>
+        <w:t>) veya doküman (</w:t>
+      </w:r>
+      <w:proofErr w:type="spellStart"/>
+      <w:r>
+        <w:t>application</w:t>
+      </w:r>
+      <w:proofErr w:type="spellEnd"/>
+      <w:r>
+        <w:t xml:space="preserve">/pdf) varsa, Spring </w:t>
+      </w:r>
+      <w:proofErr w:type="spellStart"/>
+      <w:r>
+        <w:t>AI'ın</w:t>
+      </w:r>
+      <w:proofErr w:type="spellEnd"/>
+      <w:r>
+        <w:t xml:space="preserve"> multimodal desteği sayesinde bu URL'i doğrudan </w:t>
+      </w:r>
+      <w:proofErr w:type="spellStart"/>
+      <w:r>
+        <w:t>LLM'e</w:t>
+      </w:r>
+      <w:proofErr w:type="spellEnd"/>
+      <w:r>
+        <w:t xml:space="preserve"> girdi (</w:t>
+      </w:r>
+      <w:proofErr w:type="spellStart"/>
+      <w:r>
+        <w:t>context</w:t>
+      </w:r>
+      <w:proofErr w:type="spellEnd"/>
+      <w:r>
+        <w:t xml:space="preserve">) olarak besleyebileceğiz. </w:t>
+      </w:r>
+      <w:proofErr w:type="spellStart"/>
+      <w:r>
+        <w:t>Veritabanımız</w:t>
+      </w:r>
+      <w:proofErr w:type="spellEnd"/>
+      <w:r>
+        <w:t xml:space="preserve"> hiçbir zaman devasa ikili (</w:t>
+      </w:r>
+      <w:proofErr w:type="spellStart"/>
+      <w:r>
+        <w:t>binary</w:t>
+      </w:r>
+      <w:proofErr w:type="spellEnd"/>
+      <w:r>
+        <w:t>) dosyalarla yorulmayacak.</w:t>
       </w:r>
     </w:p>
     <w:p/>
     <w:p>
       <w:r>
-        <w:t>19.04.2026 – group service/controller yapısı kurulduktan sonra page işlemlerini düzenle/göz at(request response yapısı),bir notun gruplu veya grupsuz olacağı durumlarında ayrı fonksiyonmu kullanılacak karar ver.</w:t>
-      </w:r>
-    </w:p>
-    <w:p>
-      <w:r>
-        <w:t>Mevcut controllerlar çalışıyor.</w:t>
+        <w:t xml:space="preserve">19.04.2026 – </w:t>
+      </w:r>
+      <w:proofErr w:type="spellStart"/>
+      <w:r>
+        <w:t>group</w:t>
+      </w:r>
+      <w:proofErr w:type="spellEnd"/>
+      <w:r>
+        <w:t xml:space="preserve"> service/</w:t>
+      </w:r>
+      <w:proofErr w:type="spellStart"/>
+      <w:r>
+        <w:t>controller</w:t>
+      </w:r>
+      <w:proofErr w:type="spellEnd"/>
+      <w:r>
+        <w:t xml:space="preserve"> yapısı kurulduktan sonra </w:t>
+      </w:r>
+      <w:proofErr w:type="spellStart"/>
+      <w:r>
+        <w:t>page</w:t>
+      </w:r>
+      <w:proofErr w:type="spellEnd"/>
+      <w:r>
+        <w:t xml:space="preserve"> işlemlerini düzenle/göz at(</w:t>
+      </w:r>
+      <w:proofErr w:type="spellStart"/>
+      <w:r>
+        <w:t>request</w:t>
+      </w:r>
+      <w:proofErr w:type="spellEnd"/>
+      <w:r>
+        <w:t xml:space="preserve"> </w:t>
+      </w:r>
+      <w:proofErr w:type="spellStart"/>
+      <w:r>
+        <w:t>response</w:t>
+      </w:r>
+      <w:proofErr w:type="spellEnd"/>
+      <w:r>
+        <w:t xml:space="preserve"> yapısı),bir notun gruplu veya grupsuz olacağı durumlarında ayrı </w:t>
+      </w:r>
+      <w:proofErr w:type="spellStart"/>
+      <w:r>
+        <w:t>fonksiyonmu</w:t>
+      </w:r>
+      <w:proofErr w:type="spellEnd"/>
+      <w:r>
+        <w:t xml:space="preserve"> kullanılacak karar ver.</w:t>
+      </w:r>
+    </w:p>
+    <w:p>
+      <w:r>
+        <w:t xml:space="preserve">Mevcut </w:t>
+      </w:r>
+      <w:proofErr w:type="spellStart"/>
+      <w:r>
+        <w:t>controllerlar</w:t>
+      </w:r>
+      <w:proofErr w:type="spellEnd"/>
+      <w:r>
+        <w:t xml:space="preserve"> çalışıyor.</w:t>
       </w:r>
     </w:p>
     <w:p/>
     <w:p/>
     <w:p>
+      <w:proofErr w:type="spellStart"/>
       <w:r>
         <w:rPr>
           <w:highlight w:val="yellow"/>
         </w:rPr>
-        <w:t>GlobalexceptionHandler a genel ayar çek,</w:t>
-      </w:r>
+        <w:t>GlobalexceptionHandler</w:t>
+      </w:r>
+      <w:proofErr w:type="spellEnd"/>
       <w:r>
         <w:rPr>
           <w:highlight w:val="yellow"/>
         </w:rPr>
-        <w:t xml:space="preserve"> UPDATE endpoint lerini tekrar yaz</w:t>
+        <w:t xml:space="preserve"> a genel ayar çek,</w:t>
+      </w:r>
+      <w:r>
+        <w:rPr>
+          <w:highlight w:val="yellow"/>
+        </w:rPr>
+        <w:t xml:space="preserve"> UPDATE </w:t>
+      </w:r>
+      <w:proofErr w:type="spellStart"/>
+      <w:r>
+        <w:rPr>
+          <w:highlight w:val="yellow"/>
+        </w:rPr>
+        <w:t>endpoint</w:t>
+      </w:r>
+      <w:proofErr w:type="spellEnd"/>
+      <w:r>
+        <w:rPr>
+          <w:highlight w:val="yellow"/>
+        </w:rPr>
+        <w:t xml:space="preserve"> </w:t>
+      </w:r>
+      <w:proofErr w:type="spellStart"/>
+      <w:r>
+        <w:rPr>
+          <w:highlight w:val="yellow"/>
+        </w:rPr>
+        <w:t>lerini</w:t>
+      </w:r>
+      <w:proofErr w:type="spellEnd"/>
+      <w:r>
+        <w:rPr>
+          <w:highlight w:val="yellow"/>
+        </w:rPr>
+        <w:t xml:space="preserve"> tekrar yaz</w:t>
       </w:r>
     </w:p>
     <w:sectPr>
@@ -1278,6 +3176,417 @@
     </w:lvl>
   </w:abstractNum>
   <w:abstractNum w:abstractNumId="6" w15:restartNumberingAfterBreak="0">
+    <w:nsid w:val="2C1E2F89"/>
+    <w:multiLevelType w:val="multilevel"/>
+    <w:tmpl w:val="BBE03618"/>
+    <w:lvl w:ilvl="0">
+      <w:start w:val="1"/>
+      <w:numFmt w:val="bullet"/>
+      <w:lvlText w:val=""/>
+      <w:lvlJc w:val="left"/>
+      <w:pPr>
+        <w:tabs>
+          <w:tab w:val="num" w:pos="720"/>
+        </w:tabs>
+        <w:ind w:left="720" w:hanging="360"/>
+      </w:pPr>
+      <w:rPr>
+        <w:rFonts w:ascii="Symbol" w:hAnsi="Symbol" w:hint="default"/>
+        <w:sz w:val="20"/>
+      </w:rPr>
+    </w:lvl>
+    <w:lvl w:ilvl="1" w:tentative="1">
+      <w:start w:val="1"/>
+      <w:numFmt w:val="bullet"/>
+      <w:lvlText w:val="o"/>
+      <w:lvlJc w:val="left"/>
+      <w:pPr>
+        <w:tabs>
+          <w:tab w:val="num" w:pos="1440"/>
+        </w:tabs>
+        <w:ind w:left="1440" w:hanging="360"/>
+      </w:pPr>
+      <w:rPr>
+        <w:rFonts w:ascii="Courier New" w:hAnsi="Courier New" w:hint="default"/>
+        <w:sz w:val="20"/>
+      </w:rPr>
+    </w:lvl>
+    <w:lvl w:ilvl="2" w:tentative="1">
+      <w:start w:val="1"/>
+      <w:numFmt w:val="bullet"/>
+      <w:lvlText w:val=""/>
+      <w:lvlJc w:val="left"/>
+      <w:pPr>
+        <w:tabs>
+          <w:tab w:val="num" w:pos="2160"/>
+        </w:tabs>
+        <w:ind w:left="2160" w:hanging="360"/>
+      </w:pPr>
+      <w:rPr>
+        <w:rFonts w:ascii="Wingdings" w:hAnsi="Wingdings" w:hint="default"/>
+        <w:sz w:val="20"/>
+      </w:rPr>
+    </w:lvl>
+    <w:lvl w:ilvl="3" w:tentative="1">
+      <w:start w:val="1"/>
+      <w:numFmt w:val="bullet"/>
+      <w:lvlText w:val=""/>
+      <w:lvlJc w:val="left"/>
+      <w:pPr>
+        <w:tabs>
+          <w:tab w:val="num" w:pos="2880"/>
+        </w:tabs>
+        <w:ind w:left="2880" w:hanging="360"/>
+      </w:pPr>
+      <w:rPr>
+        <w:rFonts w:ascii="Wingdings" w:hAnsi="Wingdings" w:hint="default"/>
+        <w:sz w:val="20"/>
+      </w:rPr>
+    </w:lvl>
+    <w:lvl w:ilvl="4" w:tentative="1">
+      <w:start w:val="1"/>
+      <w:numFmt w:val="bullet"/>
+      <w:lvlText w:val=""/>
+      <w:lvlJc w:val="left"/>
+      <w:pPr>
+        <w:tabs>
+          <w:tab w:val="num" w:pos="3600"/>
+        </w:tabs>
+        <w:ind w:left="3600" w:hanging="360"/>
+      </w:pPr>
+      <w:rPr>
+        <w:rFonts w:ascii="Wingdings" w:hAnsi="Wingdings" w:hint="default"/>
+        <w:sz w:val="20"/>
+      </w:rPr>
+    </w:lvl>
+    <w:lvl w:ilvl="5" w:tentative="1">
+      <w:start w:val="1"/>
+      <w:numFmt w:val="bullet"/>
+      <w:lvlText w:val=""/>
+      <w:lvlJc w:val="left"/>
+      <w:pPr>
+        <w:tabs>
+          <w:tab w:val="num" w:pos="4320"/>
+        </w:tabs>
+        <w:ind w:left="4320" w:hanging="360"/>
+      </w:pPr>
+      <w:rPr>
+        <w:rFonts w:ascii="Wingdings" w:hAnsi="Wingdings" w:hint="default"/>
+        <w:sz w:val="20"/>
+      </w:rPr>
+    </w:lvl>
+    <w:lvl w:ilvl="6" w:tentative="1">
+      <w:start w:val="1"/>
+      <w:numFmt w:val="bullet"/>
+      <w:lvlText w:val=""/>
+      <w:lvlJc w:val="left"/>
+      <w:pPr>
+        <w:tabs>
+          <w:tab w:val="num" w:pos="5040"/>
+        </w:tabs>
+        <w:ind w:left="5040" w:hanging="360"/>
+      </w:pPr>
+      <w:rPr>
+        <w:rFonts w:ascii="Wingdings" w:hAnsi="Wingdings" w:hint="default"/>
+        <w:sz w:val="20"/>
+      </w:rPr>
+    </w:lvl>
+    <w:lvl w:ilvl="7" w:tentative="1">
+      <w:start w:val="1"/>
+      <w:numFmt w:val="bullet"/>
+      <w:lvlText w:val=""/>
+      <w:lvlJc w:val="left"/>
+      <w:pPr>
+        <w:tabs>
+          <w:tab w:val="num" w:pos="5760"/>
+        </w:tabs>
+        <w:ind w:left="5760" w:hanging="360"/>
+      </w:pPr>
+      <w:rPr>
+        <w:rFonts w:ascii="Wingdings" w:hAnsi="Wingdings" w:hint="default"/>
+        <w:sz w:val="20"/>
+      </w:rPr>
+    </w:lvl>
+    <w:lvl w:ilvl="8" w:tentative="1">
+      <w:start w:val="1"/>
+      <w:numFmt w:val="bullet"/>
+      <w:lvlText w:val=""/>
+      <w:lvlJc w:val="left"/>
+      <w:pPr>
+        <w:tabs>
+          <w:tab w:val="num" w:pos="6480"/>
+        </w:tabs>
+        <w:ind w:left="6480" w:hanging="360"/>
+      </w:pPr>
+      <w:rPr>
+        <w:rFonts w:ascii="Wingdings" w:hAnsi="Wingdings" w:hint="default"/>
+        <w:sz w:val="20"/>
+      </w:rPr>
+    </w:lvl>
+  </w:abstractNum>
+  <w:abstractNum w:abstractNumId="7" w15:restartNumberingAfterBreak="0">
+    <w:nsid w:val="2D9147AB"/>
+    <w:multiLevelType w:val="multilevel"/>
+    <w:tmpl w:val="6F4A0254"/>
+    <w:lvl w:ilvl="0">
+      <w:start w:val="1"/>
+      <w:numFmt w:val="decimal"/>
+      <w:lvlText w:val="%1."/>
+      <w:lvlJc w:val="left"/>
+      <w:pPr>
+        <w:tabs>
+          <w:tab w:val="num" w:pos="720"/>
+        </w:tabs>
+        <w:ind w:left="720" w:hanging="360"/>
+      </w:pPr>
+    </w:lvl>
+    <w:lvl w:ilvl="1" w:tentative="1">
+      <w:start w:val="1"/>
+      <w:numFmt w:val="decimal"/>
+      <w:lvlText w:val="%2."/>
+      <w:lvlJc w:val="left"/>
+      <w:pPr>
+        <w:tabs>
+          <w:tab w:val="num" w:pos="1440"/>
+        </w:tabs>
+        <w:ind w:left="1440" w:hanging="360"/>
+      </w:pPr>
+    </w:lvl>
+    <w:lvl w:ilvl="2" w:tentative="1">
+      <w:start w:val="1"/>
+      <w:numFmt w:val="decimal"/>
+      <w:lvlText w:val="%3."/>
+      <w:lvlJc w:val="left"/>
+      <w:pPr>
+        <w:tabs>
+          <w:tab w:val="num" w:pos="2160"/>
+        </w:tabs>
+        <w:ind w:left="2160" w:hanging="360"/>
+      </w:pPr>
+    </w:lvl>
+    <w:lvl w:ilvl="3" w:tentative="1">
+      <w:start w:val="1"/>
+      <w:numFmt w:val="decimal"/>
+      <w:lvlText w:val="%4."/>
+      <w:lvlJc w:val="left"/>
+      <w:pPr>
+        <w:tabs>
+          <w:tab w:val="num" w:pos="2880"/>
+        </w:tabs>
+        <w:ind w:left="2880" w:hanging="360"/>
+      </w:pPr>
+    </w:lvl>
+    <w:lvl w:ilvl="4" w:tentative="1">
+      <w:start w:val="1"/>
+      <w:numFmt w:val="decimal"/>
+      <w:lvlText w:val="%5."/>
+      <w:lvlJc w:val="left"/>
+      <w:pPr>
+        <w:tabs>
+          <w:tab w:val="num" w:pos="3600"/>
+        </w:tabs>
+        <w:ind w:left="3600" w:hanging="360"/>
+      </w:pPr>
+    </w:lvl>
+    <w:lvl w:ilvl="5" w:tentative="1">
+      <w:start w:val="1"/>
+      <w:numFmt w:val="decimal"/>
+      <w:lvlText w:val="%6."/>
+      <w:lvlJc w:val="left"/>
+      <w:pPr>
+        <w:tabs>
+          <w:tab w:val="num" w:pos="4320"/>
+        </w:tabs>
+        <w:ind w:left="4320" w:hanging="360"/>
+      </w:pPr>
+    </w:lvl>
+    <w:lvl w:ilvl="6" w:tentative="1">
+      <w:start w:val="1"/>
+      <w:numFmt w:val="decimal"/>
+      <w:lvlText w:val="%7."/>
+      <w:lvlJc w:val="left"/>
+      <w:pPr>
+        <w:tabs>
+          <w:tab w:val="num" w:pos="5040"/>
+        </w:tabs>
+        <w:ind w:left="5040" w:hanging="360"/>
+      </w:pPr>
+    </w:lvl>
+    <w:lvl w:ilvl="7" w:tentative="1">
+      <w:start w:val="1"/>
+      <w:numFmt w:val="decimal"/>
+      <w:lvlText w:val="%8."/>
+      <w:lvlJc w:val="left"/>
+      <w:pPr>
+        <w:tabs>
+          <w:tab w:val="num" w:pos="5760"/>
+        </w:tabs>
+        <w:ind w:left="5760" w:hanging="360"/>
+      </w:pPr>
+    </w:lvl>
+    <w:lvl w:ilvl="8" w:tentative="1">
+      <w:start w:val="1"/>
+      <w:numFmt w:val="decimal"/>
+      <w:lvlText w:val="%9."/>
+      <w:lvlJc w:val="left"/>
+      <w:pPr>
+        <w:tabs>
+          <w:tab w:val="num" w:pos="6480"/>
+        </w:tabs>
+        <w:ind w:left="6480" w:hanging="360"/>
+      </w:pPr>
+    </w:lvl>
+  </w:abstractNum>
+  <w:abstractNum w:abstractNumId="8" w15:restartNumberingAfterBreak="0">
+    <w:nsid w:val="3203540F"/>
+    <w:multiLevelType w:val="multilevel"/>
+    <w:tmpl w:val="FFC028C2"/>
+    <w:lvl w:ilvl="0">
+      <w:start w:val="1"/>
+      <w:numFmt w:val="bullet"/>
+      <w:lvlText w:val=""/>
+      <w:lvlJc w:val="left"/>
+      <w:pPr>
+        <w:tabs>
+          <w:tab w:val="num" w:pos="720"/>
+        </w:tabs>
+        <w:ind w:left="720" w:hanging="360"/>
+      </w:pPr>
+      <w:rPr>
+        <w:rFonts w:ascii="Symbol" w:hAnsi="Symbol" w:hint="default"/>
+        <w:sz w:val="20"/>
+      </w:rPr>
+    </w:lvl>
+    <w:lvl w:ilvl="1" w:tentative="1">
+      <w:start w:val="1"/>
+      <w:numFmt w:val="bullet"/>
+      <w:lvlText w:val="o"/>
+      <w:lvlJc w:val="left"/>
+      <w:pPr>
+        <w:tabs>
+          <w:tab w:val="num" w:pos="1440"/>
+        </w:tabs>
+        <w:ind w:left="1440" w:hanging="360"/>
+      </w:pPr>
+      <w:rPr>
+        <w:rFonts w:ascii="Courier New" w:hAnsi="Courier New" w:hint="default"/>
+        <w:sz w:val="20"/>
+      </w:rPr>
+    </w:lvl>
+    <w:lvl w:ilvl="2" w:tentative="1">
+      <w:start w:val="1"/>
+      <w:numFmt w:val="bullet"/>
+      <w:lvlText w:val=""/>
+      <w:lvlJc w:val="left"/>
+      <w:pPr>
+        <w:tabs>
+          <w:tab w:val="num" w:pos="2160"/>
+        </w:tabs>
+        <w:ind w:left="2160" w:hanging="360"/>
+      </w:pPr>
+      <w:rPr>
+        <w:rFonts w:ascii="Wingdings" w:hAnsi="Wingdings" w:hint="default"/>
+        <w:sz w:val="20"/>
+      </w:rPr>
+    </w:lvl>
+    <w:lvl w:ilvl="3" w:tentative="1">
+      <w:start w:val="1"/>
+      <w:numFmt w:val="bullet"/>
+      <w:lvlText w:val=""/>
+      <w:lvlJc w:val="left"/>
+      <w:pPr>
+        <w:tabs>
+          <w:tab w:val="num" w:pos="2880"/>
+        </w:tabs>
+        <w:ind w:left="2880" w:hanging="360"/>
+      </w:pPr>
+      <w:rPr>
+        <w:rFonts w:ascii="Wingdings" w:hAnsi="Wingdings" w:hint="default"/>
+        <w:sz w:val="20"/>
+      </w:rPr>
+    </w:lvl>
+    <w:lvl w:ilvl="4" w:tentative="1">
+      <w:start w:val="1"/>
+      <w:numFmt w:val="bullet"/>
+      <w:lvlText w:val=""/>
+      <w:lvlJc w:val="left"/>
+      <w:pPr>
+        <w:tabs>
+          <w:tab w:val="num" w:pos="3600"/>
+        </w:tabs>
+        <w:ind w:left="3600" w:hanging="360"/>
+      </w:pPr>
+      <w:rPr>
+        <w:rFonts w:ascii="Wingdings" w:hAnsi="Wingdings" w:hint="default"/>
+        <w:sz w:val="20"/>
+      </w:rPr>
+    </w:lvl>
+    <w:lvl w:ilvl="5" w:tentative="1">
+      <w:start w:val="1"/>
+      <w:numFmt w:val="bullet"/>
+      <w:lvlText w:val=""/>
+      <w:lvlJc w:val="left"/>
+      <w:pPr>
+        <w:tabs>
+          <w:tab w:val="num" w:pos="4320"/>
+        </w:tabs>
+        <w:ind w:left="4320" w:hanging="360"/>
+      </w:pPr>
+      <w:rPr>
+        <w:rFonts w:ascii="Wingdings" w:hAnsi="Wingdings" w:hint="default"/>
+        <w:sz w:val="20"/>
+      </w:rPr>
+    </w:lvl>
+    <w:lvl w:ilvl="6" w:tentative="1">
+      <w:start w:val="1"/>
+      <w:numFmt w:val="bullet"/>
+      <w:lvlText w:val=""/>
+      <w:lvlJc w:val="left"/>
+      <w:pPr>
+        <w:tabs>
+          <w:tab w:val="num" w:pos="5040"/>
+        </w:tabs>
+        <w:ind w:left="5040" w:hanging="360"/>
+      </w:pPr>
+      <w:rPr>
+        <w:rFonts w:ascii="Wingdings" w:hAnsi="Wingdings" w:hint="default"/>
+        <w:sz w:val="20"/>
+      </w:rPr>
+    </w:lvl>
+    <w:lvl w:ilvl="7" w:tentative="1">
+      <w:start w:val="1"/>
+      <w:numFmt w:val="bullet"/>
+      <w:lvlText w:val=""/>
+      <w:lvlJc w:val="left"/>
+      <w:pPr>
+        <w:tabs>
+          <w:tab w:val="num" w:pos="5760"/>
+        </w:tabs>
+        <w:ind w:left="5760" w:hanging="360"/>
+      </w:pPr>
+      <w:rPr>
+        <w:rFonts w:ascii="Wingdings" w:hAnsi="Wingdings" w:hint="default"/>
+        <w:sz w:val="20"/>
+      </w:rPr>
+    </w:lvl>
+    <w:lvl w:ilvl="8" w:tentative="1">
+      <w:start w:val="1"/>
+      <w:numFmt w:val="bullet"/>
+      <w:lvlText w:val=""/>
+      <w:lvlJc w:val="left"/>
+      <w:pPr>
+        <w:tabs>
+          <w:tab w:val="num" w:pos="6480"/>
+        </w:tabs>
+        <w:ind w:left="6480" w:hanging="360"/>
+      </w:pPr>
+      <w:rPr>
+        <w:rFonts w:ascii="Wingdings" w:hAnsi="Wingdings" w:hint="default"/>
+        <w:sz w:val="20"/>
+      </w:rPr>
+    </w:lvl>
+  </w:abstractNum>
+  <w:abstractNum w:abstractNumId="9" w15:restartNumberingAfterBreak="0">
     <w:nsid w:val="34A85605"/>
     <w:multiLevelType w:val="multilevel"/>
     <w:tmpl w:val="A962AB66"/>
@@ -1426,7 +3735,7 @@
       </w:rPr>
     </w:lvl>
   </w:abstractNum>
-  <w:abstractNum w:abstractNumId="7" w15:restartNumberingAfterBreak="0">
+  <w:abstractNum w:abstractNumId="10" w15:restartNumberingAfterBreak="0">
     <w:nsid w:val="3665047C"/>
     <w:multiLevelType w:val="multilevel"/>
     <w:tmpl w:val="90BA9D4A"/>
@@ -1575,7 +3884,7 @@
       </w:rPr>
     </w:lvl>
   </w:abstractNum>
-  <w:abstractNum w:abstractNumId="8" w15:restartNumberingAfterBreak="0">
+  <w:abstractNum w:abstractNumId="11" w15:restartNumberingAfterBreak="0">
     <w:nsid w:val="4953455A"/>
     <w:multiLevelType w:val="multilevel"/>
     <w:tmpl w:val="A028BA5A"/>
@@ -1724,7 +4033,7 @@
       </w:rPr>
     </w:lvl>
   </w:abstractNum>
-  <w:abstractNum w:abstractNumId="9" w15:restartNumberingAfterBreak="0">
+  <w:abstractNum w:abstractNumId="12" w15:restartNumberingAfterBreak="0">
     <w:nsid w:val="4BCF0AF6"/>
     <w:multiLevelType w:val="multilevel"/>
     <w:tmpl w:val="55BA1BE8"/>
@@ -1873,7 +4182,7 @@
       </w:rPr>
     </w:lvl>
   </w:abstractNum>
-  <w:abstractNum w:abstractNumId="10" w15:restartNumberingAfterBreak="0">
+  <w:abstractNum w:abstractNumId="13" w15:restartNumberingAfterBreak="0">
     <w:nsid w:val="4C5062F5"/>
     <w:multiLevelType w:val="multilevel"/>
     <w:tmpl w:val="2BF2332E"/>
@@ -2022,7 +4331,7 @@
       </w:rPr>
     </w:lvl>
   </w:abstractNum>
-  <w:abstractNum w:abstractNumId="11" w15:restartNumberingAfterBreak="0">
+  <w:abstractNum w:abstractNumId="14" w15:restartNumberingAfterBreak="0">
     <w:nsid w:val="4DDB0AE1"/>
     <w:multiLevelType w:val="multilevel"/>
     <w:tmpl w:val="09EE454E"/>
@@ -2135,7 +4444,7 @@
       </w:pPr>
     </w:lvl>
   </w:abstractNum>
-  <w:abstractNum w:abstractNumId="12" w15:restartNumberingAfterBreak="0">
+  <w:abstractNum w:abstractNumId="15" w15:restartNumberingAfterBreak="0">
     <w:nsid w:val="587B41DF"/>
     <w:multiLevelType w:val="multilevel"/>
     <w:tmpl w:val="8F7AA8B4"/>
@@ -2284,7 +4593,7 @@
       </w:rPr>
     </w:lvl>
   </w:abstractNum>
-  <w:abstractNum w:abstractNumId="13" w15:restartNumberingAfterBreak="0">
+  <w:abstractNum w:abstractNumId="16" w15:restartNumberingAfterBreak="0">
     <w:nsid w:val="5E925E9C"/>
     <w:multiLevelType w:val="multilevel"/>
     <w:tmpl w:val="8CF8AE60"/>
@@ -2398,13 +4707,13 @@
     </w:lvl>
   </w:abstractNum>
   <w:num w:numId="1" w16cid:durableId="1835801531">
-    <w:abstractNumId w:val="10"/>
+    <w:abstractNumId w:val="13"/>
   </w:num>
   <w:num w:numId="2" w16cid:durableId="2035492050">
     <w:abstractNumId w:val="2"/>
   </w:num>
   <w:num w:numId="3" w16cid:durableId="1108507690">
-    <w:abstractNumId w:val="12"/>
+    <w:abstractNumId w:val="15"/>
   </w:num>
   <w:num w:numId="4" w16cid:durableId="1685788943">
     <w:abstractNumId w:val="5"/>
@@ -2416,16 +4725,16 @@
     <w:abstractNumId w:val="3"/>
   </w:num>
   <w:num w:numId="7" w16cid:durableId="1985305432">
+    <w:abstractNumId w:val="12"/>
+  </w:num>
+  <w:num w:numId="8" w16cid:durableId="1077630569">
+    <w:abstractNumId w:val="11"/>
+  </w:num>
+  <w:num w:numId="9" w16cid:durableId="189149148">
     <w:abstractNumId w:val="9"/>
   </w:num>
-  <w:num w:numId="8" w16cid:durableId="1077630569">
-    <w:abstractNumId w:val="8"/>
-  </w:num>
-  <w:num w:numId="9" w16cid:durableId="189149148">
-    <w:abstractNumId w:val="6"/>
-  </w:num>
   <w:num w:numId="10" w16cid:durableId="1507162356">
-    <w:abstractNumId w:val="7"/>
+    <w:abstractNumId w:val="10"/>
   </w:num>
   <w:num w:numId="11" w16cid:durableId="22902635">
     <w:abstractNumId w:val="1"/>
@@ -2434,10 +4743,19 @@
     <w:abstractNumId w:val="4"/>
   </w:num>
   <w:num w:numId="13" w16cid:durableId="203098334">
-    <w:abstractNumId w:val="11"/>
+    <w:abstractNumId w:val="14"/>
   </w:num>
   <w:num w:numId="14" w16cid:durableId="362554874">
-    <w:abstractNumId w:val="13"/>
+    <w:abstractNumId w:val="16"/>
+  </w:num>
+  <w:num w:numId="15" w16cid:durableId="1569270006">
+    <w:abstractNumId w:val="6"/>
+  </w:num>
+  <w:num w:numId="16" w16cid:durableId="314336974">
+    <w:abstractNumId w:val="8"/>
+  </w:num>
+  <w:num w:numId="17" w16cid:durableId="1238586961">
+    <w:abstractNumId w:val="7"/>
   </w:num>
 </w:numbering>
 </file>
@@ -3359,6 +5677,20 @@
       <w:spacing w:val="5"/>
     </w:rPr>
   </w:style>
+  <w:style w:type="character" w:styleId="KitapBal">
+    <w:name w:val="Book Title"/>
+    <w:basedOn w:val="VarsaylanParagrafYazTipi"/>
+    <w:uiPriority w:val="33"/>
+    <w:qFormat/>
+    <w:rsid w:val="0072415A"/>
+    <w:rPr>
+      <w:b/>
+      <w:bCs/>
+      <w:i/>
+      <w:iCs/>
+      <w:spacing w:val="5"/>
+    </w:rPr>
+  </w:style>
 </w:styles>
 </file>
 

</xml_diff>